<commit_message>
Working app commit SAT0802
</commit_message>
<xml_diff>
--- a/Print Car Report.docx
+++ b/Print Car Report.docx
@@ -1,20 +1,14 @@
 
 <file path=word/document.xml><?xml version="1.0" encoding="utf-8"?>
-<w:document xmlns:wpc="http://schemas.microsoft.com/office/word/2010/wordprocessingCanvas" xmlns:cx="http://schemas.microsoft.com/office/drawing/2014/chartex" xmlns:cx1="http://schemas.microsoft.com/office/drawing/2015/9/8/chartex" xmlns:cx2="http://schemas.microsoft.com/office/drawing/2015/10/21/chartex" xmlns:cx3="http://schemas.microsoft.com/office/drawing/2016/5/9/chartex" xmlns:cx4="http://schemas.microsoft.com/office/drawing/2016/5/10/chartex" xmlns:cx5="http://schemas.microsoft.com/office/drawing/2016/5/11/chartex" xmlns:cx6="http://schemas.microsoft.com/office/drawing/2016/5/12/chartex" xmlns:cx7="http://schemas.microsoft.com/office/drawing/2016/5/13/chartex" xmlns:cx8="http://schemas.microsoft.com/office/drawing/2016/5/14/chartex" xmlns:mc="http://schemas.openxmlformats.org/markup-compatibility/2006" xmlns:aink="http://schemas.microsoft.com/office/drawing/2016/ink" xmlns:am3d="http://schemas.microsoft.com/office/drawing/2017/model3d" xmlns:o="urn:schemas-microsoft-com:office:office" xmlns:oel="http://schemas.microsoft.com/office/2019/extlst" xmlns:r="http://schemas.openxmlformats.org/officeDocument/2006/relationships" xmlns:m="http://schemas.openxmlformats.org/officeDocument/2006/math" xmlns:v="urn:schemas-microsoft-com:vml" xmlns:wp14="http://schemas.microsoft.com/office/word/2010/wordprocessingDrawing" xmlns:wp="http://schemas.openxmlformats.org/drawingml/2006/wordprocessingDrawing" xmlns:w10="urn:schemas-microsoft-com:office:word" xmlns:w="http://schemas.openxmlformats.org/wordprocessingml/2006/main" xmlns:w14="http://schemas.microsoft.com/office/word/2010/wordml" xmlns:w15="http://schemas.microsoft.com/office/word/2012/wordml" xmlns:w16cex="http://schemas.microsoft.com/office/word/2018/wordml/cex" xmlns:w16cid="http://schemas.microsoft.com/office/word/2016/wordml/cid" xmlns:w16="http://schemas.microsoft.com/office/word/2018/wordml" xmlns:w16du="http://schemas.microsoft.com/office/word/2023/wordml/word16du" xmlns:w16sdtdh="http://schemas.microsoft.com/office/word/2020/wordml/sdtdatahash" xmlns:w16se="http://schemas.microsoft.com/office/word/2015/wordml/symex" xmlns:wpg="http://schemas.microsoft.com/office/word/2010/wordprocessingGroup" xmlns:wpi="http://schemas.microsoft.com/office/word/2010/wordprocessingInk" xmlns:wne="http://schemas.microsoft.com/office/word/2006/wordml" xmlns:wps="http://schemas.microsoft.com/office/word/2010/wordprocessingShape" mc:Ignorable="w14 w15 w16se w16cid w16 w16cex w16sdtdh w16du wp14">
+<w:document xmlns:a="http://schemas.openxmlformats.org/drawingml/2006/main" xmlns:pic="http://schemas.openxmlformats.org/drawingml/2006/picture" xmlns:a14="http://schemas.microsoft.com/office/drawing/2010/main" xmlns:wpc="http://schemas.microsoft.com/office/word/2010/wordprocessingCanvas" xmlns:cx="http://schemas.microsoft.com/office/drawing/2014/chartex" xmlns:cx1="http://schemas.microsoft.com/office/drawing/2015/9/8/chartex" xmlns:cx2="http://schemas.microsoft.com/office/drawing/2015/10/21/chartex" xmlns:cx3="http://schemas.microsoft.com/office/drawing/2016/5/9/chartex" xmlns:cx4="http://schemas.microsoft.com/office/drawing/2016/5/10/chartex" xmlns:cx5="http://schemas.microsoft.com/office/drawing/2016/5/11/chartex" xmlns:cx6="http://schemas.microsoft.com/office/drawing/2016/5/12/chartex" xmlns:cx7="http://schemas.microsoft.com/office/drawing/2016/5/13/chartex" xmlns:cx8="http://schemas.microsoft.com/office/drawing/2016/5/14/chartex" xmlns:mc="http://schemas.openxmlformats.org/markup-compatibility/2006" xmlns:aink="http://schemas.microsoft.com/office/drawing/2016/ink" xmlns:am3d="http://schemas.microsoft.com/office/drawing/2017/model3d" xmlns:o="urn:schemas-microsoft-com:office:office" xmlns:oel="http://schemas.microsoft.com/office/2019/extlst" xmlns:r="http://schemas.openxmlformats.org/officeDocument/2006/relationships" xmlns:m="http://schemas.openxmlformats.org/officeDocument/2006/math" xmlns:v="urn:schemas-microsoft-com:vml" xmlns:wp14="http://schemas.microsoft.com/office/word/2010/wordprocessingDrawing" xmlns:wp="http://schemas.openxmlformats.org/drawingml/2006/wordprocessingDrawing" xmlns:w10="urn:schemas-microsoft-com:office:word" xmlns:w="http://schemas.openxmlformats.org/wordprocessingml/2006/main" xmlns:w14="http://schemas.microsoft.com/office/word/2010/wordml" xmlns:w15="http://schemas.microsoft.com/office/word/2012/wordml" xmlns:w16cex="http://schemas.microsoft.com/office/word/2018/wordml/cex" xmlns:w16cid="http://schemas.microsoft.com/office/word/2016/wordml/cid" xmlns:w16="http://schemas.microsoft.com/office/word/2018/wordml" xmlns:w16du="http://schemas.microsoft.com/office/word/2023/wordml/word16du" xmlns:w16sdtdh="http://schemas.microsoft.com/office/word/2020/wordml/sdtdatahash" xmlns:w16sdtfl="http://schemas.microsoft.com/office/word/2024/wordml/sdtformatlock" xmlns:w16se="http://schemas.microsoft.com/office/word/2015/wordml/symex" xmlns:wpg="http://schemas.microsoft.com/office/word/2010/wordprocessingGroup" xmlns:wpi="http://schemas.microsoft.com/office/word/2010/wordprocessingInk" xmlns:wne="http://schemas.microsoft.com/office/word/2006/wordml" xmlns:wps="http://schemas.microsoft.com/office/word/2010/wordprocessingShape" mc:Ignorable="w14 w15 w16se w16cid w16 w16cex w16sdtdh w16sdtfl w16du wp14">
   <w:body>
     <w:p>
       <w:pPr>
-        <w:ind w:left="2160" w:firstLine="720"/>
+        <w:ind w:left="8640"/>
         <w:rPr>
           <w:noProof/>
         </w:rPr>
       </w:pPr>
-      <w:r>
-        <w:rPr>
-          <w:noProof/>
-        </w:rPr>
-        <w:t xml:space="preserve">  </w:t>
-      </w:r>
       <w:r>
         <w:rPr>
           <w:noProof/>
@@ -25,76 +19,11 @@
         <w:rPr>
           <w:noProof/>
         </w:rPr>
-        <w:t xml:space="preserve">CAR RENTAL &amp; PRIVATE TRANSPORTATION         </w:t>
-      </w:r>
-    </w:p>
-    <w:p>
-      <w:pPr>
-        <w:ind w:left="2160" w:firstLine="720"/>
-        <w:rPr>
-          <w:noProof/>
-        </w:rPr>
-      </w:pPr>
-      <w:r>
-        <w:rPr>
-          <w:noProof/>
-        </w:rPr>
-        <w:t>130,MANCHESTER ROAD,WILMSLOW SK9 2LE</w:t>
-      </w:r>
-    </w:p>
-    <w:p>
-      <w:pPr>
-        <w:rPr>
-          <w:noProof/>
-        </w:rPr>
-      </w:pPr>
-      <w:r>
-        <w:rPr>
-          <w:noProof/>
-        </w:rPr>
-        <w:tab/>
-      </w:r>
-      <w:r>
-        <w:rPr>
-          <w:noProof/>
-        </w:rPr>
-        <w:tab/>
-      </w:r>
-      <w:r>
-        <w:rPr>
-          <w:noProof/>
-        </w:rPr>
-        <w:tab/>
-      </w:r>
-      <w:r>
-        <w:rPr>
-          <w:noProof/>
-        </w:rPr>
-        <w:tab/>
-      </w:r>
-      <w:r>
-        <w:rPr>
-          <w:noProof/>
-        </w:rPr>
-        <w:tab/>
-      </w:r>
-      <w:r>
-        <w:rPr>
-          <w:noProof/>
-        </w:rPr>
-        <w:tab/>
-      </w:r>
-      <w:r>
-        <w:rPr>
-          <w:noProof/>
-          <w:sz w:val="20"/>
-          <w:szCs w:val="20"/>
-        </w:rPr>
         <w:drawing>
-          <wp:inline distT="0" distB="0" distL="0" distR="0" wp14:anchorId="347FF864" wp14:editId="2C68E75A">
-            <wp:extent cx="933450" cy="457200"/>
-            <wp:effectExtent l="57150" t="57150" r="38100" b="38100"/>
-            <wp:docPr id="759952768" name="Picture 1" descr="A close up of a car headlight&#10;&#10;Description automatically generated"/>
+          <wp:inline distT="0" distB="0" distL="0" distR="0" wp14:anchorId="08B220B0" wp14:editId="471B9269">
+            <wp:extent cx="1490867" cy="628650"/>
+            <wp:effectExtent l="19050" t="0" r="14605" b="419100"/>
+            <wp:docPr id="1663569728" name="Picture 1"/>
             <wp:cNvGraphicFramePr>
               <a:graphicFrameLocks xmlns:a="http://schemas.openxmlformats.org/drawingml/2006/main" noChangeAspect="1"/>
             </wp:cNvGraphicFramePr>
@@ -102,7 +31,7 @@
               <a:graphicData uri="http://schemas.openxmlformats.org/drawingml/2006/picture">
                 <pic:pic xmlns:pic="http://schemas.openxmlformats.org/drawingml/2006/picture">
                   <pic:nvPicPr>
-                    <pic:cNvPr id="759952768" name="Picture 1" descr="A close up of a car headlight&#10;&#10;Description automatically generated"/>
+                    <pic:cNvPr id="1663569728" name=""/>
                     <pic:cNvPicPr/>
                   </pic:nvPicPr>
                   <pic:blipFill>
@@ -112,7 +41,10 @@
                           <a14:imgProps xmlns:a14="http://schemas.microsoft.com/office/drawing/2010/main">
                             <a14:imgLayer r:embed="rId6">
                               <a14:imgEffect>
-                                <a14:artisticGlowEdges trans="12000" smoothness="2"/>
+                                <a14:artisticGlowDiffused/>
+                              </a14:imgEffect>
+                              <a14:imgEffect>
+                                <a14:saturation sat="400000"/>
                               </a14:imgEffect>
                             </a14:imgLayer>
                           </a14:imgProps>
@@ -126,59 +58,20 @@
                   <pic:spPr>
                     <a:xfrm>
                       <a:off x="0" y="0"/>
-                      <a:ext cx="933830" cy="457386"/>
+                      <a:ext cx="1502825" cy="633692"/>
                     </a:xfrm>
                     <a:prstGeom prst="rect">
                       <a:avLst/>
                     </a:prstGeom>
-                    <a:gradFill>
-                      <a:gsLst>
-                        <a:gs pos="0">
-                          <a:schemeClr val="accent1">
-                            <a:lumMod val="5000"/>
-                            <a:lumOff val="95000"/>
-                          </a:schemeClr>
-                        </a:gs>
-                        <a:gs pos="74000">
-                          <a:schemeClr val="accent1">
-                            <a:lumMod val="45000"/>
-                            <a:lumOff val="55000"/>
-                          </a:schemeClr>
-                        </a:gs>
-                        <a:gs pos="83000">
-                          <a:schemeClr val="accent1">
-                            <a:lumMod val="45000"/>
-                            <a:lumOff val="55000"/>
-                          </a:schemeClr>
-                        </a:gs>
-                        <a:gs pos="100000">
-                          <a:schemeClr val="accent1">
-                            <a:lumMod val="30000"/>
-                            <a:lumOff val="70000"/>
-                          </a:schemeClr>
-                        </a:gs>
-                      </a:gsLst>
-                      <a:lin ang="5400000" scaled="1"/>
-                    </a:gradFill>
+                    <a:solidFill>
+                      <a:schemeClr val="accent2">
+                        <a:lumMod val="50000"/>
+                      </a:schemeClr>
+                    </a:solidFill>
                     <a:effectLst>
-                      <a:glow>
-                        <a:schemeClr val="accent1">
-                          <a:alpha val="85000"/>
-                        </a:schemeClr>
-                      </a:glow>
-                      <a:innerShdw blurRad="292100" dist="50800" dir="13500000">
-                        <a:prstClr val="black">
-                          <a:alpha val="80000"/>
-                        </a:prstClr>
-                      </a:innerShdw>
+                      <a:reflection blurRad="6350" stA="50000" endA="300" endPos="55500" dist="50800" dir="5400000" sy="-100000" algn="bl" rotWithShape="0"/>
+                      <a:softEdge rad="63500"/>
                     </a:effectLst>
-                    <a:scene3d>
-                      <a:camera prst="orthographicFront"/>
-                      <a:lightRig rig="threePt" dir="t"/>
-                    </a:scene3d>
-                    <a:sp3d>
-                      <a:bevelT/>
-                    </a:sp3d>
                   </pic:spPr>
                 </pic:pic>
               </a:graphicData>
@@ -189,6 +82,71 @@
     </w:p>
     <w:p>
       <w:pPr>
+        <w:ind w:left="2160" w:firstLine="720"/>
+        <w:rPr>
+          <w:noProof/>
+        </w:rPr>
+      </w:pPr>
+      <w:r>
+        <w:rPr>
+          <w:noProof/>
+        </w:rPr>
+        <w:t xml:space="preserve">  </w:t>
+      </w:r>
+      <w:r>
+        <w:rPr>
+          <w:noProof/>
+        </w:rPr>
+        <w:t xml:space="preserve"> </w:t>
+      </w:r>
+      <w:r>
+        <w:rPr>
+          <w:noProof/>
+        </w:rPr>
+        <w:t xml:space="preserve">CAR RENTAL &amp; PRIVATE TRANSPORTATION         </w:t>
+      </w:r>
+    </w:p>
+    <w:p>
+      <w:pPr>
+        <w:ind w:left="2160" w:firstLine="720"/>
+        <w:rPr>
+          <w:noProof/>
+          <w14:reflection w14:blurRad="6350" w14:stA="60000" w14:stPos="0" w14:endA="900" w14:endPos="60000" w14:dist="60007" w14:dir="5400000" w14:fadeDir="5400000" w14:sx="100000" w14:sy="-100000" w14:kx="0" w14:ky="0" w14:algn="bl"/>
+        </w:rPr>
+      </w:pPr>
+      <w:r>
+        <w:rPr>
+          <w:noProof/>
+        </w:rPr>
+        <w:t>130,</w:t>
+      </w:r>
+      <w:r>
+        <w:rPr>
+          <w:noProof/>
+        </w:rPr>
+        <w:t xml:space="preserve"> </w:t>
+      </w:r>
+      <w:r>
+        <w:rPr>
+          <w:noProof/>
+        </w:rPr>
+        <w:t>MANCHESTER ROAD,</w:t>
+      </w:r>
+      <w:r>
+        <w:rPr>
+          <w:noProof/>
+        </w:rPr>
+        <w:t xml:space="preserve"> </w:t>
+      </w:r>
+      <w:r>
+        <w:rPr>
+          <w:noProof/>
+        </w:rPr>
+        <w:t>WILMSLOW SK9 2LE</w:t>
+      </w:r>
+    </w:p>
+    <w:p>
+      <w:pPr>
         <w:ind w:left="2880" w:firstLine="720"/>
         <w:rPr>
           <w:b/>
@@ -200,13 +158,19 @@
       </w:pPr>
       <w:r>
         <w:rPr>
+          <w:noProof/>
+        </w:rPr>
+        <w:t xml:space="preserve">    </w:t>
+      </w:r>
+      <w:r>
+        <w:rPr>
           <w:b/>
           <w:bCs/>
           <w:noProof/>
           <w:sz w:val="28"/>
           <w:szCs w:val="28"/>
         </w:rPr>
-        <w:t xml:space="preserve">    RENTAL AGREEMENT</w:t>
+        <w:t>RENTAL AGREEMENT</w:t>
       </w:r>
     </w:p>
     <w:p>
@@ -226,12 +190,12 @@
         <w:tblpPr w:leftFromText="180" w:rightFromText="180" w:vertAnchor="text" w:tblpX="5851" w:tblpY="481"/>
         <w:tblW w:w="0" w:type="auto"/>
         <w:tblBorders>
-          <w:top w:val="single" w:sz="4" w:space="0" w:color="auto"/>
-          <w:left w:val="single" w:sz="4" w:space="0" w:color="auto"/>
-          <w:bottom w:val="single" w:sz="4" w:space="0" w:color="auto"/>
-          <w:right w:val="single" w:sz="4" w:space="0" w:color="auto"/>
-          <w:insideH w:val="single" w:sz="4" w:space="0" w:color="auto"/>
-          <w:insideV w:val="single" w:sz="4" w:space="0" w:color="auto"/>
+          <w:top w:val="single" w:color="auto" w:sz="4" w:space="0"/>
+          <w:left w:val="single" w:color="auto" w:sz="4" w:space="0"/>
+          <w:bottom w:val="single" w:color="auto" w:sz="4" w:space="0"/>
+          <w:right w:val="single" w:color="auto" w:sz="4" w:space="0"/>
+          <w:insideH w:val="single" w:color="auto" w:sz="4" w:space="0"/>
+          <w:insideV w:val="single" w:color="auto" w:sz="4" w:space="0"/>
         </w:tblBorders>
         <w:tblLook w:val="0000" w:firstRow="0" w:lastRow="0" w:firstColumn="0" w:lastColumn="0" w:noHBand="0" w:noVBand="0"/>
       </w:tblPr>
@@ -270,7 +234,7 @@
             <w:placeholder>
               <w:docPart w:val="DefaultPlaceholder_-1854013440"/>
             </w:placeholder>
-            <w15:dataBinding w:prefixMappings="xmlns:ns0='urn:microsoft-dynamics-nav/reports/Print_Car_Report/60103/' " w:xpath="/ns0:NavWordReportXmlPart[1]/ns0:Car[1]/ns0:VehicleIDNo[1]" w:storeItemID="{A7843C40-B442-418D-A493-51E9EA54E2A6}" w16sdtdh:storeItemChecksum="nrK7jQ=="/>
+            <w15:dataBinding w:prefixMappings="xmlns:ns0='urn:microsoft-dynamics-nav/reports/Print_Car_Report/60103/' " w:xpath="/ns0:NavWordReportXmlPart[1]/ns0:Car[1]/ns0:VehicleIDNo[1]" w:storeItemID="{A7843C40-B442-418D-A493-51E9EA54E2A6}" w16sdtdh:storeItemChecksum="VoOAmg=="/>
           </w:sdtPr>
           <w:sdtContent>
             <w:tc>
@@ -431,11 +395,14 @@
             <w:rPr>
               <w:noProof/>
             </w:rPr>
-            <w:id w:val="1335655355"/>
+            <w:id w:val="1190256355"/>
             <w:placeholder>
               <w:docPart w:val="DefaultPlaceholder_-1854013440"/>
             </w:placeholder>
-            <w15:dataBinding w:prefixMappings="xmlns:ns0='urn:microsoft-dynamics-nav/reports/Print_Car_Report_WORD/60101/' " w:xpath="/ns0:NavWordReportXmlPart[1]/ns0:Car[1]/ns0:Body_Type[1]" w:storeItemID="{1FFF4AFC-9B63-44ED-B52F-9953A9DF8B61}"/>
+            <w:dataBinding w:prefixMappings="xmlns:ns0='urn:microsoft-dynamics-nav/reports/Print_Car_Report/60103/'" w:xpath="/ns0:NavWordReportXmlPart[1]/ns0:Car[1]/ns0:BodyType[1]" w:storeItemID="{A7843C40-B442-418D-A493-51E9EA54E2A6}"/>
+            <w:text/>
+            <w:alias w:val="#Nav: /Car/BodyType"/>
+            <w:tag w:val="#Nav: Print_Car_Report/60103"/>
           </w:sdtPr>
           <w:sdtContent>
             <w:tc>
@@ -452,7 +419,7 @@
                   <w:rPr>
                     <w:noProof/>
                   </w:rPr>
-                  <w:t>Body_Type</w:t>
+                  <w:t>BodyType</w:t>
                 </w:r>
               </w:p>
             </w:tc>
@@ -541,11 +508,14 @@
             <w:rPr>
               <w:noProof/>
             </w:rPr>
-            <w:id w:val="-1328736904"/>
+            <w:id w:val="-490411442"/>
             <w:placeholder>
               <w:docPart w:val="DefaultPlaceholder_-1854013440"/>
             </w:placeholder>
-            <w15:dataBinding w:prefixMappings="xmlns:ns0='urn:microsoft-dynamics-nav/reports/Print_Car_Report_WORD/60101/' " w:xpath="/ns0:NavWordReportXmlPart[1]/ns0:Car[1]/ns0:Fuel_Type[1]" w:storeItemID="{1FFF4AFC-9B63-44ED-B52F-9953A9DF8B61}"/>
+            <w:dataBinding w:prefixMappings="xmlns:ns0='urn:microsoft-dynamics-nav/reports/Print_Car_Report/60103/'" w:xpath="/ns0:NavWordReportXmlPart[1]/ns0:Car[1]/ns0:DriveType[1]" w:storeItemID="{A7843C40-B442-418D-A493-51E9EA54E2A6}"/>
+            <w:text/>
+            <w:alias w:val="#Nav: /Car/DriveType"/>
+            <w:tag w:val="#Nav: Print_Car_Report/60103"/>
           </w:sdtPr>
           <w:sdtContent>
             <w:tc>
@@ -562,7 +532,7 @@
                   <w:rPr>
                     <w:noProof/>
                   </w:rPr>
-                  <w:t>Fuel_Type</w:t>
+                  <w:t>DriveType</w:t>
                 </w:r>
               </w:p>
             </w:tc>
@@ -651,11 +621,14 @@
             <w:rPr>
               <w:noProof/>
             </w:rPr>
-            <w:id w:val="-129480937"/>
+            <w:id w:val="-737943969"/>
             <w:placeholder>
               <w:docPart w:val="DefaultPlaceholder_-1854013440"/>
             </w:placeholder>
-            <w15:dataBinding w:prefixMappings="xmlns:ns0='urn:microsoft-dynamics-nav/reports/Print_Car_Report_WORD/60101/' " w:xpath="/ns0:NavWordReportXmlPart[1]/ns0:Car[1]/ns0:Engine_Size[1]" w:storeItemID="{1FFF4AFC-9B63-44ED-B52F-9953A9DF8B61}"/>
+            <w:dataBinding w:prefixMappings="xmlns:ns0='urn:microsoft-dynamics-nav/reports/Print_Car_Report/60103/'" w:xpath="/ns0:NavWordReportXmlPart[1]/ns0:Car[1]/ns0:EngineSize[1]" w:storeItemID="{A7843C40-B442-418D-A493-51E9EA54E2A6}"/>
+            <w:text/>
+            <w:alias w:val="#Nav: /Car/EngineSize"/>
+            <w:tag w:val="#Nav: Print_Car_Report/60103"/>
           </w:sdtPr>
           <w:sdtContent>
             <w:tc>
@@ -672,7 +645,7 @@
                   <w:rPr>
                     <w:noProof/>
                   </w:rPr>
-                  <w:t>Engine_Size</w:t>
+                  <w:t>EngineSize</w:t>
                 </w:r>
               </w:p>
             </w:tc>
@@ -1042,12 +1015,12 @@
         <w:tblpPr w:leftFromText="180" w:rightFromText="180" w:vertAnchor="text" w:tblpX="31" w:tblpY="1"/>
         <w:tblW w:w="0" w:type="auto"/>
         <w:tblBorders>
-          <w:top w:val="single" w:sz="4" w:space="0" w:color="auto"/>
-          <w:left w:val="single" w:sz="4" w:space="0" w:color="auto"/>
-          <w:bottom w:val="single" w:sz="4" w:space="0" w:color="auto"/>
-          <w:right w:val="single" w:sz="4" w:space="0" w:color="auto"/>
-          <w:insideH w:val="single" w:sz="4" w:space="0" w:color="auto"/>
-          <w:insideV w:val="single" w:sz="4" w:space="0" w:color="auto"/>
+          <w:top w:val="single" w:color="auto" w:sz="4" w:space="0"/>
+          <w:left w:val="single" w:color="auto" w:sz="4" w:space="0"/>
+          <w:bottom w:val="single" w:color="auto" w:sz="4" w:space="0"/>
+          <w:right w:val="single" w:color="auto" w:sz="4" w:space="0"/>
+          <w:insideH w:val="single" w:color="auto" w:sz="4" w:space="0"/>
+          <w:insideV w:val="single" w:color="auto" w:sz="4" w:space="0"/>
         </w:tblBorders>
         <w:tblLook w:val="0000" w:firstRow="0" w:lastRow="0" w:firstColumn="0" w:lastColumn="0" w:noHBand="0" w:noVBand="0"/>
       </w:tblPr>
@@ -1093,6 +1066,62 @@
                 <w:szCs w:val="20"/>
               </w:rPr>
             </w:pPr>
+            <w:sdt>
+              <w:sdtPr>
+                <w:rPr>
+                  <w:noProof/>
+                  <w:sz w:val="20"/>
+                  <w:szCs w:val="20"/>
+                </w:rPr>
+                <w:id w:val="-997490318"/>
+                <w:placeholder>
+                  <w:docPart w:val="DefaultPlaceholder_-1854013440"/>
+                </w:placeholder>
+                <w15:dataBinding w:prefixMappings="xmlns:ns0='urn:microsoft-dynamics-nav/reports/Print_Car_Report/60103/' " w:xpath="/ns0:NavWordReportXmlPart[1]/ns0:Driver[1]/ns0:First_Name[1]" w:storeItemID="{A7843C40-B442-418D-A493-51E9EA54E2A6}" w16sdtdh:storeItemChecksum="VoOAmg=="/>
+              </w:sdtPr>
+              <w:sdtContent>
+                <w:r>
+                  <w:rPr>
+                    <w:noProof/>
+                    <w:sz w:val="20"/>
+                    <w:szCs w:val="20"/>
+                  </w:rPr>
+                  <w:t>First_Name</w:t>
+                </w:r>
+              </w:sdtContent>
+            </w:sdt>
+            <w:r>
+              <w:rPr>
+                <w:noProof/>
+                <w:sz w:val="20"/>
+                <w:szCs w:val="20"/>
+              </w:rPr>
+              <w:t xml:space="preserve">      </w:t>
+            </w:r>
+            <w:sdt>
+              <w:sdtPr>
+                <w:rPr>
+                  <w:noProof/>
+                  <w:sz w:val="20"/>
+                  <w:szCs w:val="20"/>
+                </w:rPr>
+                <w:id w:val="2143773669"/>
+                <w:placeholder>
+                  <w:docPart w:val="DefaultPlaceholder_-1854013440"/>
+                </w:placeholder>
+                <w15:dataBinding w:prefixMappings="xmlns:ns0='urn:microsoft-dynamics-nav/reports/Print_Car_Report/60103/' " w:xpath="/ns0:NavWordReportXmlPart[1]/ns0:Driver[1]/ns0:Last_Name[1]" w:storeItemID="{A7843C40-B442-418D-A493-51E9EA54E2A6}" w16sdtdh:storeItemChecksum="VoOAmg=="/>
+              </w:sdtPr>
+              <w:sdtContent>
+                <w:r>
+                  <w:rPr>
+                    <w:noProof/>
+                    <w:sz w:val="20"/>
+                    <w:szCs w:val="20"/>
+                  </w:rPr>
+                  <w:t>Last_Name</w:t>
+                </w:r>
+              </w:sdtContent>
+            </w:sdt>
           </w:p>
         </w:tc>
       </w:tr>
@@ -1122,20 +1151,44 @@
             </w:r>
           </w:p>
         </w:tc>
-        <w:tc>
-          <w:tcPr>
-            <w:tcW w:w="3283" w:type="dxa"/>
-          </w:tcPr>
-          <w:p>
-            <w:pPr>
-              <w:rPr>
-                <w:noProof/>
-                <w:sz w:val="20"/>
-                <w:szCs w:val="20"/>
-              </w:rPr>
-            </w:pPr>
-          </w:p>
-        </w:tc>
+        <w:sdt>
+          <w:sdtPr>
+            <w:rPr>
+              <w:noProof/>
+              <w:sz w:val="20"/>
+              <w:szCs w:val="20"/>
+            </w:rPr>
+            <w:id w:val="-2119286363"/>
+            <w:placeholder>
+              <w:docPart w:val="DefaultPlaceholder_-1854013440"/>
+            </w:placeholder>
+            <w15:dataBinding w:prefixMappings="xmlns:ns0='urn:microsoft-dynamics-nav/reports/Print_Car_Report/60103/' " w:xpath="/ns0:NavWordReportXmlPart[1]/ns0:Driver[1]/ns0:Driving_License_No_[1]" w:storeItemID="{A7843C40-B442-418D-A493-51E9EA54E2A6}" w16sdtdh:storeItemChecksum="VoOAmg=="/>
+          </w:sdtPr>
+          <w:sdtContent>
+            <w:tc>
+              <w:tcPr>
+                <w:tcW w:w="3283" w:type="dxa"/>
+              </w:tcPr>
+              <w:p>
+                <w:pPr>
+                  <w:rPr>
+                    <w:noProof/>
+                    <w:sz w:val="20"/>
+                    <w:szCs w:val="20"/>
+                  </w:rPr>
+                </w:pPr>
+                <w:r>
+                  <w:rPr>
+                    <w:noProof/>
+                    <w:sz w:val="20"/>
+                    <w:szCs w:val="20"/>
+                  </w:rPr>
+                  <w:t>Driving_License_No_</w:t>
+                </w:r>
+              </w:p>
+            </w:tc>
+          </w:sdtContent>
+        </w:sdt>
       </w:tr>
       <w:tr>
         <w:trPr>
@@ -1163,20 +1216,47 @@
             </w:r>
           </w:p>
         </w:tc>
-        <w:tc>
-          <w:tcPr>
-            <w:tcW w:w="3283" w:type="dxa"/>
-          </w:tcPr>
-          <w:p>
-            <w:pPr>
-              <w:rPr>
-                <w:noProof/>
-                <w:sz w:val="20"/>
-                <w:szCs w:val="20"/>
-              </w:rPr>
-            </w:pPr>
-          </w:p>
-        </w:tc>
+        <w:sdt>
+          <w:sdtPr>
+            <w:rPr>
+              <w:noProof/>
+              <w:sz w:val="20"/>
+              <w:szCs w:val="20"/>
+            </w:rPr>
+            <w:id w:val="-1779256934"/>
+            <w:placeholder>
+              <w:docPart w:val="DefaultPlaceholder_-1854013440"/>
+            </w:placeholder>
+            <w:dataBinding w:prefixMappings="xmlns:ns0='urn:microsoft-dynamics-nav/reports/Print_Car_Report/60103/'" w:xpath="/ns0:NavWordReportXmlPart[1]/ns0:Driver[1]/ns0:UK_Mobile_Phone_No_[1]" w:storeItemID="{A7843C40-B442-418D-A493-51E9EA54E2A6}"/>
+            <w:text/>
+            <w:alias w:val="#Nav: /Driver/UK_Mobile_Phone_No_"/>
+            <w:tag w:val="#Nav: Print_Car_Report/60103"/>
+          </w:sdtPr>
+          <w:sdtContent>
+            <w:tc>
+              <w:tcPr>
+                <w:tcW w:w="3283" w:type="dxa"/>
+              </w:tcPr>
+              <w:p>
+                <w:pPr>
+                  <w:rPr>
+                    <w:noProof/>
+                    <w:sz w:val="20"/>
+                    <w:szCs w:val="20"/>
+                  </w:rPr>
+                </w:pPr>
+                <w:r>
+                  <w:rPr>
+                    <w:noProof/>
+                    <w:sz w:val="20"/>
+                    <w:szCs w:val="20"/>
+                  </w:rPr>
+                  <w:t>UK_Mobile_Phone_No_</w:t>
+                </w:r>
+              </w:p>
+            </w:tc>
+          </w:sdtContent>
+        </w:sdt>
       </w:tr>
       <w:tr>
         <w:trPr>
@@ -1204,20 +1284,44 @@
             </w:r>
           </w:p>
         </w:tc>
-        <w:tc>
-          <w:tcPr>
-            <w:tcW w:w="3283" w:type="dxa"/>
-          </w:tcPr>
-          <w:p>
-            <w:pPr>
-              <w:rPr>
-                <w:noProof/>
-                <w:sz w:val="20"/>
-                <w:szCs w:val="20"/>
-              </w:rPr>
-            </w:pPr>
-          </w:p>
-        </w:tc>
+        <w:sdt>
+          <w:sdtPr>
+            <w:rPr>
+              <w:noProof/>
+              <w:sz w:val="20"/>
+              <w:szCs w:val="20"/>
+            </w:rPr>
+            <w:id w:val="1321928194"/>
+            <w:placeholder>
+              <w:docPart w:val="DefaultPlaceholder_-1854013440"/>
+            </w:placeholder>
+            <w15:dataBinding w:prefixMappings="xmlns:ns0='urn:microsoft-dynamics-nav/reports/Print_Car_Report/60103/' " w:xpath="/ns0:NavWordReportXmlPart[1]/ns0:Driver[1]/ns0:Address[1]" w:storeItemID="{A7843C40-B442-418D-A493-51E9EA54E2A6}" w16sdtdh:storeItemChecksum="VoOAmg=="/>
+          </w:sdtPr>
+          <w:sdtContent>
+            <w:tc>
+              <w:tcPr>
+                <w:tcW w:w="3283" w:type="dxa"/>
+              </w:tcPr>
+              <w:p>
+                <w:pPr>
+                  <w:rPr>
+                    <w:noProof/>
+                    <w:sz w:val="20"/>
+                    <w:szCs w:val="20"/>
+                  </w:rPr>
+                </w:pPr>
+                <w:r>
+                  <w:rPr>
+                    <w:noProof/>
+                    <w:sz w:val="20"/>
+                    <w:szCs w:val="20"/>
+                  </w:rPr>
+                  <w:t>Address</w:t>
+                </w:r>
+              </w:p>
+            </w:tc>
+          </w:sdtContent>
+        </w:sdt>
       </w:tr>
       <w:tr>
         <w:trPr>
@@ -1245,20 +1349,47 @@
             </w:r>
           </w:p>
         </w:tc>
-        <w:tc>
-          <w:tcPr>
-            <w:tcW w:w="3283" w:type="dxa"/>
-          </w:tcPr>
-          <w:p>
-            <w:pPr>
-              <w:rPr>
-                <w:noProof/>
-                <w:sz w:val="20"/>
-                <w:szCs w:val="20"/>
-              </w:rPr>
-            </w:pPr>
-          </w:p>
-        </w:tc>
+        <w:sdt>
+          <w:sdtPr>
+            <w:rPr>
+              <w:noProof/>
+              <w:sz w:val="20"/>
+              <w:szCs w:val="20"/>
+            </w:rPr>
+            <w:id w:val="-782499855"/>
+            <w:placeholder>
+              <w:docPart w:val="DefaultPlaceholder_-1854013440"/>
+            </w:placeholder>
+            <w:dataBinding w:prefixMappings="xmlns:ns0='urn:microsoft-dynamics-nav/reports/Print_Car_Report/60103/'" w:xpath="/ns0:NavWordReportXmlPart[1]/ns0:Driver[1]/ns0:Post_Code[1]" w:storeItemID="{A7843C40-B442-418D-A493-51E9EA54E2A6}"/>
+            <w:text/>
+            <w:alias w:val="#Nav: /Driver/Post_Code"/>
+            <w:tag w:val="#Nav: Print_Car_Report/60103"/>
+          </w:sdtPr>
+          <w:sdtContent>
+            <w:tc>
+              <w:tcPr>
+                <w:tcW w:w="3283" w:type="dxa"/>
+              </w:tcPr>
+              <w:p>
+                <w:pPr>
+                  <w:rPr>
+                    <w:noProof/>
+                    <w:sz w:val="20"/>
+                    <w:szCs w:val="20"/>
+                  </w:rPr>
+                </w:pPr>
+                <w:r>
+                  <w:rPr>
+                    <w:noProof/>
+                    <w:sz w:val="20"/>
+                    <w:szCs w:val="20"/>
+                  </w:rPr>
+                  <w:t>Post_Code</w:t>
+                </w:r>
+              </w:p>
+            </w:tc>
+          </w:sdtContent>
+        </w:sdt>
       </w:tr>
     </w:tbl>
     <w:p>
@@ -1296,12 +1427,12 @@
         <w:tblpPr w:leftFromText="180" w:rightFromText="180" w:vertAnchor="text" w:tblpX="76" w:tblpY="121"/>
         <w:tblW w:w="0" w:type="auto"/>
         <w:tblBorders>
-          <w:top w:val="single" w:sz="4" w:space="0" w:color="auto"/>
-          <w:left w:val="single" w:sz="4" w:space="0" w:color="auto"/>
-          <w:bottom w:val="single" w:sz="4" w:space="0" w:color="auto"/>
-          <w:right w:val="single" w:sz="4" w:space="0" w:color="auto"/>
-          <w:insideH w:val="single" w:sz="4" w:space="0" w:color="auto"/>
-          <w:insideV w:val="single" w:sz="4" w:space="0" w:color="auto"/>
+          <w:top w:val="single" w:color="auto" w:sz="4" w:space="0"/>
+          <w:left w:val="single" w:color="auto" w:sz="4" w:space="0"/>
+          <w:bottom w:val="single" w:color="auto" w:sz="4" w:space="0"/>
+          <w:right w:val="single" w:color="auto" w:sz="4" w:space="0"/>
+          <w:insideH w:val="single" w:color="auto" w:sz="4" w:space="0"/>
+          <w:insideV w:val="single" w:color="auto" w:sz="4" w:space="0"/>
         </w:tblBorders>
         <w:tblLook w:val="0000" w:firstRow="0" w:lastRow="0" w:firstColumn="0" w:lastColumn="0" w:noHBand="0" w:noVBand="0"/>
       </w:tblPr>
@@ -1558,12 +1689,12 @@
         <w:tblpPr w:leftFromText="180" w:rightFromText="180" w:vertAnchor="text" w:tblpX="61" w:tblpY="121"/>
         <w:tblW w:w="0" w:type="auto"/>
         <w:tblBorders>
-          <w:top w:val="single" w:sz="4" w:space="0" w:color="auto"/>
-          <w:left w:val="single" w:sz="4" w:space="0" w:color="auto"/>
-          <w:bottom w:val="single" w:sz="4" w:space="0" w:color="auto"/>
-          <w:right w:val="single" w:sz="4" w:space="0" w:color="auto"/>
-          <w:insideH w:val="single" w:sz="4" w:space="0" w:color="auto"/>
-          <w:insideV w:val="single" w:sz="4" w:space="0" w:color="auto"/>
+          <w:top w:val="single" w:color="auto" w:sz="4" w:space="0"/>
+          <w:left w:val="single" w:color="auto" w:sz="4" w:space="0"/>
+          <w:bottom w:val="single" w:color="auto" w:sz="4" w:space="0"/>
+          <w:right w:val="single" w:color="auto" w:sz="4" w:space="0"/>
+          <w:insideH w:val="single" w:color="auto" w:sz="4" w:space="0"/>
+          <w:insideV w:val="single" w:color="auto" w:sz="4" w:space="0"/>
         </w:tblBorders>
         <w:tblLook w:val="0000" w:firstRow="0" w:lastRow="0" w:firstColumn="0" w:lastColumn="0" w:noHBand="0" w:noVBand="0"/>
       </w:tblPr>
@@ -1739,7 +1870,7 @@
     <w:p/>
     <w:sectPr>
       <w:pgSz w:w="11906" w:h="16838"/>
-      <w:pgMar w:top="720" w:right="720" w:bottom="720" w:left="720" w:header="1020" w:footer="708" w:gutter="0"/>
+      <w:pgMar w:top="142" w:right="140" w:bottom="720" w:left="720" w:header="1020" w:footer="708" w:gutter="0"/>
       <w:cols w:space="708"/>
       <w:docGrid w:linePitch="360"/>
     </w:sectPr>
@@ -1748,7 +1879,7 @@
 </file>
 
 <file path=word/styles.xml><?xml version="1.0" encoding="utf-8"?>
-<w:styles xmlns:mc="http://schemas.openxmlformats.org/markup-compatibility/2006" xmlns:r="http://schemas.openxmlformats.org/officeDocument/2006/relationships" xmlns:w="http://schemas.openxmlformats.org/wordprocessingml/2006/main" xmlns:w14="http://schemas.microsoft.com/office/word/2010/wordml" xmlns:w15="http://schemas.microsoft.com/office/word/2012/wordml" xmlns:w16cex="http://schemas.microsoft.com/office/word/2018/wordml/cex" xmlns:w16cid="http://schemas.microsoft.com/office/word/2016/wordml/cid" xmlns:w16="http://schemas.microsoft.com/office/word/2018/wordml" xmlns:w16du="http://schemas.microsoft.com/office/word/2023/wordml/word16du" xmlns:w16sdtdh="http://schemas.microsoft.com/office/word/2020/wordml/sdtdatahash" xmlns:w16se="http://schemas.microsoft.com/office/word/2015/wordml/symex" mc:Ignorable="w14 w15 w16se w16cid w16 w16cex w16sdtdh w16du">
+<w:styles xmlns:mc="http://schemas.openxmlformats.org/markup-compatibility/2006" xmlns:r="http://schemas.openxmlformats.org/officeDocument/2006/relationships" xmlns:w="http://schemas.openxmlformats.org/wordprocessingml/2006/main" xmlns:w14="http://schemas.microsoft.com/office/word/2010/wordml" xmlns:w15="http://schemas.microsoft.com/office/word/2012/wordml" xmlns:w16cex="http://schemas.microsoft.com/office/word/2018/wordml/cex" xmlns:w16cid="http://schemas.microsoft.com/office/word/2016/wordml/cid" xmlns:w16="http://schemas.microsoft.com/office/word/2018/wordml" xmlns:w16du="http://schemas.microsoft.com/office/word/2023/wordml/word16du" xmlns:w16sdtdh="http://schemas.microsoft.com/office/word/2020/wordml/sdtdatahash" xmlns:w16sdtfl="http://schemas.microsoft.com/office/word/2024/wordml/sdtformatlock" xmlns:w16se="http://schemas.microsoft.com/office/word/2015/wordml/symex" mc:Ignorable="w14 w15 w16se w16cid w16 w16cex w16sdtdh w16sdtfl w16du">
   <w:docDefaults>
     <w:rPrDefault>
       <w:rPr>
@@ -2189,7 +2320,7 @@
 </file>
 
 <file path=word/glossary/document.xml><?xml version="1.0" encoding="utf-8"?>
-<w:glossaryDocument xmlns:wpc="http://schemas.microsoft.com/office/word/2010/wordprocessingCanvas" xmlns:cx="http://schemas.microsoft.com/office/drawing/2014/chartex" xmlns:cx1="http://schemas.microsoft.com/office/drawing/2015/9/8/chartex" xmlns:cx2="http://schemas.microsoft.com/office/drawing/2015/10/21/chartex" xmlns:cx3="http://schemas.microsoft.com/office/drawing/2016/5/9/chartex" xmlns:cx4="http://schemas.microsoft.com/office/drawing/2016/5/10/chartex" xmlns:cx5="http://schemas.microsoft.com/office/drawing/2016/5/11/chartex" xmlns:cx6="http://schemas.microsoft.com/office/drawing/2016/5/12/chartex" xmlns:cx7="http://schemas.microsoft.com/office/drawing/2016/5/13/chartex" xmlns:cx8="http://schemas.microsoft.com/office/drawing/2016/5/14/chartex" xmlns:mc="http://schemas.openxmlformats.org/markup-compatibility/2006" xmlns:aink="http://schemas.microsoft.com/office/drawing/2016/ink" xmlns:am3d="http://schemas.microsoft.com/office/drawing/2017/model3d" xmlns:o="urn:schemas-microsoft-com:office:office" xmlns:oel="http://schemas.microsoft.com/office/2019/extlst" xmlns:r="http://schemas.openxmlformats.org/officeDocument/2006/relationships" xmlns:m="http://schemas.openxmlformats.org/officeDocument/2006/math" xmlns:v="urn:schemas-microsoft-com:vml" xmlns:wp14="http://schemas.microsoft.com/office/word/2010/wordprocessingDrawing" xmlns:wp="http://schemas.openxmlformats.org/drawingml/2006/wordprocessingDrawing" xmlns:w10="urn:schemas-microsoft-com:office:word" xmlns:w="http://schemas.openxmlformats.org/wordprocessingml/2006/main" xmlns:w14="http://schemas.microsoft.com/office/word/2010/wordml" xmlns:w15="http://schemas.microsoft.com/office/word/2012/wordml" xmlns:w16cex="http://schemas.microsoft.com/office/word/2018/wordml/cex" xmlns:w16cid="http://schemas.microsoft.com/office/word/2016/wordml/cid" xmlns:w16="http://schemas.microsoft.com/office/word/2018/wordml" xmlns:w16du="http://schemas.microsoft.com/office/word/2023/wordml/word16du" xmlns:w16sdtdh="http://schemas.microsoft.com/office/word/2020/wordml/sdtdatahash" xmlns:w16se="http://schemas.microsoft.com/office/word/2015/wordml/symex" xmlns:wpg="http://schemas.microsoft.com/office/word/2010/wordprocessingGroup" xmlns:wpi="http://schemas.microsoft.com/office/word/2010/wordprocessingInk" xmlns:wne="http://schemas.microsoft.com/office/word/2006/wordml" xmlns:wps="http://schemas.microsoft.com/office/word/2010/wordprocessingShape" mc:Ignorable="w14 w15 w16se w16cid w16 w16cex w16sdtdh w16du wp14">
+<w:glossaryDocument xmlns:wpc="http://schemas.microsoft.com/office/word/2010/wordprocessingCanvas" xmlns:cx="http://schemas.microsoft.com/office/drawing/2014/chartex" xmlns:cx1="http://schemas.microsoft.com/office/drawing/2015/9/8/chartex" xmlns:cx2="http://schemas.microsoft.com/office/drawing/2015/10/21/chartex" xmlns:cx3="http://schemas.microsoft.com/office/drawing/2016/5/9/chartex" xmlns:cx4="http://schemas.microsoft.com/office/drawing/2016/5/10/chartex" xmlns:cx5="http://schemas.microsoft.com/office/drawing/2016/5/11/chartex" xmlns:cx6="http://schemas.microsoft.com/office/drawing/2016/5/12/chartex" xmlns:cx7="http://schemas.microsoft.com/office/drawing/2016/5/13/chartex" xmlns:cx8="http://schemas.microsoft.com/office/drawing/2016/5/14/chartex" xmlns:mc="http://schemas.openxmlformats.org/markup-compatibility/2006" xmlns:aink="http://schemas.microsoft.com/office/drawing/2016/ink" xmlns:am3d="http://schemas.microsoft.com/office/drawing/2017/model3d" xmlns:o="urn:schemas-microsoft-com:office:office" xmlns:oel="http://schemas.microsoft.com/office/2019/extlst" xmlns:r="http://schemas.openxmlformats.org/officeDocument/2006/relationships" xmlns:m="http://schemas.openxmlformats.org/officeDocument/2006/math" xmlns:v="urn:schemas-microsoft-com:vml" xmlns:wp14="http://schemas.microsoft.com/office/word/2010/wordprocessingDrawing" xmlns:wp="http://schemas.openxmlformats.org/drawingml/2006/wordprocessingDrawing" xmlns:w10="urn:schemas-microsoft-com:office:word" xmlns:w="http://schemas.openxmlformats.org/wordprocessingml/2006/main" xmlns:w14="http://schemas.microsoft.com/office/word/2010/wordml" xmlns:w15="http://schemas.microsoft.com/office/word/2012/wordml" xmlns:w16cex="http://schemas.microsoft.com/office/word/2018/wordml/cex" xmlns:w16cid="http://schemas.microsoft.com/office/word/2016/wordml/cid" xmlns:w16="http://schemas.microsoft.com/office/word/2018/wordml" xmlns:w16du="http://schemas.microsoft.com/office/word/2023/wordml/word16du" xmlns:w16sdtdh="http://schemas.microsoft.com/office/word/2020/wordml/sdtdatahash" xmlns:w16sdtfl="http://schemas.microsoft.com/office/word/2024/wordml/sdtformatlock" xmlns:w16se="http://schemas.microsoft.com/office/word/2015/wordml/symex" xmlns:wpg="http://schemas.microsoft.com/office/word/2010/wordprocessingGroup" xmlns:wpi="http://schemas.microsoft.com/office/word/2010/wordprocessingInk" xmlns:wne="http://schemas.microsoft.com/office/word/2006/wordml" xmlns:wps="http://schemas.microsoft.com/office/word/2010/wordprocessingShape" mc:Ignorable="w14 w15 w16se w16cid w16 w16cex w16sdtdh w16sdtfl w16du wp14">
   <w:docParts>
     <w:docPart>
       <w:docPartPr>
@@ -2222,7 +2353,7 @@
 </file>
 
 <file path=word/glossary/fontTable.xml><?xml version="1.0" encoding="utf-8"?>
-<w:fonts xmlns:mc="http://schemas.openxmlformats.org/markup-compatibility/2006" xmlns:r="http://schemas.openxmlformats.org/officeDocument/2006/relationships" xmlns:w="http://schemas.openxmlformats.org/wordprocessingml/2006/main" xmlns:w14="http://schemas.microsoft.com/office/word/2010/wordml" xmlns:w15="http://schemas.microsoft.com/office/word/2012/wordml" xmlns:w16cex="http://schemas.microsoft.com/office/word/2018/wordml/cex" xmlns:w16cid="http://schemas.microsoft.com/office/word/2016/wordml/cid" xmlns:w16="http://schemas.microsoft.com/office/word/2018/wordml" xmlns:w16du="http://schemas.microsoft.com/office/word/2023/wordml/word16du" xmlns:w16sdtdh="http://schemas.microsoft.com/office/word/2020/wordml/sdtdatahash" xmlns:w16se="http://schemas.microsoft.com/office/word/2015/wordml/symex" mc:Ignorable="w14 w15 w16se w16cid w16 w16cex w16sdtdh w16du">
+<w:fonts xmlns:mc="http://schemas.openxmlformats.org/markup-compatibility/2006" xmlns:r="http://schemas.openxmlformats.org/officeDocument/2006/relationships" xmlns:w="http://schemas.openxmlformats.org/wordprocessingml/2006/main" xmlns:w14="http://schemas.microsoft.com/office/word/2010/wordml" xmlns:w15="http://schemas.microsoft.com/office/word/2012/wordml" xmlns:w16cex="http://schemas.microsoft.com/office/word/2018/wordml/cex" xmlns:w16cid="http://schemas.microsoft.com/office/word/2016/wordml/cid" xmlns:w16="http://schemas.microsoft.com/office/word/2018/wordml" xmlns:w16du="http://schemas.microsoft.com/office/word/2023/wordml/word16du" xmlns:w16sdtdh="http://schemas.microsoft.com/office/word/2020/wordml/sdtdatahash" xmlns:w16sdtfl="http://schemas.microsoft.com/office/word/2024/wordml/sdtformatlock" xmlns:w16se="http://schemas.microsoft.com/office/word/2015/wordml/symex" mc:Ignorable="w14 w15 w16se w16cid w16 w16cex w16sdtdh w16sdtfl w16du">
   <w:font w:name="Aptos">
     <w:charset w:val="00"/>
     <w:family w:val="swiss"/>
@@ -2246,7 +2377,7 @@
 </file>
 
 <file path=word/glossary/settings.xml><?xml version="1.0" encoding="utf-8"?>
-<w:settings xmlns:mc="http://schemas.openxmlformats.org/markup-compatibility/2006" xmlns:o="urn:schemas-microsoft-com:office:office" xmlns:r="http://schemas.openxmlformats.org/officeDocument/2006/relationships" xmlns:m="http://schemas.openxmlformats.org/officeDocument/2006/math" xmlns:v="urn:schemas-microsoft-com:vml" xmlns:w10="urn:schemas-microsoft-com:office:word" xmlns:w="http://schemas.openxmlformats.org/wordprocessingml/2006/main" xmlns:w14="http://schemas.microsoft.com/office/word/2010/wordml" xmlns:w15="http://schemas.microsoft.com/office/word/2012/wordml" xmlns:w16cex="http://schemas.microsoft.com/office/word/2018/wordml/cex" xmlns:w16cid="http://schemas.microsoft.com/office/word/2016/wordml/cid" xmlns:w16="http://schemas.microsoft.com/office/word/2018/wordml" xmlns:w16du="http://schemas.microsoft.com/office/word/2023/wordml/word16du" xmlns:w16sdtdh="http://schemas.microsoft.com/office/word/2020/wordml/sdtdatahash" xmlns:w16se="http://schemas.microsoft.com/office/word/2015/wordml/symex" xmlns:sl="http://schemas.openxmlformats.org/schemaLibrary/2006/main" mc:Ignorable="w14 w15 w16se w16cid w16 w16cex w16sdtdh w16du">
+<w:settings xmlns:mc="http://schemas.openxmlformats.org/markup-compatibility/2006" xmlns:o="urn:schemas-microsoft-com:office:office" xmlns:r="http://schemas.openxmlformats.org/officeDocument/2006/relationships" xmlns:m="http://schemas.openxmlformats.org/officeDocument/2006/math" xmlns:v="urn:schemas-microsoft-com:vml" xmlns:w10="urn:schemas-microsoft-com:office:word" xmlns:w="http://schemas.openxmlformats.org/wordprocessingml/2006/main" xmlns:w14="http://schemas.microsoft.com/office/word/2010/wordml" xmlns:w15="http://schemas.microsoft.com/office/word/2012/wordml" xmlns:w16cex="http://schemas.microsoft.com/office/word/2018/wordml/cex" xmlns:w16cid="http://schemas.microsoft.com/office/word/2016/wordml/cid" xmlns:w16="http://schemas.microsoft.com/office/word/2018/wordml" xmlns:w16du="http://schemas.microsoft.com/office/word/2023/wordml/word16du" xmlns:w16sdtdh="http://schemas.microsoft.com/office/word/2020/wordml/sdtdatahash" xmlns:w16sdtfl="http://schemas.microsoft.com/office/word/2024/wordml/sdtformatlock" xmlns:w16se="http://schemas.microsoft.com/office/word/2015/wordml/symex" xmlns:sl="http://schemas.openxmlformats.org/schemaLibrary/2006/main" mc:Ignorable="w14 w15 w16se w16cid w16 w16cex w16sdtdh w16sdtfl w16du">
   <w:view w:val="normal"/>
   <w:defaultTabStop w:val="720"/>
   <w:characterSpacingControl w:val="doNotCompress"/>
@@ -2266,9 +2397,11 @@
     <w:rsid w:val="003E21B2"/>
     <w:rsid w:val="00406E63"/>
     <w:rsid w:val="004B3083"/>
+    <w:rsid w:val="004C6352"/>
     <w:rsid w:val="007C0345"/>
     <w:rsid w:val="009D37A8"/>
     <w:rsid w:val="00A31663"/>
+    <w:rsid w:val="00BA244D"/>
     <w:rsid w:val="00D07FE9"/>
   </w:rsids>
   <m:mathPr>
@@ -2293,7 +2426,7 @@
 </file>
 
 <file path=word/glossary/styles.xml><?xml version="1.0" encoding="utf-8"?>
-<w:styles xmlns:mc="http://schemas.openxmlformats.org/markup-compatibility/2006" xmlns:r="http://schemas.openxmlformats.org/officeDocument/2006/relationships" xmlns:w="http://schemas.openxmlformats.org/wordprocessingml/2006/main" xmlns:w14="http://schemas.microsoft.com/office/word/2010/wordml" xmlns:w15="http://schemas.microsoft.com/office/word/2012/wordml" xmlns:w16cex="http://schemas.microsoft.com/office/word/2018/wordml/cex" xmlns:w16cid="http://schemas.microsoft.com/office/word/2016/wordml/cid" xmlns:w16="http://schemas.microsoft.com/office/word/2018/wordml" xmlns:w16du="http://schemas.microsoft.com/office/word/2023/wordml/word16du" xmlns:w16sdtdh="http://schemas.microsoft.com/office/word/2020/wordml/sdtdatahash" xmlns:w16se="http://schemas.microsoft.com/office/word/2015/wordml/symex" mc:Ignorable="w14 w15 w16se w16cid w16 w16cex w16sdtdh w16du">
+<w:styles xmlns:mc="http://schemas.openxmlformats.org/markup-compatibility/2006" xmlns:r="http://schemas.openxmlformats.org/officeDocument/2006/relationships" xmlns:w="http://schemas.openxmlformats.org/wordprocessingml/2006/main" xmlns:w14="http://schemas.microsoft.com/office/word/2010/wordml" xmlns:w15="http://schemas.microsoft.com/office/word/2012/wordml" xmlns:w16cex="http://schemas.microsoft.com/office/word/2018/wordml/cex" xmlns:w16cid="http://schemas.microsoft.com/office/word/2016/wordml/cid" xmlns:w16="http://schemas.microsoft.com/office/word/2018/wordml" xmlns:w16du="http://schemas.microsoft.com/office/word/2023/wordml/word16du" xmlns:w16sdtdh="http://schemas.microsoft.com/office/word/2020/wordml/sdtdatahash" xmlns:w16sdtfl="http://schemas.microsoft.com/office/word/2024/wordml/sdtformatlock" xmlns:w16se="http://schemas.microsoft.com/office/word/2015/wordml/symex" mc:Ignorable="w14 w15 w16se w16cid w16 w16cex w16sdtdh w16sdtfl w16du">
   <w:docDefaults>
     <w:rPrDefault>
       <w:rPr>
@@ -2734,7 +2867,7 @@
 </file>
 
 <file path=word/glossary/webSettings.xml><?xml version="1.0" encoding="utf-8"?>
-<w:webSettings xmlns:mc="http://schemas.openxmlformats.org/markup-compatibility/2006" xmlns:r="http://schemas.openxmlformats.org/officeDocument/2006/relationships" xmlns:w="http://schemas.openxmlformats.org/wordprocessingml/2006/main" xmlns:w14="http://schemas.microsoft.com/office/word/2010/wordml" xmlns:w15="http://schemas.microsoft.com/office/word/2012/wordml" xmlns:w16cex="http://schemas.microsoft.com/office/word/2018/wordml/cex" xmlns:w16cid="http://schemas.microsoft.com/office/word/2016/wordml/cid" xmlns:w16="http://schemas.microsoft.com/office/word/2018/wordml" xmlns:w16du="http://schemas.microsoft.com/office/word/2023/wordml/word16du" xmlns:w16sdtdh="http://schemas.microsoft.com/office/word/2020/wordml/sdtdatahash" xmlns:w16se="http://schemas.microsoft.com/office/word/2015/wordml/symex" mc:Ignorable="w14 w15 w16se w16cid w16 w16cex w16sdtdh w16du">
+<w:webSettings xmlns:mc="http://schemas.openxmlformats.org/markup-compatibility/2006" xmlns:r="http://schemas.openxmlformats.org/officeDocument/2006/relationships" xmlns:w="http://schemas.openxmlformats.org/wordprocessingml/2006/main" xmlns:w14="http://schemas.microsoft.com/office/word/2010/wordml" xmlns:w15="http://schemas.microsoft.com/office/word/2012/wordml" xmlns:w16cex="http://schemas.microsoft.com/office/word/2018/wordml/cex" xmlns:w16cid="http://schemas.microsoft.com/office/word/2016/wordml/cid" xmlns:w16="http://schemas.microsoft.com/office/word/2018/wordml" xmlns:w16du="http://schemas.microsoft.com/office/word/2023/wordml/word16du" xmlns:w16sdtdh="http://schemas.microsoft.com/office/word/2020/wordml/sdtdatahash" xmlns:w16sdtfl="http://schemas.microsoft.com/office/word/2024/wordml/sdtformatlock" xmlns:w16se="http://schemas.microsoft.com/office/word/2015/wordml/symex" mc:Ignorable="w14 w15 w16se w16cid w16 w16cex w16sdtdh w16sdtfl w16du">
   <w:optimizeForBrowser/>
   <w:allowPNG/>
 </w:webSettings>
@@ -3035,7 +3168,9 @@
 </a:theme>
 </file>
 
-<file path=customXml/item1.xml>��< ? x m l   v e r s i o n = " 1 . 0 "   e n c o d i n g = " u t f - 1 6 " ? > < N a v W o r d R e p o r t X m l P a r t   x m l n s = " u r n : m i c r o s o f t - d y n a m i c s - n a v / r e p o r t s / P r i n t _ C a r _ R e p o r t / 6 0 1 0 3 / " > +<file path=customXml/item1.xml>��< ? x m l   v e r s i o n = " 1 . 0 "   e n c o d i n g = " u t f - 1 6 " ? > + 
+ < N a v W o r d R e p o r t X m l P a r t   x m l n s = " u r n : m i c r o s o f t - d y n a m i c s - n a v / r e p o r t s / P r i n t _ C a r _ R e p o r t / 6 0 1 0 3 / " >   
      < C a r >   
@@ -3043,6 +3178,8 @@
  
          < B r a n d > B r a n d < / B r a n d >   
+         < C a r R e n t e r D r i v i n g L i c e n s e > C a r R e n t e r D r i v i n g L i c e n s e < / C a r R e n t e r D r i v i n g L i c e n s e > + 
          < C o l o u r > C o l o u r < / C o l o u r >   
          < D r i v e T y p e > D r i v e T y p e < / D r i v e T y p e > @@ -3068,6 +3205,42 @@
          < Y e a r > Y e a r < / Y e a r >   
      < / C a r > + 
+     < D r i v e r > + 
+         < A d d r e s s > A d d r e s s < / A d d r e s s > + 
+         < A d d r e s s _ 2 > A d d r e s s _ 2 < / A d d r e s s _ 2 > + 
+         < C i t y > C i t y < / C i t y > + 
+         < C o u n t r y _ R e g i o n _ C o d e > C o u n t r y _ R e g i o n _ C o d e < / C o u n t r y _ R e g i o n _ C o d e > + 
+         < C o u n t y > C o u n t y < / C o u n t y > + 
+         < D a t e _ o f _ b i r t h _ D O B _ > D a t e _ o f _ b i r t h _ D O B _ < / D a t e _ o f _ b i r t h _ D O B _ > + 
+         < D r i v i n g L i c e n s e N o > D r i v i n g L i c e n s e N o < / D r i v i n g L i c e n s e N o > + 
+         < E _ M a i l > E _ M a i l < / E _ M a i l > + 
+         < F i r s t _ N a m e > F i r s t _ N a m e < / F i r s t _ N a m e > + 
+         < I n s u r a n c e > I n s u r a n c e < / I n s u r a n c e > + 
+         < J o b _ S i t e > J o b _ S i t e < / J o b _ S i t e > + 
+         < L a s t _ N a m e > L a s t _ N a m e < / L a s t _ N a m e > + 
+         < P o s i t i o n > P o s i t i o n < / P o s i t i o n > + 
+         < P o s t _ C o d e > P o s t _ C o d e < / P o s t _ C o d e > + 
+         < R e q u i r e d _ C a r _ T y p e > R e q u i r e d _ C a r _ T y p e < / R e q u i r e d _ C a r _ T y p e > + 
+         < U K _ M o b i l e _ P h o n e _ N o _ > U K _ M o b i l e _ P h o n e _ N o _ < / U K _ M o b i l e _ P h o n e _ N o _ > + 
+     < / D r i v e r >   
  < / N a v W o r d R e p o r t X m l P a r t > 
 </file>

</xml_diff>

<commit_message>
Complete project Version - 1
</commit_message>
<xml_diff>
--- a/Print Car Report.docx
+++ b/Print Car Report.docx
@@ -13,16 +13,10 @@
         <w:rPr>
           <w:noProof/>
         </w:rPr>
-        <w:t xml:space="preserve"> </w:t>
-      </w:r>
-      <w:r>
-        <w:rPr>
-          <w:noProof/>
-        </w:rPr>
         <w:drawing>
-          <wp:inline distT="0" distB="0" distL="0" distR="0" wp14:anchorId="08B220B0" wp14:editId="471B9269">
-            <wp:extent cx="1490867" cy="628650"/>
-            <wp:effectExtent l="19050" t="0" r="14605" b="419100"/>
+          <wp:inline distT="0" distB="0" distL="0" distR="0" wp14:anchorId="08B220B0" wp14:editId="10042199">
+            <wp:extent cx="1558632" cy="657225"/>
+            <wp:effectExtent l="19050" t="0" r="22860" b="428625"/>
             <wp:docPr id="1663569728" name="Picture 1"/>
             <wp:cNvGraphicFramePr>
               <a:graphicFrameLocks xmlns:a="http://schemas.openxmlformats.org/drawingml/2006/main" noChangeAspect="1"/>
@@ -35,11 +29,11 @@
                     <pic:cNvPicPr/>
                   </pic:nvPicPr>
                   <pic:blipFill>
-                    <a:blip r:embed="rId5">
+                    <a:blip r:embed="rId6">
                       <a:extLst>
                         <a:ext uri="{BEBA8EAE-BF5A-486C-A8C5-ECC9F3942E4B}">
                           <a14:imgProps xmlns:a14="http://schemas.microsoft.com/office/drawing/2010/main">
-                            <a14:imgLayer r:embed="rId6">
+                            <a14:imgLayer r:embed="rId7">
                               <a14:imgEffect>
                                 <a14:artisticGlowDiffused/>
                               </a14:imgEffect>
@@ -58,7 +52,7 @@
                   <pic:spPr>
                     <a:xfrm>
                       <a:off x="0" y="0"/>
-                      <a:ext cx="1502825" cy="633692"/>
+                      <a:ext cx="1592369" cy="671451"/>
                     </a:xfrm>
                     <a:prstGeom prst="rect">
                       <a:avLst/>
@@ -84,63 +78,75 @@
       <w:pPr>
         <w:ind w:left="2160" w:firstLine="720"/>
         <w:rPr>
+          <w:rFonts w:ascii="Arial Nova" w:hAnsi="Arial Nova"/>
           <w:noProof/>
+          <w:sz w:val="22"/>
+          <w:szCs w:val="22"/>
         </w:rPr>
       </w:pPr>
       <w:r>
         <w:rPr>
+          <w:rFonts w:ascii="Arial Nova" w:hAnsi="Arial Nova"/>
           <w:noProof/>
+          <w:sz w:val="22"/>
+          <w:szCs w:val="22"/>
         </w:rPr>
-        <w:t xml:space="preserve">  </w:t>
-      </w:r>
-      <w:r>
-        <w:rPr>
-          <w:noProof/>
-        </w:rPr>
-        <w:t xml:space="preserve"> </w:t>
-      </w:r>
-      <w:r>
-        <w:rPr>
-          <w:noProof/>
-        </w:rPr>
-        <w:t xml:space="preserve">CAR RENTAL &amp; PRIVATE TRANSPORTATION         </w:t>
+        <w:t xml:space="preserve">   CAR RENTAL &amp; PRIVATE TRANSPORTATION         </w:t>
       </w:r>
     </w:p>
     <w:p>
       <w:pPr>
         <w:ind w:left="2160" w:firstLine="720"/>
         <w:rPr>
+          <w:rFonts w:ascii="Arial Nova" w:hAnsi="Arial Nova"/>
           <w:noProof/>
+          <w:sz w:val="22"/>
+          <w:szCs w:val="22"/>
           <w14:reflection w14:blurRad="6350" w14:stA="60000" w14:stPos="0" w14:endA="900" w14:endPos="60000" w14:dist="60007" w14:dir="5400000" w14:fadeDir="5400000" w14:sx="100000" w14:sy="-100000" w14:kx="0" w14:ky="0" w14:algn="bl"/>
         </w:rPr>
       </w:pPr>
       <w:r>
         <w:rPr>
+          <w:rFonts w:ascii="Arial Nova" w:hAnsi="Arial Nova"/>
           <w:noProof/>
+          <w:sz w:val="22"/>
+          <w:szCs w:val="22"/>
         </w:rPr>
         <w:t>130,</w:t>
       </w:r>
       <w:r>
         <w:rPr>
+          <w:rFonts w:ascii="Arial Nova" w:hAnsi="Arial Nova"/>
           <w:noProof/>
+          <w:sz w:val="22"/>
+          <w:szCs w:val="22"/>
         </w:rPr>
         <w:t xml:space="preserve"> </w:t>
       </w:r>
       <w:r>
         <w:rPr>
+          <w:rFonts w:ascii="Arial Nova" w:hAnsi="Arial Nova"/>
           <w:noProof/>
+          <w:sz w:val="22"/>
+          <w:szCs w:val="22"/>
         </w:rPr>
         <w:t>MANCHESTER ROAD,</w:t>
       </w:r>
       <w:r>
         <w:rPr>
+          <w:rFonts w:ascii="Arial Nova" w:hAnsi="Arial Nova"/>
           <w:noProof/>
+          <w:sz w:val="22"/>
+          <w:szCs w:val="22"/>
         </w:rPr>
         <w:t xml:space="preserve"> </w:t>
       </w:r>
       <w:r>
         <w:rPr>
+          <w:rFonts w:ascii="Arial Nova" w:hAnsi="Arial Nova"/>
           <w:noProof/>
+          <w:sz w:val="22"/>
+          <w:szCs w:val="22"/>
         </w:rPr>
         <w:t>WILMSLOW SK9 2LE</w:t>
       </w:r>
@@ -149,26 +155,51 @@
       <w:pPr>
         <w:ind w:left="2880" w:firstLine="720"/>
         <w:rPr>
+          <w:rFonts w:ascii="Arial Nova" w:hAnsi="Arial Nova"/>
           <w:b/>
           <w:bCs/>
           <w:noProof/>
-          <w:sz w:val="28"/>
-          <w:szCs w:val="28"/>
+          <w:sz w:val="22"/>
+          <w:szCs w:val="22"/>
         </w:rPr>
       </w:pPr>
       <w:r>
         <w:rPr>
+          <w:rFonts w:ascii="Arial Nova" w:hAnsi="Arial Nova"/>
           <w:noProof/>
+          <w:sz w:val="22"/>
+          <w:szCs w:val="22"/>
         </w:rPr>
-        <w:t xml:space="preserve">    </w:t>
+        <w:t xml:space="preserve">   </w:t>
       </w:r>
       <w:r>
         <w:rPr>
+          <w:rFonts w:ascii="Arial Nova" w:hAnsi="Arial Nova"/>
           <w:b/>
           <w:bCs/>
           <w:noProof/>
-          <w:sz w:val="28"/>
-          <w:szCs w:val="28"/>
+          <w:sz w:val="22"/>
+          <w:szCs w:val="22"/>
+        </w:rPr>
+        <w:t>CAR</w:t>
+      </w:r>
+      <w:r>
+        <w:rPr>
+          <w:rFonts w:ascii="Arial Nova" w:hAnsi="Arial Nova"/>
+          <w:noProof/>
+          <w:sz w:val="22"/>
+          <w:szCs w:val="22"/>
+        </w:rPr>
+        <w:t xml:space="preserve"> </w:t>
+      </w:r>
+      <w:r>
+        <w:rPr>
+          <w:rFonts w:ascii="Arial Nova" w:hAnsi="Arial Nova"/>
+          <w:b/>
+          <w:bCs/>
+          <w:noProof/>
+          <w:sz w:val="22"/>
+          <w:szCs w:val="22"/>
         </w:rPr>
         <w:t>RENTAL AGREEMENT</w:t>
       </w:r>
@@ -177,79 +208,790 @@
       <w:pPr>
         <w:ind w:left="2880" w:firstLine="720"/>
         <w:rPr>
+          <w:rFonts w:ascii="Arial Nova" w:hAnsi="Arial Nova"/>
           <w:b/>
           <w:bCs/>
           <w:noProof/>
-          <w:sz w:val="28"/>
-          <w:szCs w:val="28"/>
+          <w:sz w:val="22"/>
+          <w:szCs w:val="22"/>
         </w:rPr>
       </w:pPr>
     </w:p>
+    <w:p>
+      <w:pPr>
+        <w:ind w:left="2880" w:firstLine="720"/>
+        <w:rPr>
+          <w:rFonts w:ascii="Arial Nova" w:hAnsi="Arial Nova"/>
+          <w:b/>
+          <w:bCs/>
+          <w:noProof/>
+          <w:sz w:val="22"/>
+          <w:szCs w:val="22"/>
+        </w:rPr>
+      </w:pPr>
+    </w:p>
+    <w:p>
+      <w:pPr>
+        <w:rPr>
+          <w:rFonts w:ascii="Arial Nova" w:hAnsi="Arial Nova"/>
+          <w:b/>
+          <w:bCs/>
+          <w:noProof/>
+          <w:sz w:val="22"/>
+          <w:szCs w:val="22"/>
+        </w:rPr>
+      </w:pPr>
+      <w:r>
+        <w:rPr>
+          <w:rFonts w:ascii="Arial Nova" w:hAnsi="Arial Nova"/>
+          <w:b/>
+          <w:bCs/>
+          <w:noProof/>
+          <w:sz w:val="22"/>
+          <w:szCs w:val="22"/>
+        </w:rPr>
+        <w:t xml:space="preserve">DRIVER </w:t>
+      </w:r>
+      <w:r>
+        <w:rPr>
+          <w:rFonts w:ascii="Arial Nova" w:hAnsi="Arial Nova"/>
+          <w:b/>
+          <w:bCs/>
+          <w:noProof/>
+          <w:sz w:val="22"/>
+          <w:szCs w:val="22"/>
+        </w:rPr>
+        <w:t>RENTAL INFORMATION</w:t>
+      </w:r>
+      <w:r>
+        <w:rPr>
+          <w:rFonts w:ascii="Arial Nova" w:hAnsi="Arial Nova"/>
+          <w:b/>
+          <w:bCs/>
+          <w:noProof/>
+          <w:sz w:val="22"/>
+          <w:szCs w:val="22"/>
+        </w:rPr>
+        <w:tab/>
+      </w:r>
+      <w:r>
+        <w:rPr>
+          <w:rFonts w:ascii="Arial Nova" w:hAnsi="Arial Nova"/>
+          <w:b/>
+          <w:bCs/>
+          <w:noProof/>
+          <w:sz w:val="22"/>
+          <w:szCs w:val="22"/>
+        </w:rPr>
+        <w:tab/>
+      </w:r>
+      <w:r>
+        <w:rPr>
+          <w:rFonts w:ascii="Arial Nova" w:hAnsi="Arial Nova"/>
+          <w:b/>
+          <w:bCs/>
+          <w:noProof/>
+          <w:sz w:val="22"/>
+          <w:szCs w:val="22"/>
+        </w:rPr>
+        <w:tab/>
+      </w:r>
+      <w:r>
+        <w:rPr>
+          <w:rFonts w:ascii="Arial Nova" w:hAnsi="Arial Nova"/>
+          <w:b/>
+          <w:bCs/>
+          <w:noProof/>
+          <w:sz w:val="22"/>
+          <w:szCs w:val="22"/>
+        </w:rPr>
+        <w:tab/>
+      </w:r>
+      <w:r>
+        <w:rPr>
+          <w:rFonts w:ascii="Arial Nova" w:hAnsi="Arial Nova"/>
+          <w:b/>
+          <w:bCs/>
+          <w:noProof/>
+          <w:sz w:val="22"/>
+          <w:szCs w:val="22"/>
+        </w:rPr>
+        <w:tab/>
+        <w:t>VEHICLE DETAILS:</w:t>
+      </w:r>
+    </w:p>
     <w:tbl>
       <w:tblPr>
-        <w:tblpPr w:leftFromText="180" w:rightFromText="180" w:vertAnchor="text" w:tblpX="5851" w:tblpY="481"/>
+        <w:tblStyle w:val="TableGrid"/>
         <w:tblW w:w="0" w:type="auto"/>
-        <w:tblBorders>
-          <w:top w:val="single" w:color="auto" w:sz="4" w:space="0"/>
-          <w:left w:val="single" w:color="auto" w:sz="4" w:space="0"/>
-          <w:bottom w:val="single" w:color="auto" w:sz="4" w:space="0"/>
-          <w:right w:val="single" w:color="auto" w:sz="4" w:space="0"/>
-          <w:insideH w:val="single" w:color="auto" w:sz="4" w:space="0"/>
-          <w:insideV w:val="single" w:color="auto" w:sz="4" w:space="0"/>
-        </w:tblBorders>
-        <w:tblLook w:val="0000" w:firstRow="0" w:lastRow="0" w:firstColumn="0" w:lastColumn="0" w:noHBand="0" w:noVBand="0"/>
+        <w:tblLook w:val="04A0" w:firstRow="1" w:lastRow="0" w:firstColumn="1" w:lastColumn="0" w:noHBand="0" w:noVBand="1"/>
       </w:tblPr>
       <w:tblGrid>
-        <w:gridCol w:w="1800"/>
-        <w:gridCol w:w="2835"/>
+        <w:gridCol w:w="2263"/>
+        <w:gridCol w:w="3434"/>
       </w:tblGrid>
       <w:tr>
         <w:trPr>
-          <w:trHeight w:val="495"/>
+          <w:trHeight w:val="278"/>
         </w:trPr>
         <w:tc>
           <w:tcPr>
-            <w:tcW w:w="1800" w:type="dxa"/>
+            <w:tcW w:w="2263" w:type="dxa"/>
           </w:tcPr>
           <w:p>
             <w:pPr>
               <w:rPr>
-                <w:noProof/>
+                <w:rFonts w:ascii="Arial Nova" w:hAnsi="Arial Nova"/>
+                <w:noProof/>
+                <w:sz w:val="22"/>
+                <w:szCs w:val="22"/>
               </w:rPr>
             </w:pPr>
             <w:r>
               <w:rPr>
-                <w:noProof/>
-              </w:rPr>
-              <w:t>VIN</w:t>
+                <w:rFonts w:ascii="Arial Nova" w:hAnsi="Arial Nova"/>
+                <w:noProof/>
+                <w:sz w:val="22"/>
+                <w:szCs w:val="22"/>
+              </w:rPr>
+              <w:t>Full Name</w:t>
+            </w:r>
+            <w:r>
+              <w:rPr>
+                <w:rFonts w:ascii="Arial Nova" w:hAnsi="Arial Nova"/>
+                <w:noProof/>
+                <w:sz w:val="22"/>
+                <w:szCs w:val="22"/>
+              </w:rPr>
+              <w:t>:</w:t>
+            </w:r>
+          </w:p>
+        </w:tc>
+        <w:tc>
+          <w:tcPr>
+            <w:tcW w:w="3434" w:type="dxa"/>
+          </w:tcPr>
+          <w:p>
+            <w:pPr>
+              <w:rPr>
+                <w:rFonts w:ascii="Arial Nova" w:hAnsi="Arial Nova"/>
+                <w:noProof/>
+                <w:sz w:val="22"/>
+                <w:szCs w:val="22"/>
+              </w:rPr>
+            </w:pPr>
+            <w:sdt>
+              <w:sdtPr>
+                <w:rPr>
+                  <w:rFonts w:ascii="Arial Nova" w:hAnsi="Arial Nova"/>
+                  <w:noProof/>
+                  <w:sz w:val="22"/>
+                  <w:szCs w:val="22"/>
+                </w:rPr>
+                <w:alias w:val="#Nav: /Driver/First_Name"/>
+                <w:tag w:val="#Nav: Print_Car_Report/60103"/>
+                <w:id w:val="2007248739"/>
+                <w:placeholder>
+                  <w:docPart w:val="DefaultPlaceholder_-1854013440"/>
+                </w:placeholder>
+                <w:dataBinding w:prefixMappings="xmlns:ns0='urn:microsoft-dynamics-nav/reports/Print_Car_Report/60103/'" w:xpath="/ns0:NavWordReportXmlPart[1]/ns0:Driver[1]/ns0:First_Name[1]" w:storeItemID="{A7843C40-B442-418D-A493-51E9EA54E2A6}"/>
+                <w:text/>
+              </w:sdtPr>
+              <w:sdtContent>
+                <w:r>
+                  <w:rPr>
+                    <w:rFonts w:ascii="Arial Nova" w:hAnsi="Arial Nova"/>
+                    <w:noProof/>
+                    <w:sz w:val="22"/>
+                    <w:szCs w:val="22"/>
+                  </w:rPr>
+                  <w:t>First_Name</w:t>
+                </w:r>
+              </w:sdtContent>
+            </w:sdt>
+            <w:r>
+              <w:rPr>
+                <w:rFonts w:ascii="Arial Nova" w:hAnsi="Arial Nova"/>
+                <w:noProof/>
+                <w:sz w:val="22"/>
+                <w:szCs w:val="22"/>
+              </w:rPr>
+              <w:t xml:space="preserve">   </w:t>
+            </w:r>
+            <w:sdt>
+              <w:sdtPr>
+                <w:rPr>
+                  <w:rFonts w:ascii="Arial Nova" w:hAnsi="Arial Nova"/>
+                  <w:noProof/>
+                  <w:sz w:val="22"/>
+                  <w:szCs w:val="22"/>
+                </w:rPr>
+                <w:alias w:val="#Nav: /Driver/Last_Name"/>
+                <w:tag w:val="#Nav: Print_Car_Report/60103"/>
+                <w:id w:val="-3676716"/>
+                <w:placeholder>
+                  <w:docPart w:val="DefaultPlaceholder_-1854013440"/>
+                </w:placeholder>
+                <w:dataBinding w:prefixMappings="xmlns:ns0='urn:microsoft-dynamics-nav/reports/Print_Car_Report/60103/'" w:xpath="/ns0:NavWordReportXmlPart[1]/ns0:Driver[1]/ns0:Last_Name[1]" w:storeItemID="{A7843C40-B442-418D-A493-51E9EA54E2A6}"/>
+                <w:text/>
+              </w:sdtPr>
+              <w:sdtContent>
+                <w:r>
+                  <w:rPr>
+                    <w:rFonts w:ascii="Arial Nova" w:hAnsi="Arial Nova"/>
+                    <w:noProof/>
+                    <w:sz w:val="22"/>
+                    <w:szCs w:val="22"/>
+                  </w:rPr>
+                  <w:t>Last_Name</w:t>
+                </w:r>
+              </w:sdtContent>
+            </w:sdt>
+          </w:p>
+        </w:tc>
+      </w:tr>
+      <w:tr>
+        <w:trPr>
+          <w:trHeight w:val="278"/>
+        </w:trPr>
+        <w:tc>
+          <w:tcPr>
+            <w:tcW w:w="2263" w:type="dxa"/>
+          </w:tcPr>
+          <w:p>
+            <w:pPr>
+              <w:rPr>
+                <w:rFonts w:ascii="Arial Nova" w:hAnsi="Arial Nova"/>
+                <w:noProof/>
+                <w:sz w:val="22"/>
+                <w:szCs w:val="22"/>
+              </w:rPr>
+            </w:pPr>
+            <w:r>
+              <w:rPr>
+                <w:rFonts w:ascii="Arial Nova" w:hAnsi="Arial Nova"/>
+                <w:noProof/>
+                <w:sz w:val="22"/>
+                <w:szCs w:val="22"/>
+              </w:rPr>
+              <w:t>Driving License</w:t>
+            </w:r>
+            <w:r>
+              <w:rPr>
+                <w:rFonts w:ascii="Arial Nova" w:hAnsi="Arial Nova"/>
+                <w:noProof/>
+                <w:sz w:val="22"/>
+                <w:szCs w:val="22"/>
+              </w:rPr>
+              <w:t xml:space="preserve"> </w:t>
+            </w:r>
+            <w:r>
+              <w:rPr>
+                <w:rFonts w:ascii="Arial Nova" w:hAnsi="Arial Nova"/>
+                <w:noProof/>
+                <w:sz w:val="22"/>
+                <w:szCs w:val="22"/>
+              </w:rPr>
+              <w:t>No</w:t>
+            </w:r>
+            <w:r>
+              <w:rPr>
+                <w:rFonts w:ascii="Arial Nova" w:hAnsi="Arial Nova"/>
+                <w:noProof/>
+                <w:sz w:val="22"/>
+                <w:szCs w:val="22"/>
+              </w:rPr>
+              <w:t>.:</w:t>
             </w:r>
           </w:p>
         </w:tc>
         <w:sdt>
           <w:sdtPr>
             <w:rPr>
+              <w:rFonts w:ascii="Arial Nova" w:hAnsi="Arial Nova"/>
               <w:noProof/>
+              <w:sz w:val="22"/>
+              <w:szCs w:val="22"/>
             </w:rPr>
-            <w:id w:val="25840262"/>
+            <w:alias w:val="#Nav: /Driver/DrivingLicenseNo"/>
+            <w:tag w:val="#Nav: Print_Car_Report/60103"/>
+            <w:id w:val="173532960"/>
             <w:placeholder>
               <w:docPart w:val="DefaultPlaceholder_-1854013440"/>
             </w:placeholder>
-            <w15:dataBinding w:prefixMappings="xmlns:ns0='urn:microsoft-dynamics-nav/reports/Print_Car_Report/60103/' " w:xpath="/ns0:NavWordReportXmlPart[1]/ns0:Car[1]/ns0:VehicleIDNo[1]" w:storeItemID="{A7843C40-B442-418D-A493-51E9EA54E2A6}" w16sdtdh:storeItemChecksum="VoOAmg=="/>
+            <w:dataBinding w:prefixMappings="xmlns:ns0='urn:microsoft-dynamics-nav/reports/Print_Car_Report/60103/'" w:xpath="/ns0:NavWordReportXmlPart[1]/ns0:Driver[1]/ns0:DrivingLicenseNo[1]" w:storeItemID="{A7843C40-B442-418D-A493-51E9EA54E2A6}"/>
+            <w:text/>
           </w:sdtPr>
           <w:sdtContent>
             <w:tc>
               <w:tcPr>
-                <w:tcW w:w="2835" w:type="dxa"/>
+                <w:tcW w:w="3434" w:type="dxa"/>
               </w:tcPr>
               <w:p>
                 <w:pPr>
                   <w:rPr>
-                    <w:noProof/>
+                    <w:rFonts w:ascii="Arial Nova" w:hAnsi="Arial Nova"/>
+                    <w:noProof/>
+                    <w:sz w:val="22"/>
+                    <w:szCs w:val="22"/>
                   </w:rPr>
                 </w:pPr>
                 <w:r>
                   <w:rPr>
-                    <w:noProof/>
+                    <w:rFonts w:ascii="Arial Nova" w:hAnsi="Arial Nova"/>
+                    <w:noProof/>
+                    <w:sz w:val="22"/>
+                    <w:szCs w:val="22"/>
+                  </w:rPr>
+                  <w:t>DrivingLicenseNo</w:t>
+                </w:r>
+              </w:p>
+            </w:tc>
+          </w:sdtContent>
+        </w:sdt>
+      </w:tr>
+      <w:tr>
+        <w:trPr>
+          <w:trHeight w:val="278"/>
+        </w:trPr>
+        <w:tc>
+          <w:tcPr>
+            <w:tcW w:w="2263" w:type="dxa"/>
+          </w:tcPr>
+          <w:p>
+            <w:pPr>
+              <w:rPr>
+                <w:rFonts w:ascii="Arial Nova" w:hAnsi="Arial Nova"/>
+                <w:noProof/>
+                <w:sz w:val="22"/>
+                <w:szCs w:val="22"/>
+              </w:rPr>
+            </w:pPr>
+            <w:r>
+              <w:rPr>
+                <w:rFonts w:ascii="Arial Nova" w:hAnsi="Arial Nova"/>
+                <w:noProof/>
+                <w:sz w:val="22"/>
+                <w:szCs w:val="22"/>
+              </w:rPr>
+              <w:t>Address:</w:t>
+            </w:r>
+          </w:p>
+        </w:tc>
+        <w:sdt>
+          <w:sdtPr>
+            <w:rPr>
+              <w:rFonts w:ascii="Arial Nova" w:hAnsi="Arial Nova"/>
+              <w:noProof/>
+              <w:sz w:val="22"/>
+              <w:szCs w:val="22"/>
+            </w:rPr>
+            <w:alias w:val="#Nav: /Driver/Address"/>
+            <w:tag w:val="#Nav: Print_Car_Report/60103"/>
+            <w:id w:val="-937130396"/>
+            <w:placeholder>
+              <w:docPart w:val="DefaultPlaceholder_-1854013440"/>
+            </w:placeholder>
+            <w:dataBinding w:prefixMappings="xmlns:ns0='urn:microsoft-dynamics-nav/reports/Print_Car_Report/60103/'" w:xpath="/ns0:NavWordReportXmlPart[1]/ns0:Driver[1]/ns0:Address[1]" w:storeItemID="{A7843C40-B442-418D-A493-51E9EA54E2A6}"/>
+            <w:text/>
+          </w:sdtPr>
+          <w:sdtContent>
+            <w:tc>
+              <w:tcPr>
+                <w:tcW w:w="3434" w:type="dxa"/>
+              </w:tcPr>
+              <w:p>
+                <w:pPr>
+                  <w:rPr>
+                    <w:rFonts w:ascii="Arial Nova" w:hAnsi="Arial Nova"/>
+                    <w:noProof/>
+                    <w:sz w:val="22"/>
+                    <w:szCs w:val="22"/>
+                  </w:rPr>
+                </w:pPr>
+                <w:r>
+                  <w:rPr>
+                    <w:rFonts w:ascii="Arial Nova" w:hAnsi="Arial Nova"/>
+                    <w:noProof/>
+                    <w:sz w:val="22"/>
+                    <w:szCs w:val="22"/>
+                  </w:rPr>
+                  <w:t>Address</w:t>
+                </w:r>
+              </w:p>
+            </w:tc>
+          </w:sdtContent>
+        </w:sdt>
+      </w:tr>
+      <w:tr>
+        <w:trPr>
+          <w:trHeight w:val="278"/>
+        </w:trPr>
+        <w:tc>
+          <w:tcPr>
+            <w:tcW w:w="2263" w:type="dxa"/>
+          </w:tcPr>
+          <w:p>
+            <w:pPr>
+              <w:rPr>
+                <w:rFonts w:ascii="Arial Nova" w:hAnsi="Arial Nova"/>
+                <w:noProof/>
+                <w:sz w:val="22"/>
+                <w:szCs w:val="22"/>
+              </w:rPr>
+            </w:pPr>
+            <w:r>
+              <w:rPr>
+                <w:rFonts w:ascii="Arial Nova" w:hAnsi="Arial Nova"/>
+                <w:noProof/>
+                <w:sz w:val="22"/>
+                <w:szCs w:val="22"/>
+              </w:rPr>
+              <w:t>Country:</w:t>
+            </w:r>
+          </w:p>
+        </w:tc>
+        <w:sdt>
+          <w:sdtPr>
+            <w:rPr>
+              <w:rFonts w:ascii="Arial Nova" w:hAnsi="Arial Nova"/>
+              <w:noProof/>
+              <w:sz w:val="22"/>
+              <w:szCs w:val="22"/>
+            </w:rPr>
+            <w:alias w:val="#Nav: /Driver/Country_Region_Code"/>
+            <w:tag w:val="#Nav: Print_Car_Report/60103"/>
+            <w:id w:val="861249321"/>
+            <w:placeholder>
+              <w:docPart w:val="DefaultPlaceholder_-1854013440"/>
+            </w:placeholder>
+            <w:dataBinding w:prefixMappings="xmlns:ns0='urn:microsoft-dynamics-nav/reports/Print_Car_Report/60103/'" w:xpath="/ns0:NavWordReportXmlPart[1]/ns0:Driver[1]/ns0:Country_Region_Code[1]" w:storeItemID="{A7843C40-B442-418D-A493-51E9EA54E2A6}"/>
+            <w:text/>
+          </w:sdtPr>
+          <w:sdtContent>
+            <w:tc>
+              <w:tcPr>
+                <w:tcW w:w="3434" w:type="dxa"/>
+              </w:tcPr>
+              <w:p>
+                <w:pPr>
+                  <w:rPr>
+                    <w:rFonts w:ascii="Arial Nova" w:hAnsi="Arial Nova"/>
+                    <w:noProof/>
+                    <w:sz w:val="22"/>
+                    <w:szCs w:val="22"/>
+                  </w:rPr>
+                </w:pPr>
+                <w:r>
+                  <w:rPr>
+                    <w:rFonts w:ascii="Arial Nova" w:hAnsi="Arial Nova"/>
+                    <w:noProof/>
+                    <w:sz w:val="22"/>
+                    <w:szCs w:val="22"/>
+                  </w:rPr>
+                  <w:t>Country_Region_Code</w:t>
+                </w:r>
+              </w:p>
+            </w:tc>
+          </w:sdtContent>
+        </w:sdt>
+      </w:tr>
+      <w:tr>
+        <w:trPr>
+          <w:trHeight w:val="278"/>
+        </w:trPr>
+        <w:tc>
+          <w:tcPr>
+            <w:tcW w:w="2263" w:type="dxa"/>
+          </w:tcPr>
+          <w:p>
+            <w:pPr>
+              <w:rPr>
+                <w:rFonts w:ascii="Arial Nova" w:hAnsi="Arial Nova"/>
+                <w:noProof/>
+                <w:sz w:val="22"/>
+                <w:szCs w:val="22"/>
+              </w:rPr>
+            </w:pPr>
+            <w:r>
+              <w:rPr>
+                <w:rFonts w:ascii="Arial Nova" w:hAnsi="Arial Nova"/>
+                <w:noProof/>
+                <w:sz w:val="22"/>
+                <w:szCs w:val="22"/>
+              </w:rPr>
+              <w:t>City:</w:t>
+            </w:r>
+          </w:p>
+        </w:tc>
+        <w:sdt>
+          <w:sdtPr>
+            <w:rPr>
+              <w:rFonts w:ascii="Arial Nova" w:hAnsi="Arial Nova"/>
+              <w:noProof/>
+              <w:sz w:val="22"/>
+              <w:szCs w:val="22"/>
+            </w:rPr>
+            <w:alias w:val="#Nav: /Driver/City"/>
+            <w:tag w:val="#Nav: Print_Car_Report/60103"/>
+            <w:id w:val="80339386"/>
+            <w:placeholder>
+              <w:docPart w:val="DefaultPlaceholder_-1854013440"/>
+            </w:placeholder>
+            <w:dataBinding w:prefixMappings="xmlns:ns0='urn:microsoft-dynamics-nav/reports/Print_Car_Report/60103/'" w:xpath="/ns0:NavWordReportXmlPart[1]/ns0:Driver[1]/ns0:City[1]" w:storeItemID="{A7843C40-B442-418D-A493-51E9EA54E2A6}"/>
+            <w:text/>
+          </w:sdtPr>
+          <w:sdtContent>
+            <w:tc>
+              <w:tcPr>
+                <w:tcW w:w="3434" w:type="dxa"/>
+              </w:tcPr>
+              <w:p>
+                <w:pPr>
+                  <w:rPr>
+                    <w:rFonts w:ascii="Arial Nova" w:hAnsi="Arial Nova"/>
+                    <w:noProof/>
+                    <w:sz w:val="22"/>
+                    <w:szCs w:val="22"/>
+                  </w:rPr>
+                </w:pPr>
+                <w:r>
+                  <w:rPr>
+                    <w:rFonts w:ascii="Arial Nova" w:hAnsi="Arial Nova"/>
+                    <w:noProof/>
+                    <w:sz w:val="22"/>
+                    <w:szCs w:val="22"/>
+                  </w:rPr>
+                  <w:t>City</w:t>
+                </w:r>
+              </w:p>
+            </w:tc>
+          </w:sdtContent>
+        </w:sdt>
+      </w:tr>
+      <w:tr>
+        <w:trPr>
+          <w:trHeight w:val="278"/>
+        </w:trPr>
+        <w:tc>
+          <w:tcPr>
+            <w:tcW w:w="2263" w:type="dxa"/>
+          </w:tcPr>
+          <w:p>
+            <w:pPr>
+              <w:rPr>
+                <w:rFonts w:ascii="Arial Nova" w:hAnsi="Arial Nova"/>
+                <w:noProof/>
+                <w:sz w:val="22"/>
+                <w:szCs w:val="22"/>
+              </w:rPr>
+            </w:pPr>
+            <w:r>
+              <w:rPr>
+                <w:rFonts w:ascii="Arial Nova" w:hAnsi="Arial Nova"/>
+                <w:noProof/>
+                <w:sz w:val="22"/>
+                <w:szCs w:val="22"/>
+              </w:rPr>
+              <w:t>Post Code:</w:t>
+            </w:r>
+          </w:p>
+        </w:tc>
+        <w:sdt>
+          <w:sdtPr>
+            <w:rPr>
+              <w:rFonts w:ascii="Arial Nova" w:hAnsi="Arial Nova"/>
+              <w:noProof/>
+              <w:sz w:val="22"/>
+              <w:szCs w:val="22"/>
+            </w:rPr>
+            <w:alias w:val="#Nav: /Driver/Post_Code"/>
+            <w:tag w:val="#Nav: Print_Car_Report/60103"/>
+            <w:id w:val="-1678874392"/>
+            <w:placeholder>
+              <w:docPart w:val="DefaultPlaceholder_-1854013440"/>
+            </w:placeholder>
+            <w:dataBinding w:prefixMappings="xmlns:ns0='urn:microsoft-dynamics-nav/reports/Print_Car_Report/60103/'" w:xpath="/ns0:NavWordReportXmlPart[1]/ns0:Driver[1]/ns0:Post_Code[1]" w:storeItemID="{A7843C40-B442-418D-A493-51E9EA54E2A6}"/>
+            <w:text/>
+          </w:sdtPr>
+          <w:sdtContent>
+            <w:tc>
+              <w:tcPr>
+                <w:tcW w:w="3434" w:type="dxa"/>
+              </w:tcPr>
+              <w:p>
+                <w:pPr>
+                  <w:rPr>
+                    <w:rFonts w:ascii="Arial Nova" w:hAnsi="Arial Nova"/>
+                    <w:noProof/>
+                    <w:sz w:val="22"/>
+                    <w:szCs w:val="22"/>
+                  </w:rPr>
+                </w:pPr>
+                <w:r>
+                  <w:rPr>
+                    <w:rFonts w:ascii="Arial Nova" w:hAnsi="Arial Nova"/>
+                    <w:noProof/>
+                    <w:sz w:val="22"/>
+                    <w:szCs w:val="22"/>
+                  </w:rPr>
+                  <w:t>Post_Code</w:t>
+                </w:r>
+              </w:p>
+            </w:tc>
+          </w:sdtContent>
+        </w:sdt>
+      </w:tr>
+      <w:tr>
+        <w:trPr>
+          <w:trHeight w:val="278"/>
+        </w:trPr>
+        <w:tc>
+          <w:tcPr>
+            <w:tcW w:w="2263" w:type="dxa"/>
+          </w:tcPr>
+          <w:p>
+            <w:pPr>
+              <w:rPr>
+                <w:rFonts w:ascii="Arial Nova" w:hAnsi="Arial Nova"/>
+                <w:noProof/>
+                <w:sz w:val="22"/>
+                <w:szCs w:val="22"/>
+              </w:rPr>
+            </w:pPr>
+            <w:r>
+              <w:rPr>
+                <w:rFonts w:ascii="Arial Nova" w:hAnsi="Arial Nova"/>
+                <w:noProof/>
+                <w:sz w:val="22"/>
+                <w:szCs w:val="22"/>
+              </w:rPr>
+              <w:t>Mobile Phone No.:</w:t>
+            </w:r>
+          </w:p>
+        </w:tc>
+        <w:sdt>
+          <w:sdtPr>
+            <w:rPr>
+              <w:rFonts w:ascii="Arial Nova" w:hAnsi="Arial Nova"/>
+              <w:noProof/>
+              <w:sz w:val="22"/>
+              <w:szCs w:val="22"/>
+            </w:rPr>
+            <w:alias w:val="#Nav: /Driver/UK_Mobile_Phone_No_"/>
+            <w:tag w:val="#Nav: Print_Car_Report/60103"/>
+            <w:id w:val="1060911769"/>
+            <w:placeholder>
+              <w:docPart w:val="DefaultPlaceholder_-1854013440"/>
+            </w:placeholder>
+            <w:dataBinding w:prefixMappings="xmlns:ns0='urn:microsoft-dynamics-nav/reports/Print_Car_Report/60103/'" w:xpath="/ns0:NavWordReportXmlPart[1]/ns0:Driver[1]/ns0:UK_Mobile_Phone_No_[1]" w:storeItemID="{A7843C40-B442-418D-A493-51E9EA54E2A6}"/>
+            <w:text/>
+          </w:sdtPr>
+          <w:sdtContent>
+            <w:tc>
+              <w:tcPr>
+                <w:tcW w:w="3434" w:type="dxa"/>
+              </w:tcPr>
+              <w:p>
+                <w:pPr>
+                  <w:rPr>
+                    <w:rFonts w:ascii="Arial Nova" w:hAnsi="Arial Nova"/>
+                    <w:noProof/>
+                    <w:sz w:val="22"/>
+                    <w:szCs w:val="22"/>
+                  </w:rPr>
+                </w:pPr>
+                <w:r>
+                  <w:rPr>
+                    <w:rFonts w:ascii="Arial Nova" w:hAnsi="Arial Nova"/>
+                    <w:noProof/>
+                    <w:sz w:val="22"/>
+                    <w:szCs w:val="22"/>
+                  </w:rPr>
+                  <w:t>UK_Mobile_Phone_No_</w:t>
+                </w:r>
+              </w:p>
+            </w:tc>
+          </w:sdtContent>
+        </w:sdt>
+      </w:tr>
+    </w:tbl>
+    <w:tbl>
+      <w:tblPr>
+        <w:tblStyle w:val="TableGrid"/>
+        <w:tblpPr w:leftFromText="180" w:rightFromText="180" w:vertAnchor="text" w:horzAnchor="page" w:tblpX="6676" w:tblpY="-2227"/>
+        <w:tblW w:w="0" w:type="auto"/>
+        <w:tblLook w:val="04A0" w:firstRow="1" w:lastRow="0" w:firstColumn="1" w:lastColumn="0" w:noHBand="0" w:noVBand="1"/>
+      </w:tblPr>
+      <w:tblGrid>
+        <w:gridCol w:w="2405"/>
+        <w:gridCol w:w="2405"/>
+      </w:tblGrid>
+      <w:tr>
+        <w:trPr>
+          <w:trHeight w:val="272"/>
+        </w:trPr>
+        <w:tc>
+          <w:tcPr>
+            <w:tcW w:w="2405" w:type="dxa"/>
+          </w:tcPr>
+          <w:p>
+            <w:pPr>
+              <w:rPr>
+                <w:rFonts w:ascii="Arial Nova" w:hAnsi="Arial Nova"/>
+                <w:noProof/>
+                <w:sz w:val="22"/>
+                <w:szCs w:val="22"/>
+              </w:rPr>
+            </w:pPr>
+            <w:r>
+              <w:rPr>
+                <w:rFonts w:ascii="Arial Nova" w:hAnsi="Arial Nova"/>
+                <w:noProof/>
+                <w:sz w:val="22"/>
+                <w:szCs w:val="22"/>
+              </w:rPr>
+              <w:t>VIN No.:</w:t>
+            </w:r>
+          </w:p>
+        </w:tc>
+        <w:sdt>
+          <w:sdtPr>
+            <w:rPr>
+              <w:rFonts w:ascii="Arial Nova" w:hAnsi="Arial Nova"/>
+              <w:noProof/>
+              <w:sz w:val="22"/>
+              <w:szCs w:val="22"/>
+            </w:rPr>
+            <w:alias w:val="#Nav: /Car/VehicleIDNo"/>
+            <w:tag w:val="#Nav: Print_Car_Report/60103"/>
+            <w:id w:val="-1958174692"/>
+            <w:placeholder>
+              <w:docPart w:val="DefaultPlaceholder_-1854013440"/>
+            </w:placeholder>
+            <w:dataBinding w:prefixMappings="xmlns:ns0='urn:microsoft-dynamics-nav/reports/Print_Car_Report/60103/'" w:xpath="/ns0:NavWordReportXmlPart[1]/ns0:Car[1]/ns0:VehicleIDNo[1]" w:storeItemID="{A7843C40-B442-418D-A493-51E9EA54E2A6}"/>
+            <w:text/>
+          </w:sdtPr>
+          <w:sdtContent>
+            <w:tc>
+              <w:tcPr>
+                <w:tcW w:w="2405" w:type="dxa"/>
+              </w:tcPr>
+              <w:p>
+                <w:pPr>
+                  <w:rPr>
+                    <w:rFonts w:ascii="Arial Nova" w:hAnsi="Arial Nova"/>
+                    <w:noProof/>
+                    <w:sz w:val="22"/>
+                    <w:szCs w:val="22"/>
+                  </w:rPr>
+                </w:pPr>
+                <w:r>
+                  <w:rPr>
+                    <w:rFonts w:ascii="Arial Nova" w:hAnsi="Arial Nova"/>
+                    <w:noProof/>
+                    <w:sz w:val="22"/>
+                    <w:szCs w:val="22"/>
                   </w:rPr>
                   <w:t>VehicleIDNo</w:t>
                 </w:r>
@@ -260,51 +1002,69 @@
       </w:tr>
       <w:tr>
         <w:trPr>
-          <w:trHeight w:val="570"/>
+          <w:trHeight w:val="289"/>
         </w:trPr>
         <w:tc>
           <w:tcPr>
-            <w:tcW w:w="1800" w:type="dxa"/>
+            <w:tcW w:w="2405" w:type="dxa"/>
           </w:tcPr>
           <w:p>
             <w:pPr>
               <w:rPr>
-                <w:noProof/>
+                <w:rFonts w:ascii="Arial Nova" w:hAnsi="Arial Nova"/>
+                <w:noProof/>
+                <w:sz w:val="22"/>
+                <w:szCs w:val="22"/>
               </w:rPr>
             </w:pPr>
             <w:r>
               <w:rPr>
-                <w:noProof/>
-              </w:rPr>
-              <w:t>BRAND</w:t>
+                <w:rFonts w:ascii="Arial Nova" w:hAnsi="Arial Nova"/>
+                <w:noProof/>
+                <w:sz w:val="22"/>
+                <w:szCs w:val="22"/>
+              </w:rPr>
+              <w:t>Brand:</w:t>
             </w:r>
           </w:p>
         </w:tc>
         <w:sdt>
           <w:sdtPr>
             <w:rPr>
+              <w:rFonts w:ascii="Arial Nova" w:hAnsi="Arial Nova"/>
               <w:noProof/>
+              <w:sz w:val="22"/>
+              <w:szCs w:val="22"/>
             </w:rPr>
-            <w:id w:val="-1142503126"/>
+            <w:alias w:val="#Nav: /Car/Brand"/>
+            <w:tag w:val="#Nav: Print_Car_Report/60103"/>
+            <w:id w:val="-1437125896"/>
             <w:placeholder>
               <w:docPart w:val="DefaultPlaceholder_-1854013440"/>
             </w:placeholder>
-            <w15:dataBinding w:prefixMappings="xmlns:ns0='urn:microsoft-dynamics-nav/reports/Print_Car_Report_WORD/60101/' " w:xpath="/ns0:NavWordReportXmlPart[1]/ns0:Car[1]/ns0:Brand[1]" w:storeItemID="{1FFF4AFC-9B63-44ED-B52F-9953A9DF8B61}"/>
+            <w:dataBinding w:prefixMappings="xmlns:ns0='urn:microsoft-dynamics-nav/reports/Print_Car_Report/60103/'" w:xpath="/ns0:NavWordReportXmlPart[1]/ns0:Car[1]/ns0:Brand[1]" w:storeItemID="{A7843C40-B442-418D-A493-51E9EA54E2A6}"/>
+            <w:text/>
           </w:sdtPr>
           <w:sdtContent>
             <w:tc>
               <w:tcPr>
-                <w:tcW w:w="2835" w:type="dxa"/>
+                <w:tcW w:w="2405" w:type="dxa"/>
               </w:tcPr>
               <w:p>
                 <w:pPr>
                   <w:rPr>
-                    <w:noProof/>
+                    <w:rFonts w:ascii="Arial Nova" w:hAnsi="Arial Nova"/>
+                    <w:noProof/>
+                    <w:sz w:val="22"/>
+                    <w:szCs w:val="22"/>
                   </w:rPr>
                 </w:pPr>
                 <w:r>
                   <w:rPr>
-                    <w:noProof/>
+                    <w:rFonts w:ascii="Arial Nova" w:hAnsi="Arial Nova"/>
+                    <w:noProof/>
+                    <w:sz w:val="22"/>
+                    <w:szCs w:val="22"/>
                   </w:rPr>
                   <w:t>Brand</w:t>
                 </w:r>
@@ -315,51 +1075,69 @@
       </w:tr>
       <w:tr>
         <w:trPr>
-          <w:trHeight w:val="495"/>
+          <w:trHeight w:val="272"/>
         </w:trPr>
         <w:tc>
           <w:tcPr>
-            <w:tcW w:w="1800" w:type="dxa"/>
+            <w:tcW w:w="2405" w:type="dxa"/>
           </w:tcPr>
           <w:p>
             <w:pPr>
               <w:rPr>
-                <w:noProof/>
+                <w:rFonts w:ascii="Arial Nova" w:hAnsi="Arial Nova"/>
+                <w:noProof/>
+                <w:sz w:val="22"/>
+                <w:szCs w:val="22"/>
               </w:rPr>
             </w:pPr>
             <w:r>
               <w:rPr>
-                <w:noProof/>
-              </w:rPr>
-              <w:t>MODEL</w:t>
+                <w:rFonts w:ascii="Arial Nova" w:hAnsi="Arial Nova"/>
+                <w:noProof/>
+                <w:sz w:val="22"/>
+                <w:szCs w:val="22"/>
+              </w:rPr>
+              <w:t>Model:</w:t>
             </w:r>
           </w:p>
         </w:tc>
         <w:sdt>
           <w:sdtPr>
             <w:rPr>
+              <w:rFonts w:ascii="Arial Nova" w:hAnsi="Arial Nova"/>
               <w:noProof/>
+              <w:sz w:val="22"/>
+              <w:szCs w:val="22"/>
             </w:rPr>
-            <w:id w:val="1113093336"/>
+            <w:alias w:val="#Nav: /Car/Model"/>
+            <w:tag w:val="#Nav: Print_Car_Report/60103"/>
+            <w:id w:val="-1911921851"/>
             <w:placeholder>
               <w:docPart w:val="DefaultPlaceholder_-1854013440"/>
             </w:placeholder>
-            <w15:dataBinding w:prefixMappings="xmlns:ns0='urn:microsoft-dynamics-nav/reports/Print_Car_Report_WORD/60101/' " w:xpath="/ns0:NavWordReportXmlPart[1]/ns0:Car[1]/ns0:Model[1]" w:storeItemID="{1FFF4AFC-9B63-44ED-B52F-9953A9DF8B61}"/>
+            <w:dataBinding w:prefixMappings="xmlns:ns0='urn:microsoft-dynamics-nav/reports/Print_Car_Report/60103/'" w:xpath="/ns0:NavWordReportXmlPart[1]/ns0:Car[1]/ns0:Model[1]" w:storeItemID="{A7843C40-B442-418D-A493-51E9EA54E2A6}"/>
+            <w:text/>
           </w:sdtPr>
           <w:sdtContent>
             <w:tc>
               <w:tcPr>
-                <w:tcW w:w="2835" w:type="dxa"/>
+                <w:tcW w:w="2405" w:type="dxa"/>
               </w:tcPr>
               <w:p>
                 <w:pPr>
                   <w:rPr>
-                    <w:noProof/>
+                    <w:rFonts w:ascii="Arial Nova" w:hAnsi="Arial Nova"/>
+                    <w:noProof/>
+                    <w:sz w:val="22"/>
+                    <w:szCs w:val="22"/>
                   </w:rPr>
                 </w:pPr>
                 <w:r>
                   <w:rPr>
-                    <w:noProof/>
+                    <w:rFonts w:ascii="Arial Nova" w:hAnsi="Arial Nova"/>
+                    <w:noProof/>
+                    <w:sz w:val="22"/>
+                    <w:szCs w:val="22"/>
                   </w:rPr>
                   <w:t>Model</w:t>
                 </w:r>
@@ -370,54 +1148,69 @@
       </w:tr>
       <w:tr>
         <w:trPr>
-          <w:trHeight w:val="510"/>
+          <w:trHeight w:val="289"/>
         </w:trPr>
         <w:tc>
           <w:tcPr>
-            <w:tcW w:w="1800" w:type="dxa"/>
+            <w:tcW w:w="2405" w:type="dxa"/>
           </w:tcPr>
           <w:p>
             <w:pPr>
               <w:rPr>
-                <w:noProof/>
+                <w:rFonts w:ascii="Arial Nova" w:hAnsi="Arial Nova"/>
+                <w:noProof/>
+                <w:sz w:val="22"/>
+                <w:szCs w:val="22"/>
               </w:rPr>
             </w:pPr>
             <w:r>
               <w:rPr>
-                <w:noProof/>
-              </w:rPr>
-              <w:t>BODY TYPE</w:t>
+                <w:rFonts w:ascii="Arial Nova" w:hAnsi="Arial Nova"/>
+                <w:noProof/>
+                <w:sz w:val="22"/>
+                <w:szCs w:val="22"/>
+              </w:rPr>
+              <w:t>Body Type:</w:t>
             </w:r>
           </w:p>
         </w:tc>
         <w:sdt>
           <w:sdtPr>
             <w:rPr>
+              <w:rFonts w:ascii="Arial Nova" w:hAnsi="Arial Nova"/>
               <w:noProof/>
+              <w:sz w:val="22"/>
+              <w:szCs w:val="22"/>
             </w:rPr>
-            <w:id w:val="1190256355"/>
+            <w:alias w:val="#Nav: /Car/BodyType"/>
+            <w:tag w:val="#Nav: Print_Car_Report/60103"/>
+            <w:id w:val="1655185457"/>
             <w:placeholder>
               <w:docPart w:val="DefaultPlaceholder_-1854013440"/>
             </w:placeholder>
             <w:dataBinding w:prefixMappings="xmlns:ns0='urn:microsoft-dynamics-nav/reports/Print_Car_Report/60103/'" w:xpath="/ns0:NavWordReportXmlPart[1]/ns0:Car[1]/ns0:BodyType[1]" w:storeItemID="{A7843C40-B442-418D-A493-51E9EA54E2A6}"/>
             <w:text/>
-            <w:alias w:val="#Nav: /Car/BodyType"/>
-            <w:tag w:val="#Nav: Print_Car_Report/60103"/>
           </w:sdtPr>
           <w:sdtContent>
             <w:tc>
               <w:tcPr>
-                <w:tcW w:w="2835" w:type="dxa"/>
+                <w:tcW w:w="2405" w:type="dxa"/>
               </w:tcPr>
               <w:p>
                 <w:pPr>
                   <w:rPr>
-                    <w:noProof/>
+                    <w:rFonts w:ascii="Arial Nova" w:hAnsi="Arial Nova"/>
+                    <w:noProof/>
+                    <w:sz w:val="22"/>
+                    <w:szCs w:val="22"/>
                   </w:rPr>
                 </w:pPr>
                 <w:r>
                   <w:rPr>
-                    <w:noProof/>
+                    <w:rFonts w:ascii="Arial Nova" w:hAnsi="Arial Nova"/>
+                    <w:noProof/>
+                    <w:sz w:val="22"/>
+                    <w:szCs w:val="22"/>
                   </w:rPr>
                   <w:t>BodyType</w:t>
                 </w:r>
@@ -428,51 +1221,69 @@
       </w:tr>
       <w:tr>
         <w:trPr>
-          <w:trHeight w:val="510"/>
+          <w:trHeight w:val="272"/>
         </w:trPr>
         <w:tc>
           <w:tcPr>
-            <w:tcW w:w="1800" w:type="dxa"/>
+            <w:tcW w:w="2405" w:type="dxa"/>
           </w:tcPr>
           <w:p>
             <w:pPr>
               <w:rPr>
-                <w:noProof/>
+                <w:rFonts w:ascii="Arial Nova" w:hAnsi="Arial Nova"/>
+                <w:noProof/>
+                <w:sz w:val="22"/>
+                <w:szCs w:val="22"/>
               </w:rPr>
             </w:pPr>
             <w:r>
               <w:rPr>
-                <w:noProof/>
-              </w:rPr>
-              <w:t>GEARBOX</w:t>
+                <w:rFonts w:ascii="Arial Nova" w:hAnsi="Arial Nova"/>
+                <w:noProof/>
+                <w:sz w:val="22"/>
+                <w:szCs w:val="22"/>
+              </w:rPr>
+              <w:t>Gearbox:</w:t>
             </w:r>
           </w:p>
         </w:tc>
         <w:sdt>
           <w:sdtPr>
             <w:rPr>
+              <w:rFonts w:ascii="Arial Nova" w:hAnsi="Arial Nova"/>
               <w:noProof/>
+              <w:sz w:val="22"/>
+              <w:szCs w:val="22"/>
             </w:rPr>
-            <w:id w:val="1991357058"/>
+            <w:alias w:val="#Nav: /Car/Gearbox"/>
+            <w:tag w:val="#Nav: Print_Car_Report/60103"/>
+            <w:id w:val="146171570"/>
             <w:placeholder>
               <w:docPart w:val="DefaultPlaceholder_-1854013440"/>
             </w:placeholder>
-            <w15:dataBinding w:prefixMappings="xmlns:ns0='urn:microsoft-dynamics-nav/reports/Print_Car_Report_WORD/60101/' " w:xpath="/ns0:NavWordReportXmlPart[1]/ns0:Car[1]/ns0:Gearbox[1]" w:storeItemID="{1FFF4AFC-9B63-44ED-B52F-9953A9DF8B61}"/>
+            <w:dataBinding w:prefixMappings="xmlns:ns0='urn:microsoft-dynamics-nav/reports/Print_Car_Report/60103/'" w:xpath="/ns0:NavWordReportXmlPart[1]/ns0:Car[1]/ns0:Gearbox[1]" w:storeItemID="{A7843C40-B442-418D-A493-51E9EA54E2A6}"/>
+            <w:text/>
           </w:sdtPr>
           <w:sdtContent>
             <w:tc>
               <w:tcPr>
-                <w:tcW w:w="2835" w:type="dxa"/>
+                <w:tcW w:w="2405" w:type="dxa"/>
               </w:tcPr>
               <w:p>
                 <w:pPr>
                   <w:rPr>
-                    <w:noProof/>
+                    <w:rFonts w:ascii="Arial Nova" w:hAnsi="Arial Nova"/>
+                    <w:noProof/>
+                    <w:sz w:val="22"/>
+                    <w:szCs w:val="22"/>
                   </w:rPr>
                 </w:pPr>
                 <w:r>
                   <w:rPr>
-                    <w:noProof/>
+                    <w:rFonts w:ascii="Arial Nova" w:hAnsi="Arial Nova"/>
+                    <w:noProof/>
+                    <w:sz w:val="22"/>
+                    <w:szCs w:val="22"/>
                   </w:rPr>
                   <w:t>Gearbox</w:t>
                 </w:r>
@@ -483,54 +1294,69 @@
       </w:tr>
       <w:tr>
         <w:trPr>
-          <w:trHeight w:val="600"/>
+          <w:trHeight w:val="272"/>
         </w:trPr>
         <w:tc>
           <w:tcPr>
-            <w:tcW w:w="1800" w:type="dxa"/>
+            <w:tcW w:w="2405" w:type="dxa"/>
           </w:tcPr>
           <w:p>
             <w:pPr>
               <w:rPr>
-                <w:noProof/>
+                <w:rFonts w:ascii="Arial Nova" w:hAnsi="Arial Nova"/>
+                <w:noProof/>
+                <w:sz w:val="22"/>
+                <w:szCs w:val="22"/>
               </w:rPr>
             </w:pPr>
             <w:r>
               <w:rPr>
-                <w:noProof/>
-              </w:rPr>
-              <w:t xml:space="preserve">DRIVE TYPE </w:t>
+                <w:rFonts w:ascii="Arial Nova" w:hAnsi="Arial Nova"/>
+                <w:noProof/>
+                <w:sz w:val="22"/>
+                <w:szCs w:val="22"/>
+              </w:rPr>
+              <w:t>Drive Type:</w:t>
             </w:r>
           </w:p>
         </w:tc>
         <w:sdt>
           <w:sdtPr>
             <w:rPr>
+              <w:rFonts w:ascii="Arial Nova" w:hAnsi="Arial Nova"/>
               <w:noProof/>
+              <w:sz w:val="22"/>
+              <w:szCs w:val="22"/>
             </w:rPr>
-            <w:id w:val="-490411442"/>
+            <w:alias w:val="#Nav: /Car/DriveType"/>
+            <w:tag w:val="#Nav: Print_Car_Report/60103"/>
+            <w:id w:val="-959876570"/>
             <w:placeholder>
               <w:docPart w:val="DefaultPlaceholder_-1854013440"/>
             </w:placeholder>
             <w:dataBinding w:prefixMappings="xmlns:ns0='urn:microsoft-dynamics-nav/reports/Print_Car_Report/60103/'" w:xpath="/ns0:NavWordReportXmlPart[1]/ns0:Car[1]/ns0:DriveType[1]" w:storeItemID="{A7843C40-B442-418D-A493-51E9EA54E2A6}"/>
             <w:text/>
-            <w:alias w:val="#Nav: /Car/DriveType"/>
-            <w:tag w:val="#Nav: Print_Car_Report/60103"/>
           </w:sdtPr>
           <w:sdtContent>
             <w:tc>
               <w:tcPr>
-                <w:tcW w:w="2835" w:type="dxa"/>
+                <w:tcW w:w="2405" w:type="dxa"/>
               </w:tcPr>
               <w:p>
                 <w:pPr>
                   <w:rPr>
-                    <w:noProof/>
+                    <w:rFonts w:ascii="Arial Nova" w:hAnsi="Arial Nova"/>
+                    <w:noProof/>
+                    <w:sz w:val="22"/>
+                    <w:szCs w:val="22"/>
                   </w:rPr>
                 </w:pPr>
                 <w:r>
                   <w:rPr>
-                    <w:noProof/>
+                    <w:rFonts w:ascii="Arial Nova" w:hAnsi="Arial Nova"/>
+                    <w:noProof/>
+                    <w:sz w:val="22"/>
+                    <w:szCs w:val="22"/>
                   </w:rPr>
                   <w:t>DriveType</w:t>
                 </w:r>
@@ -541,53 +1367,71 @@
       </w:tr>
       <w:tr>
         <w:trPr>
-          <w:trHeight w:val="570"/>
+          <w:trHeight w:val="289"/>
         </w:trPr>
         <w:tc>
           <w:tcPr>
-            <w:tcW w:w="1800" w:type="dxa"/>
+            <w:tcW w:w="2405" w:type="dxa"/>
           </w:tcPr>
           <w:p>
             <w:pPr>
               <w:rPr>
-                <w:noProof/>
+                <w:rFonts w:ascii="Arial Nova" w:hAnsi="Arial Nova"/>
+                <w:noProof/>
+                <w:sz w:val="22"/>
+                <w:szCs w:val="22"/>
               </w:rPr>
             </w:pPr>
             <w:r>
               <w:rPr>
-                <w:noProof/>
-              </w:rPr>
-              <w:t>ENGINE POWER</w:t>
+                <w:rFonts w:ascii="Arial Nova" w:hAnsi="Arial Nova"/>
+                <w:noProof/>
+                <w:sz w:val="22"/>
+                <w:szCs w:val="22"/>
+              </w:rPr>
+              <w:t>Fuel Type:</w:t>
             </w:r>
           </w:p>
         </w:tc>
         <w:sdt>
           <w:sdtPr>
             <w:rPr>
+              <w:rFonts w:ascii="Arial Nova" w:hAnsi="Arial Nova"/>
               <w:noProof/>
+              <w:sz w:val="22"/>
+              <w:szCs w:val="22"/>
             </w:rPr>
-            <w:id w:val="2138215402"/>
+            <w:alias w:val="#Nav: /Car/FuelType"/>
+            <w:tag w:val="#Nav: Print_Car_Report/60103"/>
+            <w:id w:val="1759636366"/>
             <w:placeholder>
               <w:docPart w:val="DefaultPlaceholder_-1854013440"/>
             </w:placeholder>
-            <w15:dataBinding w:prefixMappings="xmlns:ns0='urn:microsoft-dynamics-nav/reports/Print_Car_Report_WORD/60101/' " w:xpath="/ns0:NavWordReportXmlPart[1]/ns0:Car[1]/ns0:Engine_Power[1]" w:storeItemID="{1FFF4AFC-9B63-44ED-B52F-9953A9DF8B61}"/>
+            <w:dataBinding w:prefixMappings="xmlns:ns0='urn:microsoft-dynamics-nav/reports/Print_Car_Report/60103/'" w:xpath="/ns0:NavWordReportXmlPart[1]/ns0:Car[1]/ns0:FuelType[1]" w:storeItemID="{A7843C40-B442-418D-A493-51E9EA54E2A6}"/>
+            <w:text/>
           </w:sdtPr>
           <w:sdtContent>
             <w:tc>
               <w:tcPr>
-                <w:tcW w:w="2835" w:type="dxa"/>
+                <w:tcW w:w="2405" w:type="dxa"/>
               </w:tcPr>
               <w:p>
                 <w:pPr>
                   <w:rPr>
-                    <w:noProof/>
+                    <w:rFonts w:ascii="Arial Nova" w:hAnsi="Arial Nova"/>
+                    <w:noProof/>
+                    <w:sz w:val="22"/>
+                    <w:szCs w:val="22"/>
                   </w:rPr>
                 </w:pPr>
                 <w:r>
                   <w:rPr>
-                    <w:noProof/>
-                  </w:rPr>
-                  <w:t>Engine_Power</w:t>
+                    <w:rFonts w:ascii="Arial Nova" w:hAnsi="Arial Nova"/>
+                    <w:noProof/>
+                    <w:sz w:val="22"/>
+                    <w:szCs w:val="22"/>
+                  </w:rPr>
+                  <w:t>FuelType</w:t>
                 </w:r>
               </w:p>
             </w:tc>
@@ -596,54 +1440,142 @@
       </w:tr>
       <w:tr>
         <w:trPr>
-          <w:trHeight w:val="615"/>
+          <w:trHeight w:val="272"/>
         </w:trPr>
         <w:tc>
           <w:tcPr>
-            <w:tcW w:w="1800" w:type="dxa"/>
+            <w:tcW w:w="2405" w:type="dxa"/>
           </w:tcPr>
           <w:p>
             <w:pPr>
               <w:rPr>
-                <w:noProof/>
+                <w:rFonts w:ascii="Arial Nova" w:hAnsi="Arial Nova"/>
+                <w:noProof/>
+                <w:sz w:val="22"/>
+                <w:szCs w:val="22"/>
               </w:rPr>
             </w:pPr>
             <w:r>
               <w:rPr>
-                <w:noProof/>
-              </w:rPr>
-              <w:t>ENGINE SIZE</w:t>
+                <w:rFonts w:ascii="Arial Nova" w:hAnsi="Arial Nova"/>
+                <w:noProof/>
+                <w:sz w:val="22"/>
+                <w:szCs w:val="22"/>
+              </w:rPr>
+              <w:t>Engine Power:</w:t>
             </w:r>
           </w:p>
         </w:tc>
         <w:sdt>
           <w:sdtPr>
             <w:rPr>
+              <w:rFonts w:ascii="Arial Nova" w:hAnsi="Arial Nova"/>
               <w:noProof/>
+              <w:sz w:val="22"/>
+              <w:szCs w:val="22"/>
             </w:rPr>
-            <w:id w:val="-737943969"/>
+            <w:alias w:val="#Nav: /Car/EnginePower"/>
+            <w:tag w:val="#Nav: Print_Car_Report/60103"/>
+            <w:id w:val="2073385904"/>
+            <w:placeholder>
+              <w:docPart w:val="DefaultPlaceholder_-1854013440"/>
+            </w:placeholder>
+            <w:dataBinding w:prefixMappings="xmlns:ns0='urn:microsoft-dynamics-nav/reports/Print_Car_Report/60103/'" w:xpath="/ns0:NavWordReportXmlPart[1]/ns0:Car[1]/ns0:EnginePower[1]" w:storeItemID="{A7843C40-B442-418D-A493-51E9EA54E2A6}"/>
+            <w:text/>
+          </w:sdtPr>
+          <w:sdtContent>
+            <w:tc>
+              <w:tcPr>
+                <w:tcW w:w="2405" w:type="dxa"/>
+              </w:tcPr>
+              <w:p>
+                <w:pPr>
+                  <w:rPr>
+                    <w:rFonts w:ascii="Arial Nova" w:hAnsi="Arial Nova"/>
+                    <w:noProof/>
+                    <w:sz w:val="22"/>
+                    <w:szCs w:val="22"/>
+                  </w:rPr>
+                </w:pPr>
+                <w:r>
+                  <w:rPr>
+                    <w:rFonts w:ascii="Arial Nova" w:hAnsi="Arial Nova"/>
+                    <w:noProof/>
+                    <w:sz w:val="22"/>
+                    <w:szCs w:val="22"/>
+                  </w:rPr>
+                  <w:t>EnginePower</w:t>
+                </w:r>
+              </w:p>
+            </w:tc>
+          </w:sdtContent>
+        </w:sdt>
+      </w:tr>
+      <w:tr>
+        <w:trPr>
+          <w:trHeight w:val="272"/>
+        </w:trPr>
+        <w:tc>
+          <w:tcPr>
+            <w:tcW w:w="2405" w:type="dxa"/>
+          </w:tcPr>
+          <w:p>
+            <w:pPr>
+              <w:rPr>
+                <w:rFonts w:ascii="Arial Nova" w:hAnsi="Arial Nova"/>
+                <w:noProof/>
+                <w:sz w:val="22"/>
+                <w:szCs w:val="22"/>
+              </w:rPr>
+            </w:pPr>
+            <w:r>
+              <w:rPr>
+                <w:rFonts w:ascii="Arial Nova" w:hAnsi="Arial Nova"/>
+                <w:noProof/>
+                <w:sz w:val="22"/>
+                <w:szCs w:val="22"/>
+              </w:rPr>
+              <w:t>Engine Size:</w:t>
+            </w:r>
+          </w:p>
+        </w:tc>
+        <w:sdt>
+          <w:sdtPr>
+            <w:rPr>
+              <w:rFonts w:ascii="Arial Nova" w:hAnsi="Arial Nova"/>
+              <w:noProof/>
+              <w:sz w:val="22"/>
+              <w:szCs w:val="22"/>
+            </w:rPr>
+            <w:alias w:val="#Nav: /Car/EngineSize"/>
+            <w:tag w:val="#Nav: Print_Car_Report/60103"/>
+            <w:id w:val="-1362514742"/>
             <w:placeholder>
               <w:docPart w:val="DefaultPlaceholder_-1854013440"/>
             </w:placeholder>
             <w:dataBinding w:prefixMappings="xmlns:ns0='urn:microsoft-dynamics-nav/reports/Print_Car_Report/60103/'" w:xpath="/ns0:NavWordReportXmlPart[1]/ns0:Car[1]/ns0:EngineSize[1]" w:storeItemID="{A7843C40-B442-418D-A493-51E9EA54E2A6}"/>
             <w:text/>
-            <w:alias w:val="#Nav: /Car/EngineSize"/>
-            <w:tag w:val="#Nav: Print_Car_Report/60103"/>
           </w:sdtPr>
           <w:sdtContent>
             <w:tc>
               <w:tcPr>
-                <w:tcW w:w="2835" w:type="dxa"/>
+                <w:tcW w:w="2405" w:type="dxa"/>
               </w:tcPr>
               <w:p>
                 <w:pPr>
                   <w:rPr>
-                    <w:noProof/>
+                    <w:rFonts w:ascii="Arial Nova" w:hAnsi="Arial Nova"/>
+                    <w:noProof/>
+                    <w:sz w:val="22"/>
+                    <w:szCs w:val="22"/>
                   </w:rPr>
                 </w:pPr>
                 <w:r>
                   <w:rPr>
-                    <w:noProof/>
+                    <w:rFonts w:ascii="Arial Nova" w:hAnsi="Arial Nova"/>
+                    <w:noProof/>
+                    <w:sz w:val="22"/>
+                    <w:szCs w:val="22"/>
                   </w:rPr>
                   <w:t>EngineSize</w:t>
                 </w:r>
@@ -654,51 +1586,69 @@
       </w:tr>
       <w:tr>
         <w:trPr>
-          <w:trHeight w:val="600"/>
+          <w:trHeight w:val="272"/>
         </w:trPr>
         <w:tc>
           <w:tcPr>
-            <w:tcW w:w="1800" w:type="dxa"/>
+            <w:tcW w:w="2405" w:type="dxa"/>
           </w:tcPr>
           <w:p>
             <w:pPr>
               <w:rPr>
-                <w:noProof/>
+                <w:rFonts w:ascii="Arial Nova" w:hAnsi="Arial Nova"/>
+                <w:noProof/>
+                <w:sz w:val="22"/>
+                <w:szCs w:val="22"/>
               </w:rPr>
             </w:pPr>
             <w:r>
               <w:rPr>
-                <w:noProof/>
-              </w:rPr>
-              <w:t>SEATS</w:t>
+                <w:rFonts w:ascii="Arial Nova" w:hAnsi="Arial Nova"/>
+                <w:noProof/>
+                <w:sz w:val="22"/>
+                <w:szCs w:val="22"/>
+              </w:rPr>
+              <w:t>Seats:</w:t>
             </w:r>
           </w:p>
         </w:tc>
         <w:sdt>
           <w:sdtPr>
             <w:rPr>
+              <w:rFonts w:ascii="Arial Nova" w:hAnsi="Arial Nova"/>
               <w:noProof/>
+              <w:sz w:val="22"/>
+              <w:szCs w:val="22"/>
             </w:rPr>
-            <w:id w:val="1760562326"/>
+            <w:alias w:val="#Nav: /Car/Seats"/>
+            <w:tag w:val="#Nav: Print_Car_Report/60103"/>
+            <w:id w:val="1025755962"/>
             <w:placeholder>
               <w:docPart w:val="DefaultPlaceholder_-1854013440"/>
             </w:placeholder>
-            <w15:dataBinding w:prefixMappings="xmlns:ns0='urn:microsoft-dynamics-nav/reports/Print_Car_Report_WORD/60101/' " w:xpath="/ns0:NavWordReportXmlPart[1]/ns0:Car[1]/ns0:Seats[1]" w:storeItemID="{1FFF4AFC-9B63-44ED-B52F-9953A9DF8B61}"/>
+            <w:dataBinding w:prefixMappings="xmlns:ns0='urn:microsoft-dynamics-nav/reports/Print_Car_Report/60103/'" w:xpath="/ns0:NavWordReportXmlPart[1]/ns0:Car[1]/ns0:Seats[1]" w:storeItemID="{A7843C40-B442-418D-A493-51E9EA54E2A6}"/>
+            <w:text/>
           </w:sdtPr>
           <w:sdtContent>
             <w:tc>
               <w:tcPr>
-                <w:tcW w:w="2835" w:type="dxa"/>
+                <w:tcW w:w="2405" w:type="dxa"/>
               </w:tcPr>
               <w:p>
                 <w:pPr>
                   <w:rPr>
-                    <w:noProof/>
+                    <w:rFonts w:ascii="Arial Nova" w:hAnsi="Arial Nova"/>
+                    <w:noProof/>
+                    <w:sz w:val="22"/>
+                    <w:szCs w:val="22"/>
                   </w:rPr>
                 </w:pPr>
                 <w:r>
                   <w:rPr>
-                    <w:noProof/>
+                    <w:rFonts w:ascii="Arial Nova" w:hAnsi="Arial Nova"/>
+                    <w:noProof/>
+                    <w:sz w:val="22"/>
+                    <w:szCs w:val="22"/>
                   </w:rPr>
                   <w:t>Seats</w:t>
                 </w:r>
@@ -709,51 +1659,69 @@
       </w:tr>
       <w:tr>
         <w:trPr>
-          <w:trHeight w:val="600"/>
+          <w:trHeight w:val="272"/>
         </w:trPr>
         <w:tc>
           <w:tcPr>
-            <w:tcW w:w="1800" w:type="dxa"/>
+            <w:tcW w:w="2405" w:type="dxa"/>
           </w:tcPr>
           <w:p>
             <w:pPr>
               <w:rPr>
-                <w:noProof/>
+                <w:rFonts w:ascii="Arial Nova" w:hAnsi="Arial Nova"/>
+                <w:noProof/>
+                <w:sz w:val="22"/>
+                <w:szCs w:val="22"/>
               </w:rPr>
             </w:pPr>
             <w:r>
               <w:rPr>
-                <w:noProof/>
-              </w:rPr>
-              <w:t>YEAR</w:t>
+                <w:rFonts w:ascii="Arial Nova" w:hAnsi="Arial Nova"/>
+                <w:noProof/>
+                <w:sz w:val="22"/>
+                <w:szCs w:val="22"/>
+              </w:rPr>
+              <w:t>Year:</w:t>
             </w:r>
           </w:p>
         </w:tc>
         <w:sdt>
           <w:sdtPr>
             <w:rPr>
+              <w:rFonts w:ascii="Arial Nova" w:hAnsi="Arial Nova"/>
               <w:noProof/>
+              <w:sz w:val="22"/>
+              <w:szCs w:val="22"/>
             </w:rPr>
-            <w:id w:val="65161780"/>
+            <w:alias w:val="#Nav: /Car/Year"/>
+            <w:tag w:val="#Nav: Print_Car_Report/60103"/>
+            <w:id w:val="-414161652"/>
             <w:placeholder>
               <w:docPart w:val="DefaultPlaceholder_-1854013440"/>
             </w:placeholder>
-            <w15:dataBinding w:prefixMappings="xmlns:ns0='urn:microsoft-dynamics-nav/reports/Print_Car_Report_WORD/60101/' " w:xpath="/ns0:NavWordReportXmlPart[1]/ns0:Car[1]/ns0:Year[1]" w:storeItemID="{1FFF4AFC-9B63-44ED-B52F-9953A9DF8B61}"/>
+            <w:dataBinding w:prefixMappings="xmlns:ns0='urn:microsoft-dynamics-nav/reports/Print_Car_Report/60103/'" w:xpath="/ns0:NavWordReportXmlPart[1]/ns0:Car[1]/ns0:Year[1]" w:storeItemID="{A7843C40-B442-418D-A493-51E9EA54E2A6}"/>
+            <w:text/>
           </w:sdtPr>
           <w:sdtContent>
             <w:tc>
               <w:tcPr>
-                <w:tcW w:w="2835" w:type="dxa"/>
+                <w:tcW w:w="2405" w:type="dxa"/>
               </w:tcPr>
               <w:p>
                 <w:pPr>
                   <w:rPr>
-                    <w:noProof/>
+                    <w:rFonts w:ascii="Arial Nova" w:hAnsi="Arial Nova"/>
+                    <w:noProof/>
+                    <w:sz w:val="22"/>
+                    <w:szCs w:val="22"/>
                   </w:rPr>
                 </w:pPr>
                 <w:r>
                   <w:rPr>
-                    <w:noProof/>
+                    <w:rFonts w:ascii="Arial Nova" w:hAnsi="Arial Nova"/>
+                    <w:noProof/>
+                    <w:sz w:val="22"/>
+                    <w:szCs w:val="22"/>
                   </w:rPr>
                   <w:t>Year</w:t>
                 </w:r>
@@ -764,51 +1732,69 @@
       </w:tr>
       <w:tr>
         <w:trPr>
-          <w:trHeight w:val="555"/>
+          <w:trHeight w:val="272"/>
         </w:trPr>
         <w:tc>
           <w:tcPr>
-            <w:tcW w:w="1800" w:type="dxa"/>
+            <w:tcW w:w="2405" w:type="dxa"/>
           </w:tcPr>
           <w:p>
             <w:pPr>
               <w:rPr>
-                <w:noProof/>
+                <w:rFonts w:ascii="Arial Nova" w:hAnsi="Arial Nova"/>
+                <w:noProof/>
+                <w:sz w:val="22"/>
+                <w:szCs w:val="22"/>
               </w:rPr>
             </w:pPr>
             <w:r>
               <w:rPr>
-                <w:noProof/>
-              </w:rPr>
-              <w:t>COLOUR</w:t>
+                <w:rFonts w:ascii="Arial Nova" w:hAnsi="Arial Nova"/>
+                <w:noProof/>
+                <w:sz w:val="22"/>
+                <w:szCs w:val="22"/>
+              </w:rPr>
+              <w:t>Colour:</w:t>
             </w:r>
           </w:p>
         </w:tc>
         <w:sdt>
           <w:sdtPr>
             <w:rPr>
+              <w:rFonts w:ascii="Arial Nova" w:hAnsi="Arial Nova"/>
               <w:noProof/>
+              <w:sz w:val="22"/>
+              <w:szCs w:val="22"/>
             </w:rPr>
-            <w:id w:val="-551311199"/>
+            <w:alias w:val="#Nav: /Car/Colour"/>
+            <w:tag w:val="#Nav: Print_Car_Report/60103"/>
+            <w:id w:val="-1539194122"/>
             <w:placeholder>
               <w:docPart w:val="DefaultPlaceholder_-1854013440"/>
             </w:placeholder>
-            <w15:dataBinding w:prefixMappings="xmlns:ns0='urn:microsoft-dynamics-nav/reports/Print_Car_Report_WORD/60101/' " w:xpath="/ns0:NavWordReportXmlPart[1]/ns0:Car[1]/ns0:Colour[1]" w:storeItemID="{1FFF4AFC-9B63-44ED-B52F-9953A9DF8B61}"/>
+            <w:dataBinding w:prefixMappings="xmlns:ns0='urn:microsoft-dynamics-nav/reports/Print_Car_Report/60103/'" w:xpath="/ns0:NavWordReportXmlPart[1]/ns0:Car[1]/ns0:Colour[1]" w:storeItemID="{A7843C40-B442-418D-A493-51E9EA54E2A6}"/>
+            <w:text/>
           </w:sdtPr>
           <w:sdtContent>
             <w:tc>
               <w:tcPr>
-                <w:tcW w:w="2835" w:type="dxa"/>
+                <w:tcW w:w="2405" w:type="dxa"/>
               </w:tcPr>
               <w:p>
                 <w:pPr>
                   <w:rPr>
-                    <w:noProof/>
+                    <w:rFonts w:ascii="Arial Nova" w:hAnsi="Arial Nova"/>
+                    <w:noProof/>
+                    <w:sz w:val="22"/>
+                    <w:szCs w:val="22"/>
                   </w:rPr>
                 </w:pPr>
                 <w:r>
                   <w:rPr>
-                    <w:noProof/>
+                    <w:rFonts w:ascii="Arial Nova" w:hAnsi="Arial Nova"/>
+                    <w:noProof/>
+                    <w:sz w:val="22"/>
+                    <w:szCs w:val="22"/>
                   </w:rPr>
                   <w:t>Colour</w:t>
                 </w:r>
@@ -819,51 +1805,69 @@
       </w:tr>
       <w:tr>
         <w:trPr>
-          <w:trHeight w:val="540"/>
+          <w:trHeight w:val="272"/>
         </w:trPr>
         <w:tc>
           <w:tcPr>
-            <w:tcW w:w="1800" w:type="dxa"/>
+            <w:tcW w:w="2405" w:type="dxa"/>
           </w:tcPr>
           <w:p>
             <w:pPr>
               <w:rPr>
-                <w:noProof/>
+                <w:rFonts w:ascii="Arial Nova" w:hAnsi="Arial Nova"/>
+                <w:noProof/>
+                <w:sz w:val="22"/>
+                <w:szCs w:val="22"/>
               </w:rPr>
             </w:pPr>
             <w:r>
               <w:rPr>
-                <w:noProof/>
-              </w:rPr>
-              <w:t>MILEAGE</w:t>
+                <w:rFonts w:ascii="Arial Nova" w:hAnsi="Arial Nova"/>
+                <w:noProof/>
+                <w:sz w:val="22"/>
+                <w:szCs w:val="22"/>
+              </w:rPr>
+              <w:t>Mileage:</w:t>
             </w:r>
           </w:p>
         </w:tc>
         <w:sdt>
           <w:sdtPr>
             <w:rPr>
+              <w:rFonts w:ascii="Arial Nova" w:hAnsi="Arial Nova"/>
               <w:noProof/>
+              <w:sz w:val="22"/>
+              <w:szCs w:val="22"/>
             </w:rPr>
-            <w:id w:val="-2060087858"/>
+            <w:alias w:val="#Nav: /Car/Mileage"/>
+            <w:tag w:val="#Nav: Print_Car_Report/60103"/>
+            <w:id w:val="1800639994"/>
             <w:placeholder>
               <w:docPart w:val="DefaultPlaceholder_-1854013440"/>
             </w:placeholder>
-            <w15:dataBinding w:prefixMappings="xmlns:ns0='urn:microsoft-dynamics-nav/reports/Print_Car_Report_WORD/60101/' " w:xpath="/ns0:NavWordReportXmlPart[1]/ns0:Car[1]/ns0:Mileage[1]" w:storeItemID="{1FFF4AFC-9B63-44ED-B52F-9953A9DF8B61}"/>
+            <w:dataBinding w:prefixMappings="xmlns:ns0='urn:microsoft-dynamics-nav/reports/Print_Car_Report/60103/'" w:xpath="/ns0:NavWordReportXmlPart[1]/ns0:Car[1]/ns0:Mileage[1]" w:storeItemID="{A7843C40-B442-418D-A493-51E9EA54E2A6}"/>
+            <w:text/>
           </w:sdtPr>
           <w:sdtContent>
             <w:tc>
               <w:tcPr>
-                <w:tcW w:w="2835" w:type="dxa"/>
+                <w:tcW w:w="2405" w:type="dxa"/>
               </w:tcPr>
               <w:p>
                 <w:pPr>
                   <w:rPr>
-                    <w:noProof/>
+                    <w:rFonts w:ascii="Arial Nova" w:hAnsi="Arial Nova"/>
+                    <w:noProof/>
+                    <w:sz w:val="22"/>
+                    <w:szCs w:val="22"/>
                   </w:rPr>
                 </w:pPr>
                 <w:r>
                   <w:rPr>
-                    <w:noProof/>
+                    <w:rFonts w:ascii="Arial Nova" w:hAnsi="Arial Nova"/>
+                    <w:noProof/>
+                    <w:sz w:val="22"/>
+                    <w:szCs w:val="22"/>
                   </w:rPr>
                   <w:t>Mileage</w:t>
                 </w:r>
@@ -874,28 +1878,34 @@
       </w:tr>
       <w:tr>
         <w:trPr>
-          <w:trHeight w:val="390"/>
+          <w:trHeight w:val="272"/>
         </w:trPr>
         <w:tc>
           <w:tcPr>
-            <w:tcW w:w="1800" w:type="dxa"/>
+            <w:tcW w:w="2405" w:type="dxa"/>
           </w:tcPr>
           <w:p>
             <w:pPr>
               <w:rPr>
-                <w:noProof/>
+                <w:rFonts w:ascii="Arial Nova" w:hAnsi="Arial Nova"/>
+                <w:noProof/>
+                <w:sz w:val="22"/>
+                <w:szCs w:val="22"/>
               </w:rPr>
             </w:pPr>
           </w:p>
         </w:tc>
         <w:tc>
           <w:tcPr>
-            <w:tcW w:w="2835" w:type="dxa"/>
+            <w:tcW w:w="2405" w:type="dxa"/>
           </w:tcPr>
           <w:p>
             <w:pPr>
               <w:rPr>
-                <w:noProof/>
+                <w:rFonts w:ascii="Arial Nova" w:hAnsi="Arial Nova"/>
+                <w:noProof/>
+                <w:sz w:val="22"/>
+                <w:szCs w:val="22"/>
               </w:rPr>
             </w:pPr>
           </w:p>
@@ -903,28 +1913,139 @@
       </w:tr>
       <w:tr>
         <w:trPr>
-          <w:trHeight w:val="405"/>
+          <w:trHeight w:val="272"/>
         </w:trPr>
         <w:tc>
           <w:tcPr>
-            <w:tcW w:w="1800" w:type="dxa"/>
+            <w:tcW w:w="2405" w:type="dxa"/>
           </w:tcPr>
           <w:p>
             <w:pPr>
               <w:rPr>
-                <w:noProof/>
+                <w:rFonts w:ascii="Arial Nova" w:hAnsi="Arial Nova"/>
+                <w:noProof/>
+                <w:sz w:val="22"/>
+                <w:szCs w:val="22"/>
               </w:rPr>
             </w:pPr>
           </w:p>
         </w:tc>
         <w:tc>
           <w:tcPr>
-            <w:tcW w:w="2835" w:type="dxa"/>
+            <w:tcW w:w="2405" w:type="dxa"/>
           </w:tcPr>
           <w:p>
             <w:pPr>
               <w:rPr>
-                <w:noProof/>
+                <w:rFonts w:ascii="Arial Nova" w:hAnsi="Arial Nova"/>
+                <w:noProof/>
+                <w:sz w:val="22"/>
+                <w:szCs w:val="22"/>
+              </w:rPr>
+            </w:pPr>
+          </w:p>
+        </w:tc>
+      </w:tr>
+      <w:tr>
+        <w:trPr>
+          <w:trHeight w:val="272"/>
+        </w:trPr>
+        <w:tc>
+          <w:tcPr>
+            <w:tcW w:w="2405" w:type="dxa"/>
+          </w:tcPr>
+          <w:p>
+            <w:pPr>
+              <w:rPr>
+                <w:rFonts w:ascii="Arial Nova" w:hAnsi="Arial Nova"/>
+                <w:noProof/>
+                <w:sz w:val="22"/>
+                <w:szCs w:val="22"/>
+              </w:rPr>
+            </w:pPr>
+          </w:p>
+        </w:tc>
+        <w:tc>
+          <w:tcPr>
+            <w:tcW w:w="2405" w:type="dxa"/>
+          </w:tcPr>
+          <w:p>
+            <w:pPr>
+              <w:rPr>
+                <w:rFonts w:ascii="Arial Nova" w:hAnsi="Arial Nova"/>
+                <w:noProof/>
+                <w:sz w:val="22"/>
+                <w:szCs w:val="22"/>
+              </w:rPr>
+            </w:pPr>
+          </w:p>
+        </w:tc>
+      </w:tr>
+      <w:tr>
+        <w:trPr>
+          <w:trHeight w:val="272"/>
+        </w:trPr>
+        <w:tc>
+          <w:tcPr>
+            <w:tcW w:w="2405" w:type="dxa"/>
+          </w:tcPr>
+          <w:p>
+            <w:pPr>
+              <w:rPr>
+                <w:rFonts w:ascii="Arial Nova" w:hAnsi="Arial Nova"/>
+                <w:noProof/>
+                <w:sz w:val="22"/>
+                <w:szCs w:val="22"/>
+              </w:rPr>
+            </w:pPr>
+          </w:p>
+        </w:tc>
+        <w:tc>
+          <w:tcPr>
+            <w:tcW w:w="2405" w:type="dxa"/>
+          </w:tcPr>
+          <w:p>
+            <w:pPr>
+              <w:rPr>
+                <w:rFonts w:ascii="Arial Nova" w:hAnsi="Arial Nova"/>
+                <w:noProof/>
+                <w:sz w:val="22"/>
+                <w:szCs w:val="22"/>
+              </w:rPr>
+            </w:pPr>
+          </w:p>
+        </w:tc>
+      </w:tr>
+      <w:tr>
+        <w:trPr>
+          <w:trHeight w:val="272"/>
+        </w:trPr>
+        <w:tc>
+          <w:tcPr>
+            <w:tcW w:w="2405" w:type="dxa"/>
+          </w:tcPr>
+          <w:p>
+            <w:pPr>
+              <w:rPr>
+                <w:rFonts w:ascii="Arial Nova" w:hAnsi="Arial Nova"/>
+                <w:noProof/>
+                <w:sz w:val="22"/>
+                <w:szCs w:val="22"/>
+              </w:rPr>
+            </w:pPr>
+          </w:p>
+        </w:tc>
+        <w:tc>
+          <w:tcPr>
+            <w:tcW w:w="2405" w:type="dxa"/>
+          </w:tcPr>
+          <w:p>
+            <w:pPr>
+              <w:rPr>
+                <w:rFonts w:ascii="Arial Nova" w:hAnsi="Arial Nova"/>
+                <w:noProof/>
+                <w:sz w:val="22"/>
+                <w:szCs w:val="22"/>
               </w:rPr>
             </w:pPr>
           </w:p>
@@ -934,256 +2055,122 @@
     <w:p>
       <w:pPr>
         <w:rPr>
+          <w:rFonts w:ascii="Arial Nova" w:hAnsi="Arial Nova"/>
           <w:noProof/>
-          <w:sz w:val="20"/>
-          <w:szCs w:val="20"/>
+          <w:sz w:val="22"/>
+          <w:szCs w:val="22"/>
         </w:rPr>
       </w:pPr>
       <w:r>
         <w:rPr>
+          <w:rFonts w:ascii="Arial Nova" w:hAnsi="Arial Nova"/>
+          <w:noProof/>
+          <w:sz w:val="22"/>
+          <w:szCs w:val="22"/>
+        </w:rPr>
+        <w:t xml:space="preserve">                                                             </w:t>
+      </w:r>
+    </w:p>
+    <w:p>
+      <w:pPr>
+        <w:rPr>
+          <w:rFonts w:ascii="Arial Nova" w:hAnsi="Arial Nova"/>
           <w:b/>
           <w:bCs/>
           <w:noProof/>
-          <w:sz w:val="20"/>
-          <w:szCs w:val="20"/>
+          <w:sz w:val="22"/>
+          <w:szCs w:val="22"/>
         </w:rPr>
-        <w:t>RENTAL INFORMATION</w:t>
-      </w:r>
+      </w:pPr>
       <w:r>
         <w:rPr>
+          <w:rFonts w:ascii="Arial Nova" w:hAnsi="Arial Nova"/>
           <w:b/>
           <w:bCs/>
           <w:noProof/>
-          <w:sz w:val="20"/>
-          <w:szCs w:val="20"/>
+          <w:sz w:val="22"/>
+          <w:szCs w:val="22"/>
         </w:rPr>
-        <w:tab/>
-      </w:r>
-      <w:r>
-        <w:rPr>
-          <w:noProof/>
-          <w:sz w:val="20"/>
-          <w:szCs w:val="20"/>
-        </w:rPr>
-        <w:tab/>
-      </w:r>
-      <w:r>
-        <w:rPr>
-          <w:noProof/>
-          <w:sz w:val="20"/>
-          <w:szCs w:val="20"/>
-        </w:rPr>
-        <w:tab/>
-      </w:r>
-      <w:r>
-        <w:rPr>
-          <w:noProof/>
-          <w:sz w:val="20"/>
-          <w:szCs w:val="20"/>
-        </w:rPr>
-        <w:tab/>
-      </w:r>
-      <w:r>
-        <w:rPr>
-          <w:noProof/>
-          <w:sz w:val="20"/>
-          <w:szCs w:val="20"/>
-        </w:rPr>
-        <w:tab/>
-      </w:r>
-      <w:r>
-        <w:rPr>
-          <w:noProof/>
-          <w:sz w:val="20"/>
-          <w:szCs w:val="20"/>
-        </w:rPr>
-        <w:tab/>
-      </w:r>
-      <w:r>
-        <w:rPr>
-          <w:b/>
-          <w:bCs/>
-          <w:noProof/>
-          <w:sz w:val="20"/>
-          <w:szCs w:val="20"/>
-        </w:rPr>
-        <w:t>VEHICLE INFORMATION</w:t>
+        <w:t>RENTAL DETAILS:</w:t>
       </w:r>
     </w:p>
     <w:tbl>
       <w:tblPr>
-        <w:tblpPr w:leftFromText="180" w:rightFromText="180" w:vertAnchor="text" w:tblpX="31" w:tblpY="1"/>
+        <w:tblStyle w:val="TableGrid"/>
         <w:tblW w:w="0" w:type="auto"/>
-        <w:tblBorders>
-          <w:top w:val="single" w:color="auto" w:sz="4" w:space="0"/>
-          <w:left w:val="single" w:color="auto" w:sz="4" w:space="0"/>
-          <w:bottom w:val="single" w:color="auto" w:sz="4" w:space="0"/>
-          <w:right w:val="single" w:color="auto" w:sz="4" w:space="0"/>
-          <w:insideH w:val="single" w:color="auto" w:sz="4" w:space="0"/>
-          <w:insideV w:val="single" w:color="auto" w:sz="4" w:space="0"/>
-        </w:tblBorders>
-        <w:tblLook w:val="0000" w:firstRow="0" w:lastRow="0" w:firstColumn="0" w:lastColumn="0" w:noHBand="0" w:noVBand="0"/>
+        <w:tblLook w:val="04A0" w:firstRow="1" w:lastRow="0" w:firstColumn="1" w:lastColumn="0" w:noHBand="0" w:noVBand="1"/>
       </w:tblPr>
       <w:tblGrid>
-        <w:gridCol w:w="2263"/>
-        <w:gridCol w:w="3283"/>
+        <w:gridCol w:w="2864"/>
+        <w:gridCol w:w="2864"/>
       </w:tblGrid>
       <w:tr>
         <w:trPr>
-          <w:trHeight w:val="465"/>
+          <w:trHeight w:val="262"/>
         </w:trPr>
         <w:tc>
           <w:tcPr>
-            <w:tcW w:w="2263" w:type="dxa"/>
+            <w:tcW w:w="2864" w:type="dxa"/>
           </w:tcPr>
           <w:p>
             <w:pPr>
               <w:rPr>
-                <w:noProof/>
-                <w:sz w:val="20"/>
-                <w:szCs w:val="20"/>
+                <w:rFonts w:ascii="Arial Nova" w:hAnsi="Arial Nova"/>
+                <w:noProof/>
+                <w:sz w:val="22"/>
+                <w:szCs w:val="22"/>
               </w:rPr>
             </w:pPr>
             <w:r>
               <w:rPr>
-                <w:noProof/>
-                <w:sz w:val="20"/>
-                <w:szCs w:val="20"/>
-              </w:rPr>
-              <w:t>FULL NAME:</w:t>
-            </w:r>
-          </w:p>
-        </w:tc>
-        <w:tc>
-          <w:tcPr>
-            <w:tcW w:w="3283" w:type="dxa"/>
-          </w:tcPr>
-          <w:p>
-            <w:pPr>
-              <w:rPr>
-                <w:noProof/>
-                <w:sz w:val="20"/>
-                <w:szCs w:val="20"/>
-              </w:rPr>
-            </w:pPr>
-            <w:sdt>
-              <w:sdtPr>
-                <w:rPr>
-                  <w:noProof/>
-                  <w:sz w:val="20"/>
-                  <w:szCs w:val="20"/>
-                </w:rPr>
-                <w:id w:val="-997490318"/>
-                <w:placeholder>
-                  <w:docPart w:val="DefaultPlaceholder_-1854013440"/>
-                </w:placeholder>
-                <w15:dataBinding w:prefixMappings="xmlns:ns0='urn:microsoft-dynamics-nav/reports/Print_Car_Report/60103/' " w:xpath="/ns0:NavWordReportXmlPart[1]/ns0:Driver[1]/ns0:First_Name[1]" w:storeItemID="{A7843C40-B442-418D-A493-51E9EA54E2A6}" w16sdtdh:storeItemChecksum="VoOAmg=="/>
-              </w:sdtPr>
-              <w:sdtContent>
-                <w:r>
-                  <w:rPr>
-                    <w:noProof/>
-                    <w:sz w:val="20"/>
-                    <w:szCs w:val="20"/>
-                  </w:rPr>
-                  <w:t>First_Name</w:t>
-                </w:r>
-              </w:sdtContent>
-            </w:sdt>
-            <w:r>
-              <w:rPr>
-                <w:noProof/>
-                <w:sz w:val="20"/>
-                <w:szCs w:val="20"/>
-              </w:rPr>
-              <w:t xml:space="preserve">      </w:t>
-            </w:r>
-            <w:sdt>
-              <w:sdtPr>
-                <w:rPr>
-                  <w:noProof/>
-                  <w:sz w:val="20"/>
-                  <w:szCs w:val="20"/>
-                </w:rPr>
-                <w:id w:val="2143773669"/>
-                <w:placeholder>
-                  <w:docPart w:val="DefaultPlaceholder_-1854013440"/>
-                </w:placeholder>
-                <w15:dataBinding w:prefixMappings="xmlns:ns0='urn:microsoft-dynamics-nav/reports/Print_Car_Report/60103/' " w:xpath="/ns0:NavWordReportXmlPart[1]/ns0:Driver[1]/ns0:Last_Name[1]" w:storeItemID="{A7843C40-B442-418D-A493-51E9EA54E2A6}" w16sdtdh:storeItemChecksum="VoOAmg=="/>
-              </w:sdtPr>
-              <w:sdtContent>
-                <w:r>
-                  <w:rPr>
-                    <w:noProof/>
-                    <w:sz w:val="20"/>
-                    <w:szCs w:val="20"/>
-                  </w:rPr>
-                  <w:t>Last_Name</w:t>
-                </w:r>
-              </w:sdtContent>
-            </w:sdt>
-          </w:p>
-        </w:tc>
-      </w:tr>
-      <w:tr>
-        <w:trPr>
-          <w:trHeight w:val="555"/>
-        </w:trPr>
-        <w:tc>
-          <w:tcPr>
-            <w:tcW w:w="2263" w:type="dxa"/>
-          </w:tcPr>
-          <w:p>
-            <w:pPr>
-              <w:rPr>
-                <w:noProof/>
-                <w:sz w:val="20"/>
-                <w:szCs w:val="20"/>
-              </w:rPr>
-            </w:pPr>
-            <w:r>
-              <w:rPr>
-                <w:noProof/>
-                <w:sz w:val="20"/>
-                <w:szCs w:val="20"/>
-              </w:rPr>
-              <w:t>DRIVING LICENSE NO.:</w:t>
+                <w:rFonts w:ascii="Arial Nova" w:hAnsi="Arial Nova"/>
+                <w:noProof/>
+                <w:sz w:val="22"/>
+                <w:szCs w:val="22"/>
+              </w:rPr>
+              <w:t>Price Per Day:</w:t>
             </w:r>
           </w:p>
         </w:tc>
         <w:sdt>
           <w:sdtPr>
             <w:rPr>
+              <w:rFonts w:ascii="Arial Nova" w:hAnsi="Arial Nova"/>
               <w:noProof/>
-              <w:sz w:val="20"/>
-              <w:szCs w:val="20"/>
+              <w:sz w:val="22"/>
+              <w:szCs w:val="22"/>
             </w:rPr>
-            <w:id w:val="-2119286363"/>
+            <w:alias w:val="#Nav: /Car/PriceperDay"/>
+            <w:tag w:val="#Nav: Print_Car_Report/60103"/>
+            <w:id w:val="-1335140039"/>
             <w:placeholder>
               <w:docPart w:val="DefaultPlaceholder_-1854013440"/>
             </w:placeholder>
-            <w15:dataBinding w:prefixMappings="xmlns:ns0='urn:microsoft-dynamics-nav/reports/Print_Car_Report/60103/' " w:xpath="/ns0:NavWordReportXmlPart[1]/ns0:Driver[1]/ns0:Driving_License_No_[1]" w:storeItemID="{A7843C40-B442-418D-A493-51E9EA54E2A6}" w16sdtdh:storeItemChecksum="VoOAmg=="/>
+            <w:dataBinding w:prefixMappings="xmlns:ns0='urn:microsoft-dynamics-nav/reports/Print_Car_Report/60103/'" w:xpath="/ns0:NavWordReportXmlPart[1]/ns0:Car[1]/ns0:PriceperDay[1]" w:storeItemID="{A7843C40-B442-418D-A493-51E9EA54E2A6}"/>
+            <w:text/>
           </w:sdtPr>
           <w:sdtContent>
             <w:tc>
               <w:tcPr>
-                <w:tcW w:w="3283" w:type="dxa"/>
+                <w:tcW w:w="2864" w:type="dxa"/>
               </w:tcPr>
               <w:p>
                 <w:pPr>
                   <w:rPr>
-                    <w:noProof/>
-                    <w:sz w:val="20"/>
-                    <w:szCs w:val="20"/>
+                    <w:rFonts w:ascii="Arial Nova" w:hAnsi="Arial Nova"/>
+                    <w:noProof/>
+                    <w:sz w:val="22"/>
+                    <w:szCs w:val="22"/>
                   </w:rPr>
                 </w:pPr>
                 <w:r>
                   <w:rPr>
-                    <w:noProof/>
-                    <w:sz w:val="20"/>
-                    <w:szCs w:val="20"/>
-                  </w:rPr>
-                  <w:t>Driving_License_No_</w:t>
+                    <w:rFonts w:ascii="Arial Nova" w:hAnsi="Arial Nova"/>
+                    <w:noProof/>
+                    <w:sz w:val="22"/>
+                    <w:szCs w:val="22"/>
+                  </w:rPr>
+                  <w:t>PriceperDay</w:t>
                 </w:r>
               </w:p>
             </w:tc>
@@ -1192,66 +2179,71 @@
       </w:tr>
       <w:tr>
         <w:trPr>
-          <w:trHeight w:val="510"/>
+          <w:trHeight w:val="277"/>
         </w:trPr>
         <w:tc>
           <w:tcPr>
-            <w:tcW w:w="2263" w:type="dxa"/>
+            <w:tcW w:w="2864" w:type="dxa"/>
           </w:tcPr>
           <w:p>
             <w:pPr>
               <w:rPr>
-                <w:noProof/>
-                <w:sz w:val="20"/>
-                <w:szCs w:val="20"/>
+                <w:rFonts w:ascii="Arial Nova" w:hAnsi="Arial Nova"/>
+                <w:noProof/>
+                <w:sz w:val="22"/>
+                <w:szCs w:val="22"/>
               </w:rPr>
             </w:pPr>
             <w:r>
               <w:rPr>
-                <w:noProof/>
-                <w:sz w:val="20"/>
-                <w:szCs w:val="20"/>
-              </w:rPr>
-              <w:t>TELEPHONE NO.:</w:t>
+                <w:rFonts w:ascii="Arial Nova" w:hAnsi="Arial Nova"/>
+                <w:noProof/>
+                <w:sz w:val="22"/>
+                <w:szCs w:val="22"/>
+              </w:rPr>
+              <w:t>Currency:</w:t>
             </w:r>
           </w:p>
         </w:tc>
         <w:sdt>
           <w:sdtPr>
             <w:rPr>
+              <w:rFonts w:ascii="Arial Nova" w:hAnsi="Arial Nova"/>
               <w:noProof/>
-              <w:sz w:val="20"/>
-              <w:szCs w:val="20"/>
+              <w:sz w:val="22"/>
+              <w:szCs w:val="22"/>
             </w:rPr>
-            <w:id w:val="-1779256934"/>
+            <w:alias w:val="#Nav: /Car/Currency"/>
+            <w:tag w:val="#Nav: Print_Car_Report/60103"/>
+            <w:id w:val="1393999556"/>
             <w:placeholder>
               <w:docPart w:val="DefaultPlaceholder_-1854013440"/>
             </w:placeholder>
-            <w:dataBinding w:prefixMappings="xmlns:ns0='urn:microsoft-dynamics-nav/reports/Print_Car_Report/60103/'" w:xpath="/ns0:NavWordReportXmlPart[1]/ns0:Driver[1]/ns0:UK_Mobile_Phone_No_[1]" w:storeItemID="{A7843C40-B442-418D-A493-51E9EA54E2A6}"/>
+            <w:dataBinding w:prefixMappings="xmlns:ns0='urn:microsoft-dynamics-nav/reports/Print_Car_Report/60103/'" w:xpath="/ns0:NavWordReportXmlPart[1]/ns0:Car[1]/ns0:Currency[1]" w:storeItemID="{A7843C40-B442-418D-A493-51E9EA54E2A6}"/>
             <w:text/>
-            <w:alias w:val="#Nav: /Driver/UK_Mobile_Phone_No_"/>
-            <w:tag w:val="#Nav: Print_Car_Report/60103"/>
           </w:sdtPr>
           <w:sdtContent>
             <w:tc>
               <w:tcPr>
-                <w:tcW w:w="3283" w:type="dxa"/>
+                <w:tcW w:w="2864" w:type="dxa"/>
               </w:tcPr>
               <w:p>
                 <w:pPr>
                   <w:rPr>
-                    <w:noProof/>
-                    <w:sz w:val="20"/>
-                    <w:szCs w:val="20"/>
+                    <w:rFonts w:ascii="Arial Nova" w:hAnsi="Arial Nova"/>
+                    <w:noProof/>
+                    <w:sz w:val="22"/>
+                    <w:szCs w:val="22"/>
                   </w:rPr>
                 </w:pPr>
                 <w:r>
                   <w:rPr>
-                    <w:noProof/>
-                    <w:sz w:val="20"/>
-                    <w:szCs w:val="20"/>
-                  </w:rPr>
-                  <w:t>UK_Mobile_Phone_No_</w:t>
+                    <w:rFonts w:ascii="Arial Nova" w:hAnsi="Arial Nova"/>
+                    <w:noProof/>
+                    <w:sz w:val="22"/>
+                    <w:szCs w:val="22"/>
+                  </w:rPr>
+                  <w:t>Currency</w:t>
                 </w:r>
               </w:p>
             </w:tc>
@@ -1260,63 +2252,71 @@
       </w:tr>
       <w:tr>
         <w:trPr>
-          <w:trHeight w:val="540"/>
+          <w:trHeight w:val="262"/>
         </w:trPr>
         <w:tc>
           <w:tcPr>
-            <w:tcW w:w="2263" w:type="dxa"/>
+            <w:tcW w:w="2864" w:type="dxa"/>
           </w:tcPr>
           <w:p>
             <w:pPr>
               <w:rPr>
-                <w:noProof/>
-                <w:sz w:val="20"/>
-                <w:szCs w:val="20"/>
+                <w:rFonts w:ascii="Arial Nova" w:hAnsi="Arial Nova"/>
+                <w:noProof/>
+                <w:sz w:val="22"/>
+                <w:szCs w:val="22"/>
               </w:rPr>
             </w:pPr>
             <w:r>
               <w:rPr>
-                <w:noProof/>
-                <w:sz w:val="20"/>
-                <w:szCs w:val="20"/>
-              </w:rPr>
-              <w:t>ADDRESS:</w:t>
+                <w:rFonts w:ascii="Arial Nova" w:hAnsi="Arial Nova"/>
+                <w:noProof/>
+                <w:sz w:val="22"/>
+                <w:szCs w:val="22"/>
+              </w:rPr>
+              <w:t>Insurance Policy:</w:t>
             </w:r>
           </w:p>
         </w:tc>
         <w:sdt>
           <w:sdtPr>
             <w:rPr>
+              <w:rFonts w:ascii="Arial Nova" w:hAnsi="Arial Nova"/>
               <w:noProof/>
-              <w:sz w:val="20"/>
-              <w:szCs w:val="20"/>
+              <w:sz w:val="22"/>
+              <w:szCs w:val="22"/>
             </w:rPr>
-            <w:id w:val="1321928194"/>
+            <w:alias w:val="#Nav: /Driver/Insurance"/>
+            <w:tag w:val="#Nav: Print_Car_Report/60103"/>
+            <w:id w:val="-1585215253"/>
             <w:placeholder>
               <w:docPart w:val="DefaultPlaceholder_-1854013440"/>
             </w:placeholder>
-            <w15:dataBinding w:prefixMappings="xmlns:ns0='urn:microsoft-dynamics-nav/reports/Print_Car_Report/60103/' " w:xpath="/ns0:NavWordReportXmlPart[1]/ns0:Driver[1]/ns0:Address[1]" w:storeItemID="{A7843C40-B442-418D-A493-51E9EA54E2A6}" w16sdtdh:storeItemChecksum="VoOAmg=="/>
+            <w:dataBinding w:prefixMappings="xmlns:ns0='urn:microsoft-dynamics-nav/reports/Print_Car_Report/60103/'" w:xpath="/ns0:NavWordReportXmlPart[1]/ns0:Driver[1]/ns0:Insurance[1]" w:storeItemID="{A7843C40-B442-418D-A493-51E9EA54E2A6}"/>
+            <w:text/>
           </w:sdtPr>
           <w:sdtContent>
             <w:tc>
               <w:tcPr>
-                <w:tcW w:w="3283" w:type="dxa"/>
+                <w:tcW w:w="2864" w:type="dxa"/>
               </w:tcPr>
               <w:p>
                 <w:pPr>
                   <w:rPr>
-                    <w:noProof/>
-                    <w:sz w:val="20"/>
-                    <w:szCs w:val="20"/>
+                    <w:rFonts w:ascii="Arial Nova" w:hAnsi="Arial Nova"/>
+                    <w:noProof/>
+                    <w:sz w:val="22"/>
+                    <w:szCs w:val="22"/>
                   </w:rPr>
                 </w:pPr>
                 <w:r>
                   <w:rPr>
-                    <w:noProof/>
-                    <w:sz w:val="20"/>
-                    <w:szCs w:val="20"/>
-                  </w:rPr>
-                  <w:t>Address</w:t>
+                    <w:rFonts w:ascii="Arial Nova" w:hAnsi="Arial Nova"/>
+                    <w:noProof/>
+                    <w:sz w:val="22"/>
+                    <w:szCs w:val="22"/>
+                  </w:rPr>
+                  <w:t>Insurance</w:t>
                 </w:r>
               </w:p>
             </w:tc>
@@ -1325,66 +2325,290 @@
       </w:tr>
       <w:tr>
         <w:trPr>
-          <w:trHeight w:val="480"/>
+          <w:trHeight w:val="277"/>
         </w:trPr>
         <w:tc>
           <w:tcPr>
-            <w:tcW w:w="2263" w:type="dxa"/>
+            <w:tcW w:w="2864" w:type="dxa"/>
           </w:tcPr>
           <w:p>
             <w:pPr>
               <w:rPr>
-                <w:noProof/>
-                <w:sz w:val="20"/>
-                <w:szCs w:val="20"/>
+                <w:rFonts w:ascii="Arial Nova" w:hAnsi="Arial Nova"/>
+                <w:noProof/>
+                <w:sz w:val="22"/>
+                <w:szCs w:val="22"/>
               </w:rPr>
             </w:pPr>
             <w:r>
               <w:rPr>
-                <w:noProof/>
-                <w:sz w:val="20"/>
-                <w:szCs w:val="20"/>
-              </w:rPr>
-              <w:t>POST CODE:</w:t>
+                <w:rFonts w:ascii="Arial Nova" w:hAnsi="Arial Nova"/>
+                <w:noProof/>
+                <w:sz w:val="22"/>
+                <w:szCs w:val="22"/>
+              </w:rPr>
+              <w:t>Car Type:</w:t>
             </w:r>
           </w:p>
         </w:tc>
         <w:sdt>
           <w:sdtPr>
             <w:rPr>
+              <w:rFonts w:ascii="Arial Nova" w:hAnsi="Arial Nova"/>
               <w:noProof/>
-              <w:sz w:val="20"/>
-              <w:szCs w:val="20"/>
+              <w:sz w:val="22"/>
+              <w:szCs w:val="22"/>
             </w:rPr>
-            <w:id w:val="-782499855"/>
+            <w:alias w:val="#Nav: /Driver/Required_Car_Type"/>
+            <w:tag w:val="#Nav: Print_Car_Report/60103"/>
+            <w:id w:val="-1737779924"/>
             <w:placeholder>
               <w:docPart w:val="DefaultPlaceholder_-1854013440"/>
             </w:placeholder>
-            <w:dataBinding w:prefixMappings="xmlns:ns0='urn:microsoft-dynamics-nav/reports/Print_Car_Report/60103/'" w:xpath="/ns0:NavWordReportXmlPart[1]/ns0:Driver[1]/ns0:Post_Code[1]" w:storeItemID="{A7843C40-B442-418D-A493-51E9EA54E2A6}"/>
+            <w:dataBinding w:prefixMappings="xmlns:ns0='urn:microsoft-dynamics-nav/reports/Print_Car_Report/60103/'" w:xpath="/ns0:NavWordReportXmlPart[1]/ns0:Driver[1]/ns0:Required_Car_Type[1]" w:storeItemID="{A7843C40-B442-418D-A493-51E9EA54E2A6}"/>
             <w:text/>
-            <w:alias w:val="#Nav: /Driver/Post_Code"/>
+          </w:sdtPr>
+          <w:sdtContent>
+            <w:tc>
+              <w:tcPr>
+                <w:tcW w:w="2864" w:type="dxa"/>
+              </w:tcPr>
+              <w:p>
+                <w:pPr>
+                  <w:rPr>
+                    <w:rFonts w:ascii="Arial Nova" w:hAnsi="Arial Nova"/>
+                    <w:noProof/>
+                    <w:sz w:val="22"/>
+                    <w:szCs w:val="22"/>
+                  </w:rPr>
+                </w:pPr>
+                <w:r>
+                  <w:rPr>
+                    <w:rFonts w:ascii="Arial Nova" w:hAnsi="Arial Nova"/>
+                    <w:noProof/>
+                    <w:sz w:val="22"/>
+                    <w:szCs w:val="22"/>
+                  </w:rPr>
+                  <w:t>Required_Car_Type</w:t>
+                </w:r>
+              </w:p>
+            </w:tc>
+          </w:sdtContent>
+        </w:sdt>
+      </w:tr>
+      <w:tr>
+        <w:trPr>
+          <w:trHeight w:val="262"/>
+        </w:trPr>
+        <w:tc>
+          <w:tcPr>
+            <w:tcW w:w="2864" w:type="dxa"/>
+          </w:tcPr>
+          <w:p>
+            <w:pPr>
+              <w:rPr>
+                <w:rFonts w:ascii="Arial Nova" w:hAnsi="Arial Nova"/>
+                <w:noProof/>
+                <w:sz w:val="22"/>
+                <w:szCs w:val="22"/>
+              </w:rPr>
+            </w:pPr>
+            <w:r>
+              <w:rPr>
+                <w:rFonts w:ascii="Arial Nova" w:hAnsi="Arial Nova"/>
+                <w:noProof/>
+                <w:sz w:val="22"/>
+                <w:szCs w:val="22"/>
+              </w:rPr>
+              <w:t>Vehicle Location:</w:t>
+            </w:r>
+          </w:p>
+        </w:tc>
+        <w:sdt>
+          <w:sdtPr>
+            <w:rPr>
+              <w:rFonts w:ascii="Arial Nova" w:hAnsi="Arial Nova"/>
+              <w:noProof/>
+              <w:sz w:val="22"/>
+              <w:szCs w:val="22"/>
+            </w:rPr>
+            <w:alias w:val="#Nav: /Driver/Job_Site"/>
+            <w:tag w:val="#Nav: Print_Car_Report/60103"/>
+            <w:id w:val="722344022"/>
+            <w:placeholder>
+              <w:docPart w:val="DefaultPlaceholder_-1854013440"/>
+            </w:placeholder>
+            <w:dataBinding w:prefixMappings="xmlns:ns0='urn:microsoft-dynamics-nav/reports/Print_Car_Report/60103/'" w:xpath="/ns0:NavWordReportXmlPart[1]/ns0:Driver[1]/ns0:Job_Site[1]" w:storeItemID="{A7843C40-B442-418D-A493-51E9EA54E2A6}"/>
+            <w:text/>
+          </w:sdtPr>
+          <w:sdtContent>
+            <w:tc>
+              <w:tcPr>
+                <w:tcW w:w="2864" w:type="dxa"/>
+              </w:tcPr>
+              <w:p>
+                <w:pPr>
+                  <w:rPr>
+                    <w:rFonts w:ascii="Arial Nova" w:hAnsi="Arial Nova"/>
+                    <w:noProof/>
+                    <w:sz w:val="22"/>
+                    <w:szCs w:val="22"/>
+                  </w:rPr>
+                </w:pPr>
+                <w:r>
+                  <w:rPr>
+                    <w:rFonts w:ascii="Arial Nova" w:hAnsi="Arial Nova"/>
+                    <w:noProof/>
+                    <w:sz w:val="22"/>
+                    <w:szCs w:val="22"/>
+                  </w:rPr>
+                  <w:t>Job_Site</w:t>
+                </w:r>
+              </w:p>
+            </w:tc>
+          </w:sdtContent>
+        </w:sdt>
+      </w:tr>
+      <w:tr>
+        <w:trPr>
+          <w:trHeight w:val="262"/>
+        </w:trPr>
+        <w:tc>
+          <w:tcPr>
+            <w:tcW w:w="2864" w:type="dxa"/>
+          </w:tcPr>
+          <w:p>
+            <w:pPr>
+              <w:rPr>
+                <w:rFonts w:ascii="Arial Nova" w:hAnsi="Arial Nova"/>
+                <w:noProof/>
+                <w:sz w:val="22"/>
+                <w:szCs w:val="22"/>
+              </w:rPr>
+            </w:pPr>
+            <w:r>
+              <w:rPr>
+                <w:rFonts w:ascii="Arial Nova" w:hAnsi="Arial Nova"/>
+                <w:noProof/>
+                <w:sz w:val="22"/>
+                <w:szCs w:val="22"/>
+              </w:rPr>
+              <w:t>Start Mileage:</w:t>
+            </w:r>
+          </w:p>
+        </w:tc>
+        <w:sdt>
+          <w:sdtPr>
+            <w:rPr>
+              <w:rFonts w:ascii="Arial Nova" w:hAnsi="Arial Nova"/>
+              <w:noProof/>
+              <w:sz w:val="22"/>
+              <w:szCs w:val="22"/>
+            </w:rPr>
+            <w:id w:val="-1953933177"/>
+            <w:placeholder>
+              <w:docPart w:val="DefaultPlaceholder_-1854013440"/>
+            </w:placeholder>
+            <w:dataBinding w:prefixMappings="xmlns:ns0='urn:microsoft-dynamics-nav/reports/Print_Car_Report/60103/'" w:xpath="/ns0:NavWordReportXmlPart[1]/ns0:Car_Mileage[1]/ns0:End_Mileage[1]" w:storeItemID="{A7843C40-B442-418D-A493-51E9EA54E2A6}"/>
+            <w:text/>
+            <w:alias w:val="#Nav: /Car_Mileage/End_Mileage"/>
             <w:tag w:val="#Nav: Print_Car_Report/60103"/>
           </w:sdtPr>
           <w:sdtContent>
             <w:tc>
               <w:tcPr>
-                <w:tcW w:w="3283" w:type="dxa"/>
+                <w:tcW w:w="2864" w:type="dxa"/>
               </w:tcPr>
               <w:p>
                 <w:pPr>
                   <w:rPr>
-                    <w:noProof/>
-                    <w:sz w:val="20"/>
-                    <w:szCs w:val="20"/>
+                    <w:rFonts w:ascii="Arial Nova" w:hAnsi="Arial Nova"/>
+                    <w:noProof/>
+                    <w:sz w:val="22"/>
+                    <w:szCs w:val="22"/>
                   </w:rPr>
                 </w:pPr>
                 <w:r>
                   <w:rPr>
-                    <w:noProof/>
-                    <w:sz w:val="20"/>
-                    <w:szCs w:val="20"/>
-                  </w:rPr>
-                  <w:t>Post_Code</w:t>
+                    <w:rFonts w:ascii="Arial Nova" w:hAnsi="Arial Nova"/>
+                    <w:noProof/>
+                    <w:sz w:val="22"/>
+                    <w:szCs w:val="22"/>
+                  </w:rPr>
+                  <w:t>End_Mileage</w:t>
+                </w:r>
+              </w:p>
+            </w:tc>
+          </w:sdtContent>
+        </w:sdt>
+      </w:tr>
+      <w:tr>
+        <w:trPr>
+          <w:trHeight w:val="262"/>
+        </w:trPr>
+        <w:tc>
+          <w:tcPr>
+            <w:tcW w:w="2864" w:type="dxa"/>
+          </w:tcPr>
+          <w:p>
+            <w:pPr>
+              <w:rPr>
+                <w:rFonts w:ascii="Arial Nova" w:hAnsi="Arial Nova"/>
+                <w:noProof/>
+                <w:sz w:val="22"/>
+                <w:szCs w:val="22"/>
+              </w:rPr>
+            </w:pPr>
+            <w:r>
+              <w:rPr>
+                <w:rFonts w:ascii="Arial Nova" w:hAnsi="Arial Nova"/>
+                <w:noProof/>
+                <w:sz w:val="22"/>
+                <w:szCs w:val="22"/>
+              </w:rPr>
+              <w:t>Renting Start Day:</w:t>
+            </w:r>
+          </w:p>
+        </w:tc>
+        <w:sdt>
+          <w:sdtPr>
+            <w:rPr>
+              <w:rFonts w:ascii="Arial Nova" w:hAnsi="Arial Nova"/>
+              <w:noProof/>
+              <w:sz w:val="22"/>
+              <w:szCs w:val="22"/>
+            </w:rPr>
+            <w:alias w:val="#Nav: /Rental_History/Rented_Date"/>
+            <w:tag w:val="#Nav: Print_Car_Report/60103"/>
+            <w:id w:val="-1116750680"/>
+            <w:placeholder>
+              <w:docPart w:val="DefaultPlaceholder_-1854013440"/>
+            </w:placeholder>
+            <w:dataBinding w:prefixMappings="xmlns:ns0='urn:microsoft-dynamics-nav/reports/Print_Car_Report/60103/'" w:xpath="/ns0:NavWordReportXmlPart[1]/ns0:Rental_History[1]/ns0:Rented_Date[1]" w:storeItemID="{A7843C40-B442-418D-A493-51E9EA54E2A6}"/>
+            <w:text/>
+          </w:sdtPr>
+          <w:sdtContent>
+            <w:tc>
+              <w:tcPr>
+                <w:tcW w:w="2864" w:type="dxa"/>
+              </w:tcPr>
+              <w:p>
+                <w:pPr>
+                  <w:rPr>
+                    <w:rFonts w:ascii="Arial Nova" w:hAnsi="Arial Nova"/>
+                    <w:noProof/>
+                    <w:sz w:val="22"/>
+                    <w:szCs w:val="22"/>
+                  </w:rPr>
+                </w:pPr>
+                <w:r>
+                  <w:rPr>
+                    <w:rFonts w:ascii="Arial Nova" w:hAnsi="Arial Nova"/>
+                    <w:noProof/>
+                    <w:sz w:val="22"/>
+                    <w:szCs w:val="22"/>
+                  </w:rPr>
+                  <w:t>Rented_Date</w:t>
                 </w:r>
               </w:p>
             </w:tc>
@@ -1395,357 +2619,75 @@
     <w:p>
       <w:pPr>
         <w:rPr>
+          <w:rFonts w:ascii="Arial Nova" w:hAnsi="Arial Nova"/>
           <w:noProof/>
-          <w:sz w:val="20"/>
-          <w:szCs w:val="20"/>
+          <w:sz w:val="22"/>
+          <w:szCs w:val="22"/>
         </w:rPr>
       </w:pPr>
     </w:p>
     <w:p>
       <w:pPr>
         <w:rPr>
+          <w:rFonts w:ascii="Arial Nova" w:hAnsi="Arial Nova"/>
           <w:b/>
           <w:bCs/>
           <w:noProof/>
-          <w:sz w:val="20"/>
-          <w:szCs w:val="20"/>
+          <w:sz w:val="22"/>
+          <w:szCs w:val="22"/>
         </w:rPr>
       </w:pPr>
       <w:r>
         <w:rPr>
+          <w:rFonts w:ascii="Arial Nova" w:hAnsi="Arial Nova"/>
           <w:b/>
           <w:bCs/>
           <w:noProof/>
-          <w:sz w:val="20"/>
-          <w:szCs w:val="20"/>
+          <w:sz w:val="22"/>
+          <w:szCs w:val="22"/>
         </w:rPr>
-        <w:t>RENTAL CHARGE</w:t>
+        <w:t>REMARK / OTHER INFORMATION</w:t>
       </w:r>
     </w:p>
     <w:tbl>
       <w:tblPr>
-        <w:tblpPr w:leftFromText="180" w:rightFromText="180" w:vertAnchor="text" w:tblpX="76" w:tblpY="121"/>
-        <w:tblW w:w="0" w:type="auto"/>
-        <w:tblBorders>
-          <w:top w:val="single" w:color="auto" w:sz="4" w:space="0"/>
-          <w:left w:val="single" w:color="auto" w:sz="4" w:space="0"/>
-          <w:bottom w:val="single" w:color="auto" w:sz="4" w:space="0"/>
-          <w:right w:val="single" w:color="auto" w:sz="4" w:space="0"/>
-          <w:insideH w:val="single" w:color="auto" w:sz="4" w:space="0"/>
-          <w:insideV w:val="single" w:color="auto" w:sz="4" w:space="0"/>
-        </w:tblBorders>
-        <w:tblLook w:val="0000" w:firstRow="0" w:lastRow="0" w:firstColumn="0" w:lastColumn="0" w:noHBand="0" w:noVBand="0"/>
+        <w:tblStyle w:val="TableGrid"/>
+        <w:tblW w:w="11006" w:type="dxa"/>
+        <w:tblLook w:val="04A0" w:firstRow="1" w:lastRow="0" w:firstColumn="1" w:lastColumn="0" w:noHBand="0" w:noVBand="1"/>
       </w:tblPr>
       <w:tblGrid>
-        <w:gridCol w:w="1800"/>
-        <w:gridCol w:w="3675"/>
+        <w:gridCol w:w="5303"/>
+        <w:gridCol w:w="5703"/>
       </w:tblGrid>
       <w:tr>
         <w:trPr>
-          <w:trHeight w:val="570"/>
+          <w:trHeight w:val="1873"/>
         </w:trPr>
         <w:tc>
           <w:tcPr>
-            <w:tcW w:w="1800" w:type="dxa"/>
+            <w:tcW w:w="5303" w:type="dxa"/>
           </w:tcPr>
           <w:p>
             <w:pPr>
               <w:rPr>
-                <w:noProof/>
-                <w:sz w:val="20"/>
-                <w:szCs w:val="20"/>
+                <w:rFonts w:ascii="Arial Nova" w:hAnsi="Arial Nova"/>
+                <w:noProof/>
+                <w:sz w:val="22"/>
+                <w:szCs w:val="22"/>
               </w:rPr>
             </w:pPr>
             <w:r>
               <w:rPr>
-                <w:noProof/>
-                <w:sz w:val="20"/>
-                <w:szCs w:val="20"/>
-              </w:rPr>
-              <w:t>CURRENCY</w:t>
-            </w:r>
-          </w:p>
-        </w:tc>
-        <w:tc>
-          <w:tcPr>
-            <w:tcW w:w="3675" w:type="dxa"/>
-          </w:tcPr>
-          <w:p>
-            <w:pPr>
-              <w:rPr>
-                <w:noProof/>
-                <w:sz w:val="20"/>
-                <w:szCs w:val="20"/>
-              </w:rPr>
-            </w:pPr>
-          </w:p>
-        </w:tc>
-      </w:tr>
-      <w:tr>
-        <w:trPr>
-          <w:trHeight w:val="465"/>
-        </w:trPr>
-        <w:tc>
-          <w:tcPr>
-            <w:tcW w:w="1800" w:type="dxa"/>
-          </w:tcPr>
-          <w:p>
-            <w:pPr>
-              <w:rPr>
-                <w:noProof/>
-                <w:sz w:val="20"/>
-                <w:szCs w:val="20"/>
-              </w:rPr>
-            </w:pPr>
-            <w:r>
-              <w:rPr>
-                <w:noProof/>
-                <w:sz w:val="20"/>
-                <w:szCs w:val="20"/>
-              </w:rPr>
-              <w:t>PER DAY</w:t>
-            </w:r>
-          </w:p>
-        </w:tc>
-        <w:sdt>
-          <w:sdtPr>
-            <w:rPr>
-              <w:noProof/>
-              <w:sz w:val="20"/>
-              <w:szCs w:val="20"/>
-            </w:rPr>
-            <w:id w:val="-1490096435"/>
-            <w:placeholder>
-              <w:docPart w:val="DefaultPlaceholder_-1854013440"/>
-            </w:placeholder>
-            <w15:dataBinding w:prefixMappings="xmlns:ns0='urn:microsoft-dynamics-nav/reports/Print_Car_Report_WORD/60101/' " w:xpath="/ns0:NavWordReportXmlPart[1]/ns0:Car[1]/ns0:Price_per_Day[1]" w:storeItemID="{1FFF4AFC-9B63-44ED-B52F-9953A9DF8B61}"/>
-          </w:sdtPr>
-          <w:sdtContent>
-            <w:tc>
-              <w:tcPr>
-                <w:tcW w:w="3675" w:type="dxa"/>
-              </w:tcPr>
-              <w:p>
-                <w:pPr>
-                  <w:rPr>
-                    <w:noProof/>
-                    <w:sz w:val="20"/>
-                    <w:szCs w:val="20"/>
-                  </w:rPr>
-                </w:pPr>
-                <w:r>
-                  <w:rPr>
-                    <w:noProof/>
-                    <w:sz w:val="20"/>
-                    <w:szCs w:val="20"/>
-                  </w:rPr>
-                  <w:t>Price_per_Day</w:t>
-                </w:r>
-              </w:p>
-            </w:tc>
-          </w:sdtContent>
-        </w:sdt>
-      </w:tr>
-      <w:tr>
-        <w:trPr>
-          <w:trHeight w:val="435"/>
-        </w:trPr>
-        <w:tc>
-          <w:tcPr>
-            <w:tcW w:w="1800" w:type="dxa"/>
-          </w:tcPr>
-          <w:p>
-            <w:pPr>
-              <w:rPr>
-                <w:noProof/>
-                <w:sz w:val="20"/>
-                <w:szCs w:val="20"/>
-              </w:rPr>
-            </w:pPr>
-          </w:p>
-        </w:tc>
-        <w:tc>
-          <w:tcPr>
-            <w:tcW w:w="3675" w:type="dxa"/>
-          </w:tcPr>
-          <w:p>
-            <w:pPr>
-              <w:rPr>
-                <w:noProof/>
-                <w:sz w:val="20"/>
-                <w:szCs w:val="20"/>
-              </w:rPr>
-            </w:pPr>
-          </w:p>
-        </w:tc>
-      </w:tr>
-      <w:tr>
-        <w:trPr>
-          <w:trHeight w:val="525"/>
-        </w:trPr>
-        <w:tc>
-          <w:tcPr>
-            <w:tcW w:w="1800" w:type="dxa"/>
-          </w:tcPr>
-          <w:p>
-            <w:pPr>
-              <w:rPr>
-                <w:noProof/>
-                <w:sz w:val="20"/>
-                <w:szCs w:val="20"/>
-              </w:rPr>
-            </w:pPr>
-          </w:p>
-        </w:tc>
-        <w:tc>
-          <w:tcPr>
-            <w:tcW w:w="3675" w:type="dxa"/>
-          </w:tcPr>
-          <w:p>
-            <w:pPr>
-              <w:rPr>
-                <w:noProof/>
-                <w:sz w:val="20"/>
-                <w:szCs w:val="20"/>
-              </w:rPr>
-            </w:pPr>
-          </w:p>
-        </w:tc>
-      </w:tr>
-      <w:tr>
-        <w:trPr>
-          <w:trHeight w:val="405"/>
-        </w:trPr>
-        <w:tc>
-          <w:tcPr>
-            <w:tcW w:w="1800" w:type="dxa"/>
-          </w:tcPr>
-          <w:p>
-            <w:pPr>
-              <w:rPr>
-                <w:noProof/>
-                <w:sz w:val="20"/>
-                <w:szCs w:val="20"/>
-              </w:rPr>
-            </w:pPr>
-          </w:p>
-        </w:tc>
-        <w:tc>
-          <w:tcPr>
-            <w:tcW w:w="3675" w:type="dxa"/>
-          </w:tcPr>
-          <w:p>
-            <w:pPr>
-              <w:rPr>
-                <w:noProof/>
-                <w:sz w:val="20"/>
-                <w:szCs w:val="20"/>
-              </w:rPr>
-            </w:pPr>
-          </w:p>
-        </w:tc>
-      </w:tr>
-    </w:tbl>
-    <w:p>
-      <w:pPr>
-        <w:rPr>
-          <w:noProof/>
-          <w:sz w:val="20"/>
-          <w:szCs w:val="20"/>
-        </w:rPr>
-      </w:pPr>
-      <w:r>
-        <w:rPr>
-          <w:noProof/>
-          <w:sz w:val="20"/>
-          <w:szCs w:val="20"/>
-        </w:rPr>
-        <w:t xml:space="preserve">   </w:t>
-      </w:r>
-    </w:p>
-    <w:p>
-      <w:pPr>
-        <w:rPr>
-          <w:b/>
-          <w:bCs/>
-          <w:noProof/>
-          <w:sz w:val="20"/>
-          <w:szCs w:val="20"/>
-        </w:rPr>
-      </w:pPr>
-      <w:r>
-        <w:rPr>
-          <w:b/>
-          <w:bCs/>
-          <w:noProof/>
-          <w:sz w:val="20"/>
-          <w:szCs w:val="20"/>
-        </w:rPr>
-        <w:t xml:space="preserve">REMARK/OTHER INFORMATION                                                                                                                       </w:t>
-      </w:r>
-    </w:p>
-    <w:tbl>
-      <w:tblPr>
-        <w:tblpPr w:leftFromText="180" w:rightFromText="180" w:vertAnchor="text" w:tblpX="61" w:tblpY="121"/>
-        <w:tblW w:w="0" w:type="auto"/>
-        <w:tblBorders>
-          <w:top w:val="single" w:color="auto" w:sz="4" w:space="0"/>
-          <w:left w:val="single" w:color="auto" w:sz="4" w:space="0"/>
-          <w:bottom w:val="single" w:color="auto" w:sz="4" w:space="0"/>
-          <w:right w:val="single" w:color="auto" w:sz="4" w:space="0"/>
-          <w:insideH w:val="single" w:color="auto" w:sz="4" w:space="0"/>
-          <w:insideV w:val="single" w:color="auto" w:sz="4" w:space="0"/>
-        </w:tblBorders>
-        <w:tblLook w:val="0000" w:firstRow="0" w:lastRow="0" w:firstColumn="0" w:lastColumn="0" w:noHBand="0" w:noVBand="0"/>
-      </w:tblPr>
-      <w:tblGrid>
-        <w:gridCol w:w="3772"/>
-        <w:gridCol w:w="1647"/>
-      </w:tblGrid>
-      <w:tr>
-        <w:trPr>
-          <w:trHeight w:val="3749"/>
-        </w:trPr>
-        <w:tc>
-          <w:tcPr>
-            <w:tcW w:w="3772" w:type="dxa"/>
-          </w:tcPr>
-          <w:p>
-            <w:pPr>
-              <w:rPr>
-                <w:noProof/>
-                <w:sz w:val="20"/>
-                <w:szCs w:val="20"/>
-              </w:rPr>
-            </w:pPr>
-          </w:p>
-          <w:p>
-            <w:pPr>
-              <w:rPr>
-                <w:noProof/>
-                <w:sz w:val="20"/>
-                <w:szCs w:val="20"/>
-              </w:rPr>
-            </w:pPr>
-            <w:r>
-              <w:rPr>
-                <w:noProof/>
-                <w:sz w:val="20"/>
-                <w:szCs w:val="20"/>
-              </w:rPr>
-              <w:t xml:space="preserve">       </w:t>
-            </w:r>
-            <w:r>
-              <w:rPr>
-                <w:noProof/>
-                <w:sz w:val="20"/>
-                <w:szCs w:val="20"/>
+                <w:rFonts w:ascii="Arial Nova" w:hAnsi="Arial Nova"/>
+                <w:noProof/>
+                <w:sz w:val="22"/>
+                <w:szCs w:val="22"/>
               </w:rPr>
               <w:drawing>
-                <wp:inline distT="0" distB="0" distL="0" distR="0" wp14:anchorId="4F802510" wp14:editId="7875881C">
-                  <wp:extent cx="1842032" cy="1123950"/>
+                <wp:inline distT="0" distB="0" distL="0" distR="0" wp14:anchorId="3C0A0F3A" wp14:editId="68E67B73">
+                  <wp:extent cx="3155950" cy="1714500"/>
                   <wp:effectExtent l="0" t="0" r="6350" b="0"/>
-                  <wp:docPr id="310135317" name="Picture 1" descr="A car with four wheels&#10;&#10;Description automatically generated with medium confidence"/>
+                  <wp:docPr id="2064918278" name="Picture 1"/>
                   <wp:cNvGraphicFramePr>
                     <a:graphicFrameLocks xmlns:a="http://schemas.openxmlformats.org/drawingml/2006/main" noChangeAspect="1"/>
                   </wp:cNvGraphicFramePr>
@@ -1753,11 +2695,11 @@
                     <a:graphicData uri="http://schemas.openxmlformats.org/drawingml/2006/picture">
                       <pic:pic xmlns:pic="http://schemas.openxmlformats.org/drawingml/2006/picture">
                         <pic:nvPicPr>
-                          <pic:cNvPr id="310135317" name="Picture 1" descr="A car with four wheels&#10;&#10;Description automatically generated with medium confidence"/>
+                          <pic:cNvPr id="2064918278" name=""/>
                           <pic:cNvPicPr/>
                         </pic:nvPicPr>
                         <pic:blipFill>
-                          <a:blip r:embed="rId7"/>
+                          <a:blip r:embed="rId8"/>
                           <a:stretch>
                             <a:fillRect/>
                           </a:stretch>
@@ -1765,7 +2707,7 @@
                         <pic:spPr>
                           <a:xfrm>
                             <a:off x="0" y="0"/>
-                            <a:ext cx="1855531" cy="1132187"/>
+                            <a:ext cx="3160626" cy="1717040"/>
                           </a:xfrm>
                           <a:prstGeom prst="rect">
                             <a:avLst/>
@@ -1781,25 +2723,121 @@
           <w:p>
             <w:pPr>
               <w:rPr>
-                <w:noProof/>
-                <w:sz w:val="20"/>
-                <w:szCs w:val="20"/>
+                <w:rFonts w:ascii="Arial Nova" w:hAnsi="Arial Nova"/>
+                <w:noProof/>
+                <w:sz w:val="22"/>
+                <w:szCs w:val="22"/>
+              </w:rPr>
+            </w:pPr>
+          </w:p>
+          <w:p>
+            <w:pPr>
+              <w:rPr>
+                <w:rFonts w:ascii="Arial Nova" w:hAnsi="Arial Nova"/>
+                <w:noProof/>
+                <w:sz w:val="22"/>
+                <w:szCs w:val="22"/>
+              </w:rPr>
+            </w:pPr>
+            <w:r>
+              <w:rPr>
+                <w:rFonts w:ascii="Arial Nova" w:hAnsi="Arial Nova"/>
+                <w:noProof/>
+                <w:sz w:val="22"/>
+                <w:szCs w:val="22"/>
+              </w:rPr>
+              <w:t>Assessment Staff:</w:t>
+            </w:r>
+          </w:p>
+          <w:p>
+            <w:pPr>
+              <w:jc w:val="center"/>
+              <w:rPr>
+                <w:rFonts w:ascii="Arial Nova" w:hAnsi="Arial Nova"/>
+                <w:sz w:val="22"/>
+                <w:szCs w:val="22"/>
               </w:rPr>
             </w:pPr>
           </w:p>
         </w:tc>
         <w:tc>
           <w:tcPr>
-            <w:tcW w:w="1647" w:type="dxa"/>
+            <w:tcW w:w="5703" w:type="dxa"/>
           </w:tcPr>
           <w:p>
             <w:pPr>
               <w:rPr>
-                <w:noProof/>
-                <w:sz w:val="20"/>
-                <w:szCs w:val="20"/>
+                <w:rFonts w:ascii="Arial Nova" w:hAnsi="Arial Nova"/>
+                <w:noProof/>
+                <w:sz w:val="22"/>
+                <w:szCs w:val="22"/>
               </w:rPr>
             </w:pPr>
+            <w:r>
+              <w:rPr>
+                <w:rFonts w:ascii="Arial Nova" w:hAnsi="Arial Nova"/>
+                <w:noProof/>
+                <w:sz w:val="22"/>
+                <w:szCs w:val="22"/>
+              </w:rPr>
+              <w:t>Assessment remarks:</w:t>
+            </w:r>
+          </w:p>
+          <w:p>
+            <w:pPr>
+              <w:rPr>
+                <w:rFonts w:ascii="Arial Nova" w:hAnsi="Arial Nova"/>
+                <w:noProof/>
+                <w:sz w:val="22"/>
+                <w:szCs w:val="22"/>
+              </w:rPr>
+            </w:pPr>
+            <w:r>
+              <w:rPr>
+                <w:rFonts w:ascii="Arial Nova" w:hAnsi="Arial Nova"/>
+                <w:noProof/>
+                <w:sz w:val="22"/>
+                <w:szCs w:val="22"/>
+              </w:rPr>
+              <w:drawing>
+                <wp:inline distT="0" distB="0" distL="0" distR="0" wp14:anchorId="51806CE2" wp14:editId="7107C2D6">
+                  <wp:extent cx="3457575" cy="1917727"/>
+                  <wp:effectExtent l="0" t="0" r="0" b="0"/>
+                  <wp:docPr id="1961645606" name="Picture 1"/>
+                  <wp:cNvGraphicFramePr>
+                    <a:graphicFrameLocks xmlns:a="http://schemas.openxmlformats.org/drawingml/2006/main" noChangeAspect="1"/>
+                  </wp:cNvGraphicFramePr>
+                  <a:graphic xmlns:a="http://schemas.openxmlformats.org/drawingml/2006/main">
+                    <a:graphicData uri="http://schemas.openxmlformats.org/drawingml/2006/picture">
+                      <pic:pic xmlns:pic="http://schemas.openxmlformats.org/drawingml/2006/picture">
+                        <pic:nvPicPr>
+                          <pic:cNvPr id="1961645606" name=""/>
+                          <pic:cNvPicPr/>
+                        </pic:nvPicPr>
+                        <pic:blipFill>
+                          <a:blip r:embed="rId9"/>
+                          <a:stretch>
+                            <a:fillRect/>
+                          </a:stretch>
+                        </pic:blipFill>
+                        <pic:spPr>
+                          <a:xfrm>
+                            <a:off x="0" y="0"/>
+                            <a:ext cx="3597960" cy="1995591"/>
+                          </a:xfrm>
+                          <a:prstGeom prst="rect">
+                            <a:avLst/>
+                          </a:prstGeom>
+                          <a:effectLst>
+                            <a:softEdge rad="965200"/>
+                          </a:effectLst>
+                        </pic:spPr>
+                      </pic:pic>
+                    </a:graphicData>
+                  </a:graphic>
+                </wp:inline>
+              </w:drawing>
+            </w:r>
           </w:p>
         </w:tc>
       </w:tr>
@@ -1807,70 +2845,101 @@
     <w:p>
       <w:pPr>
         <w:rPr>
+          <w:rFonts w:ascii="Arial Nova" w:hAnsi="Arial Nova"/>
+          <w:i/>
+          <w:iCs/>
           <w:noProof/>
-          <w:sz w:val="20"/>
-          <w:szCs w:val="20"/>
+          <w:sz w:val="16"/>
+          <w:szCs w:val="16"/>
         </w:rPr>
       </w:pPr>
       <w:r>
         <w:rPr>
+          <w:rFonts w:ascii="Arial Nova" w:hAnsi="Arial Nova"/>
+          <w:i/>
+          <w:iCs/>
           <w:noProof/>
-          <w:sz w:val="20"/>
-          <w:szCs w:val="20"/>
+          <w:sz w:val="16"/>
+          <w:szCs w:val="16"/>
         </w:rPr>
-        <w:t xml:space="preserve">                                                             </w:t>
+        <w:t>B-BENT/BR-BROKEN/C-CUT/CR-CRACKED/D-DENTED/</w:t>
+      </w:r>
+      <w:r>
+        <w:rPr>
+          <w:rFonts w:ascii="Arial Nova" w:hAnsi="Arial Nova"/>
+          <w:i/>
+          <w:iCs/>
+          <w:noProof/>
+          <w:sz w:val="16"/>
+          <w:szCs w:val="16"/>
+        </w:rPr>
+        <w:t>L-LOOSE/M-MISSING/-P-PITTED/RU-RUST/ST-STAINED</w:t>
       </w:r>
     </w:p>
     <w:p>
       <w:pPr>
         <w:rPr>
-          <w:noProof/>
-          <w:sz w:val="20"/>
-          <w:szCs w:val="20"/>
+          <w:rFonts w:ascii="Arial Nova" w:hAnsi="Arial Nova"/>
+          <w:b/>
+          <w:bCs/>
+          <w:sz w:val="22"/>
+          <w:szCs w:val="22"/>
         </w:rPr>
       </w:pPr>
+      <w:r>
+        <w:rPr>
+          <w:rFonts w:ascii="Arial Nova" w:hAnsi="Arial Nova"/>
+          <w:b/>
+          <w:bCs/>
+          <w:noProof/>
+          <w:sz w:val="22"/>
+          <w:szCs w:val="22"/>
+        </w:rPr>
+        <w:t>CUSTOMER SIGNATURE:</w:t>
+      </w:r>
+      <w:r>
+        <w:rPr>
+          <w:rFonts w:ascii="Arial Nova" w:hAnsi="Arial Nova"/>
+          <w:b/>
+          <w:bCs/>
+          <w:noProof/>
+          <w:sz w:val="22"/>
+          <w:szCs w:val="22"/>
+        </w:rPr>
+        <w:t xml:space="preserve"> </w:t>
+      </w:r>
     </w:p>
     <w:p>
       <w:pPr>
         <w:rPr>
-          <w:noProof/>
-          <w:sz w:val="20"/>
-          <w:szCs w:val="20"/>
+          <w:rFonts w:ascii="Arial Nova" w:hAnsi="Arial Nova"/>
+          <w:sz w:val="22"/>
+          <w:szCs w:val="22"/>
         </w:rPr>
       </w:pPr>
-    </w:p>
-    <w:p>
-      <w:pPr>
-        <w:rPr>
-          <w:noProof/>
-          <w:sz w:val="20"/>
-          <w:szCs w:val="20"/>
-        </w:rPr>
-      </w:pPr>
-    </w:p>
-    <w:p>
-      <w:pPr>
-        <w:rPr>
-          <w:noProof/>
-          <w:sz w:val="20"/>
-          <w:szCs w:val="20"/>
-        </w:rPr>
-      </w:pPr>
-    </w:p>
-    <w:p>
       <w:r>
         <w:rPr>
-          <w:noProof/>
-          <w:sz w:val="20"/>
-          <w:szCs w:val="20"/>
+          <w:rFonts w:ascii="Arial Nova" w:hAnsi="Arial Nova"/>
+          <w:b/>
+          <w:bCs/>
+          <w:sz w:val="22"/>
+          <w:szCs w:val="22"/>
         </w:rPr>
-        <w:t xml:space="preserve">                                                                                                                                             </w:t>
+        <w:t>DATE:</w:t>
+      </w:r>
+      <w:r>
+        <w:rPr>
+          <w:rFonts w:ascii="Arial Nova" w:hAnsi="Arial Nova"/>
+          <w:sz w:val="22"/>
+          <w:szCs w:val="22"/>
+        </w:rPr>
+        <w:t xml:space="preserve">                                                                       </w:t>
       </w:r>
     </w:p>
     <w:p/>
     <w:sectPr>
       <w:pgSz w:w="11906" w:h="16838"/>
-      <w:pgMar w:top="142" w:right="140" w:bottom="720" w:left="720" w:header="1020" w:footer="708" w:gutter="0"/>
+      <w:pgMar w:top="142" w:right="140" w:bottom="720" w:left="567" w:header="1020" w:footer="708" w:gutter="0"/>
       <w:cols w:space="708"/>
       <w:docGrid w:linePitch="360"/>
     </w:sectPr>
@@ -2316,6 +3385,25 @@
       <w:color w:val="666666"/>
     </w:rPr>
   </w:style>
+  <w:style w:type="table" w:styleId="TableGrid">
+    <w:name w:val="Table Grid"/>
+    <w:basedOn w:val="TableNormal"/>
+    <w:uiPriority w:val="39"/>
+    <w:rsid w:val="008238F1"/>
+    <w:pPr>
+      <w:spacing w:after="0" w:line="240" w:lineRule="auto"/>
+    </w:pPr>
+    <w:tblPr>
+      <w:tblBorders>
+        <w:top w:val="single" w:sz="4" w:space="0" w:color="auto"/>
+        <w:left w:val="single" w:sz="4" w:space="0" w:color="auto"/>
+        <w:bottom w:val="single" w:sz="4" w:space="0" w:color="auto"/>
+        <w:right w:val="single" w:sz="4" w:space="0" w:color="auto"/>
+        <w:insideH w:val="single" w:sz="4" w:space="0" w:color="auto"/>
+        <w:insideV w:val="single" w:sz="4" w:space="0" w:color="auto"/>
+      </w:tblBorders>
+    </w:tblPr>
+  </w:style>
 </w:styles>
 </file>
 
@@ -2367,6 +3455,12 @@
     <w:pitch w:val="variable"/>
     <w:sig w:usb0="E0002EFF" w:usb1="C000785B" w:usb2="00000009" w:usb3="00000000" w:csb0="000001FF" w:csb1="00000000"/>
   </w:font>
+  <w:font w:name="Arial Nova">
+    <w:charset w:val="00"/>
+    <w:family w:val="swiss"/>
+    <w:pitch w:val="variable"/>
+    <w:sig w:usb0="0000028F" w:usb1="00000002" w:usb2="00000000" w:usb3="00000000" w:csb0="0000019F" w:csb1="00000000"/>
+  </w:font>
   <w:font w:name="Aptos Display">
     <w:charset w:val="00"/>
     <w:family w:val="swiss"/>
@@ -2392,17 +3486,25 @@
   </w:compat>
   <w:rsids>
     <w:rsidRoot w:val="009D37A8"/>
+    <w:rsid w:val="0001468E"/>
+    <w:rsid w:val="001B179D"/>
     <w:rsid w:val="002B5084"/>
     <w:rsid w:val="002F2CBD"/>
     <w:rsid w:val="003E21B2"/>
     <w:rsid w:val="00406E63"/>
     <w:rsid w:val="004B3083"/>
     <w:rsid w:val="004C6352"/>
+    <w:rsid w:val="0056725E"/>
     <w:rsid w:val="007C0345"/>
     <w:rsid w:val="009D37A8"/>
+    <w:rsid w:val="00A102DE"/>
     <w:rsid w:val="00A31663"/>
     <w:rsid w:val="00BA244D"/>
+    <w:rsid w:val="00C3530D"/>
+    <w:rsid w:val="00C81C57"/>
     <w:rsid w:val="00D07FE9"/>
+    <w:rsid w:val="00E716B7"/>
+    <w:rsid w:val="00FD2307"/>
   </w:rsids>
   <m:mathPr>
     <m:mathFont m:val="Cambria Math"/>
@@ -3168,9 +4270,7 @@
 </a:theme>
 </file>
 
-<file path=customXml/item1.xml>��< ? x m l   v e r s i o n = " 1 . 0 "   e n c o d i n g = " u t f - 1 6 " ? > - 
- < N a v W o r d R e p o r t X m l P a r t   x m l n s = " u r n : m i c r o s o f t - d y n a m i c s - n a v / r e p o r t s / P r i n t _ C a r _ R e p o r t / 6 0 1 0 3 / " > +<file path=customXml/item1.xml>��< ? x m l   v e r s i o n = " 1 . 0 "   e n c o d i n g = " u t f - 1 6 " ? > < N a v W o r d R e p o r t X m l P a r t   x m l n s = " u r n : m i c r o s o f t - d y n a m i c s - n a v / r e p o r t s / P r i n t _ C a r _ R e p o r t / 6 0 1 0 3 / " >   
      < C a r >   
@@ -3181,6 +4281,8 @@
          < C a r R e n t e r D r i v i n g L i c e n s e > C a r R e n t e r D r i v i n g L i c e n s e < / C a r R e n t e r D r i v i n g L i c e n s e >   
          < C o l o u r > C o l o u r < / C o l o u r > + 
+         < C u r r e n c y > C u r r e n c y < / C u r r e n c y >   
          < D r i v e T y p e > D r i v e T y p e < / D r i v e T y p e >   
@@ -3242,7 +4344,23 @@
  
      < / D r i v e r >   
+     < C a r _ M i l e a g e > + 
+         < E n d _ M i l e a g e > E n d _ M i l e a g e < / E n d _ M i l e a g e > + 
+     < / C a r _ M i l e a g e > + 
+     < R e n t a l _ H i s t o r y > + 
+         < R e n t e d _ D a t e > R e n t e d _ D a t e < / R e n t e d _ D a t e > + 
+     < / R e n t a l _ H i s t o r y > + 
  < / N a v W o r d R e p o r t X m l P a r t > 
+</file>
+
+<file path=customXml/item2.xml><?xml version="1.0" encoding="utf-8"?>
+<b:Sources xmlns:b="http://schemas.openxmlformats.org/officeDocument/2006/bibliography" xmlns="http://schemas.openxmlformats.org/officeDocument/2006/bibliography" SelectedStyle="\APASixthEditionOfficeOnline.xsl" StyleName="APA" Version="6"/>
 </file>
 
 <file path=customXml/itemProps1.xml><?xml version="1.0" encoding="utf-8"?>
@@ -3251,4 +4369,12 @@
     <ds:schemaRef ds:uri="urn:microsoft-dynamics-nav/reports/Print_Car_Report/60103/"/>
   </ds:schemaRefs>
 </ds:datastoreItem>
+</file>
+
+<file path=customXml/itemProps2.xml><?xml version="1.0" encoding="utf-8"?>
+<ds:datastoreItem xmlns:ds="http://schemas.openxmlformats.org/officeDocument/2006/customXml" ds:itemID="{6FAAFA5D-1DF9-49F5-A21D-80FB5F663BB4}">
+  <ds:schemaRefs>
+    <ds:schemaRef ds:uri="http://schemas.openxmlformats.org/officeDocument/2006/bibliography"/>
+  </ds:schemaRefs>
+</ds:datastoreItem>
 </file>
</xml_diff>